<commit_message>
paper 02: standard-error chain rebuilt (weights, not clustering), four pipelines, plan deviations, EN+FA rebuilt
Co-Authored-By: Claude Sonnet 5.5 <noreply@anthropic.com>
</commit_message>
<xml_diff>
--- a/papers/02-nhts-ladder/manuscript/final/Paper02_NHTS_design_aware_ladder_EN.docx
+++ b/papers/02-nhts-ladder/manuscript/final/Paper02_NHTS_design_aware_ladder_EN.docx
@@ -32,7 +32,7 @@
         <w:pStyle w:val="FirstParagraph"/>
       </w:pPr>
       <w:r>
-        <w:t xml:space="preserve">Transport planners use regression coefficients and prediction scores from national travel surveys to judge how much ride-hailing, public transport or electric vehicles change travel. These numbers depend on choices that papers rarely state in full: which records were kept, whether the survey weights were used, how the uncertainty was computed, and how a prediction model was tested. We propose a reproducibility ladder with four rungs (rebuild the sample, rebuild the descriptive tables, refit the published model, refit it under the survey’s own sampling design) and apply it to 22 published studies of the United States National Household Travel Survey (NHTS); the public files allowed the models of 13 studies to be refitted. The samples of 9 studies were rebuilt well, and 81 per cent of 1,454 printed descriptive values were matched. Studies that had used the survey weights were reproduced only with weights: in one study weighted odds ratios matched 57 per cent of the printed values and unweighted ones 8 per cent. When the replicate weights shipped with the survey were used, standard errors were a median of 2.2 times larger than the unweighted ones; 32 per cent of the coefficients that were significant at the five per cent level lost their significance, and 8 per cent changed sign between the unweighted and the weighted fit. Clustering of persons within households, not the replicate formula, explained most of the difference. For classification models, oversampling the rarer class before splitting the data raised the area under the receiver operating characteristic (ROC) curve, a score of chance level at fifty per cent and perfection at one hundred per cent, of a random forest from 64 per cent to 99 per cent, and a published regression score, the share of variance explained, of 71 per cent was reproduced at 20 per cent on held-out households. The machinery is released as two modules of the open-source Python package pynhts.</w:t>
+        <w:t xml:space="preserve">Transport planners use regression coefficients and prediction scores from national travel surveys to judge how much ride-hailing, public transport or electric vehicles change travel. These numbers depend on choices that papers rarely state in full: which records were kept, whether the survey weights were used, how the uncertainty was computed, and how a prediction model was tested. We propose a reproducibility ladder with four rungs (rebuild the sample, rebuild the descriptive tables, refit the published model, refit it under the survey’s own sampling design) and apply it to 22 published studies of the United States National Household Travel Survey (NHTS); the public files allowed the models of 13 studies to be refitted. The samples of 9 studies were rebuilt well, and 81 per cent of 1,454 printed descriptive values were matched. Where the weighted and the unweighted fit reproduce different numbers, the estimator the paper declared reproduced its printed values: in one study weighted odds ratios matched 57 per cent of the printed values and unweighted ones 3 per cent. With the replicate weights shipped with the survey, standard errors were a median of 2.2 times those of an unweighted fit. This cost came almost entirely from the unequal weights (2.2 times); clustering of persons within households (1.06 times) and the replicate formula (0.99 times) added little on average, and the standard errors of an unweighted analysis were understated by only 1.10 times. Under each study’s declared inference, 24 per cent of the significant coefficients (exact interval 18 to 31 per cent) were not significant under the design, and 8 per cent of the coefficients changed sign between the unweighted and the weighted fit. For classification models, oversampling the rarer class before splitting the data raised the area under the receiver operating characteristic (ROC) curve, a score of chance level at fifty per cent and perfection at one hundred per cent, of a random forest from 63 per cent to 99 per cent; the printed value was reproduced by neither pipeline. A published regression score, the share of variance explained, of 71 per cent was not reproduced (20 per cent on held-out households). The machinery is released as two modules of the open-source Python package pynhts.</w:t>
       </w:r>
     </w:p>
     <w:p>
@@ -68,7 +68,7 @@
         <w:pStyle w:val="FirstParagraph"/>
       </w:pPr>
       <w:r>
-        <w:t xml:space="preserve">The US National Household Travel Survey (NHTS) is the main public source on how Americans travel. Its waves of 2001, 2009, 2017 and 2022 hold between about seventy thousand and one hundred and fifty thousand households each, with every member’s trips on one assigned day, the vehicles, and a long list of household and person attributes. Researchers use the files to estimate who rides, who pays and who emits, and the resulting regression coefficients, odds ratios and prediction scores are read by planners as evidence on ride-hailing, bike-sharing, transit, electric vehicles and vehicle miles travelled</w:t>
+        <w:t xml:space="preserve">The US National Household Travel Survey (NHTS) is the main public source on how Americans travel. Its waves of 2001, 2009, 2017 and 2022 hold between about eight thousand (2022) and one hundred and fifty thousand households each, with every member’s trips on one assigned day, the vehicles, and a long list of household and person attributes. Researchers use the files to estimate who rides, who pays and who emits, and the resulting regression coefficients, odds ratios and prediction scores are read by planners as evidence on ride-hailing, bike-sharing, transit, electric vehicles and vehicle miles travelled</w:t>
       </w:r>
       <w:r>
         <w:t xml:space="preserve"> </w:t>
@@ -294,7 +294,7 @@
         <w:t xml:space="preserve"> </w:t>
       </w:r>
       <w:r>
-        <w:t xml:space="preserve">and were collected by the authors while building the pynhts package, so they are a convenience set and not a systematic sample of the literature; we draw no conclusion about the share of all NHTS papers that behave like them. One study is by the first author and the package developer; it is included in the register but was not re-estimated here, and its models are reserved for a separate paper. Public-use NHTS files of 2001, 2009 and 2017 were obtained from the survey’s website through pynhts, which verifies each file against its codebook. All 22 studies use the 2001, 2009 or 2017 wave.</w:t>
+        <w:t xml:space="preserve">and were collected by the authors while building the pynhts package, so they are a convenience set and not a systematic sample of the literature; we draw no conclusion about the share of all NHTS papers that behave like them. One study is by the author, who is also the package developer; it is included in the register but was not re-estimated here, and its models are reserved for a separate paper. Public-use NHTS files of 2001, 2009 and 2017 were obtained from the survey’s website through pynhts, which verifies each file against its codebook. All 22 studies use the 2001, 2009 or 2017 wave.</w:t>
       </w:r>
     </w:p>
     <w:tbl>
@@ -332,13 +332,13 @@
               <w:tblLook w:firstRow="1" w:lastRow="0" w:firstColumn="0" w:lastColumn="0" w:noHBand="0" w:noVBand="0" w:val="0020"/>
             </w:tblPr>
             <w:tblGrid>
-              <w:gridCol w:w="475"/>
-              <w:gridCol w:w="1346"/>
+              <w:gridCol w:w="633"/>
+              <w:gridCol w:w="1267"/>
               <w:gridCol w:w="950"/>
-              <w:gridCol w:w="1663"/>
-              <w:gridCol w:w="871"/>
-              <w:gridCol w:w="1346"/>
+              <w:gridCol w:w="1504"/>
+              <w:gridCol w:w="792"/>
               <w:gridCol w:w="1267"/>
+              <w:gridCol w:w="1504"/>
             </w:tblGrid>
             <w:tr>
               <w:trPr>
@@ -524,7 +524,7 @@
                     <w:jc w:val="center"/>
                   </w:pPr>
                   <w:r>
-                    <w:t xml:space="preserve">refitted</w:t>
+                    <w:t xml:space="preserve">reproduced</w:t>
                   </w:r>
                 </w:p>
               </w:tc>
@@ -617,7 +617,7 @@
                     <w:jc w:val="center"/>
                   </w:pPr>
                   <w:r>
-                    <w:t xml:space="preserve">refitted</w:t>
+                    <w:t xml:space="preserve">not reproduced</w:t>
                   </w:r>
                 </w:p>
               </w:tc>
@@ -710,7 +710,7 @@
                     <w:jc w:val="center"/>
                   </w:pPr>
                   <w:r>
-                    <w:t xml:space="preserve">refitted</w:t>
+                    <w:t xml:space="preserve">partly</w:t>
                   </w:r>
                 </w:p>
               </w:tc>
@@ -896,7 +896,7 @@
                     <w:jc w:val="center"/>
                   </w:pPr>
                   <w:r>
-                    <w:t xml:space="preserve">refitted</w:t>
+                    <w:t xml:space="preserve">not reproduced</w:t>
                   </w:r>
                 </w:p>
               </w:tc>
@@ -1268,7 +1268,7 @@
                     <w:jc w:val="center"/>
                   </w:pPr>
                   <w:r>
-                    <w:t xml:space="preserve">refitted</w:t>
+                    <w:t xml:space="preserve">partly</w:t>
                   </w:r>
                 </w:p>
               </w:tc>
@@ -1454,7 +1454,7 @@
                     <w:jc w:val="center"/>
                   </w:pPr>
                   <w:r>
-                    <w:t xml:space="preserve">refitted</w:t>
+                    <w:t xml:space="preserve">no valid target</w:t>
                   </w:r>
                 </w:p>
               </w:tc>
@@ -1547,7 +1547,7 @@
                     <w:jc w:val="center"/>
                   </w:pPr>
                   <w:r>
-                    <w:t xml:space="preserve">refitted</w:t>
+                    <w:t xml:space="preserve">partly</w:t>
                   </w:r>
                 </w:p>
               </w:tc>
@@ -1640,7 +1640,7 @@
                     <w:jc w:val="center"/>
                   </w:pPr>
                   <w:r>
-                    <w:t xml:space="preserve">refitted</w:t>
+                    <w:t xml:space="preserve">no valid target</w:t>
                   </w:r>
                 </w:p>
               </w:tc>
@@ -1826,7 +1826,7 @@
                     <w:jc w:val="center"/>
                   </w:pPr>
                   <w:r>
-                    <w:t xml:space="preserve">refitted</w:t>
+                    <w:t xml:space="preserve">not reproduced</w:t>
                   </w:r>
                 </w:p>
               </w:tc>
@@ -1919,7 +1919,7 @@
                     <w:jc w:val="center"/>
                   </w:pPr>
                   <w:r>
-                    <w:t xml:space="preserve">refitted</w:t>
+                    <w:t xml:space="preserve">reproduced</w:t>
                   </w:r>
                 </w:p>
               </w:tc>
@@ -2105,7 +2105,7 @@
                     <w:jc w:val="center"/>
                   </w:pPr>
                   <w:r>
-                    <w:t xml:space="preserve">refitted</w:t>
+                    <w:t xml:space="preserve">partly</w:t>
                   </w:r>
                 </w:p>
               </w:tc>
@@ -2198,7 +2198,7 @@
                     <w:jc w:val="center"/>
                   </w:pPr>
                   <w:r>
-                    <w:t xml:space="preserve">refitted</w:t>
+                    <w:t xml:space="preserve">not reproduced</w:t>
                   </w:r>
                 </w:p>
               </w:tc>
@@ -2291,7 +2291,7 @@
                     <w:jc w:val="center"/>
                   </w:pPr>
                   <w:r>
-                    <w:t xml:space="preserve">refitted</w:t>
+                    <w:t xml:space="preserve">not reproduced</w:t>
                   </w:r>
                 </w:p>
               </w:tc>
@@ -2566,7 +2566,7 @@
         <w:t xml:space="preserve">L3</w:t>
       </w:r>
       <w:r>
-        <w:t xml:space="preserve">: refit the model under the survey design. No rule was altered to reach a printed number: a difference is recorded as a gap, and the most natural reading of an unwritten rule is documented with the evidence that supported it. Rungs L0 and L1 were completed before this paper’s models were run, and their grading is reproduced from the audit files of the package repository.</w:t>
+        <w:t xml:space="preserve">: refit the model under the survey design. No rule was altered to reach a printed number: a difference is recorded as a gap, and the most natural reading of an unwritten rule is documented with the evidence that supported it. Rungs L0 and L1 were completed before this paper’s models were run, and their grading is reproduced from the audit files of the package repository. The analysis plan was frozen after three studies (Yang, Quinn, Jiao) had been run during the development of the engine, and these hold about half of the coefficients and all three headline examples; deviations from the plan, including a reformulated fourth hypothesis, are logged in it and summarised in the supplement.</w:t>
       </w:r>
     </w:p>
     <w:tbl>
@@ -2649,13 +2649,13 @@
       </w:tr>
     </w:tbl>
     <w:bookmarkEnd w:id="17"/>
-    <w:bookmarkStart w:id="18" w:name="three-ways-to-fit-the-same-model"/>
+    <w:bookmarkStart w:id="18" w:name="four-ways-to-fit-the-same-model"/>
     <w:p>
       <w:pPr>
         <w:pStyle w:val="Heading3"/>
       </w:pPr>
       <w:r>
-        <w:t xml:space="preserve">Three ways to fit the same model</w:t>
+        <w:t xml:space="preserve">Four ways to fit the same model</w:t>
       </w:r>
     </w:p>
     <w:p>
@@ -2663,7 +2663,7 @@
         <w:pStyle w:val="FirstParagraph"/>
       </w:pPr>
       <w:r>
-        <w:t xml:space="preserve">Each regression was fitted three ways. The unweighted fit uses maximum likelihood with model-based standard errors, which is what most of the studies report. The weighted fit uses the person, household or person-day weight of the observation (scaled to the sample size for estimation) with a sandwich variance in which observations of the same household form one cluster. The design-aware fit uses the same weighted estimate with the variance design of the wave. For the waves with replicate weights this is the jackknife: the model is refitted with each of the</w:t>
+        <w:t xml:space="preserve">Each regression was fitted four ways. The unweighted fit uses maximum likelihood with model-based standard errors, which is what most of the studies report. The clustered fit keeps the unweighted estimate and forms the variance with a sandwich in which observations of the same household form one cluster. The weighted fit uses the person, household or person-day weight of the observation (scaled to the sample size for estimation) with the same household-clustered sandwich; the same fit with every observation its own cluster measures what the unequal weights alone cost. The design-aware fit uses the same weighted estimate with the variance design of the wave. The fits answer different questions: the unweighted estimate describes the association among respondents and the weighted one the association in the population the weights represent, so a comparison of their standard errors mixes a change of estimand with a change of precision; we therefore report the standard errors as a chain of ratios (weights, clustering, replicate formula) and not only their product. For the waves with replicate weights this is the jackknife: the model is refitted with each of the</w:t>
       </w:r>
       <w:r>
         <w:t xml:space="preserve"> </w:t>
@@ -3033,7 +3033,7 @@
         <w:t xml:space="preserve">(Lambert, 1992; Zeileis et al., 2008)</w:t>
       </w:r>
       <w:r>
-        <w:t xml:space="preserve">. As an independent check, the logistic, Poisson and linear fits on adults of the 2017 person file were compared with the survey package in R (a replicate-weight design with the same factor): coefficients agreed to one part in one hundred thousand and standard errors to 0.2 per cent. The regime in which a study’s printed numbers were reproduced is reported as its declared estimator.</w:t>
+        <w:t xml:space="preserve">. As independent checks, the logistic, Poisson and linear fits on adults of the 2017 person file were compared with the survey package in R (a replicate-weight design with the same factor): coefficients agreed to one part in one hundred thousand and standard errors to 0.2 per cent; the Taylor-series variance of the 2022 wave was checked against the same package in the same way. On the weekend negative binomial model of one study, 98 exact refits gave standard errors within 0.2 per cent of the Newton ones. The regime in which a study’s printed numbers were reproduced is reported as its declared estimator.</w:t>
       </w:r>
     </w:p>
     <w:bookmarkEnd w:id="18"/>
@@ -3962,7 +3962,7 @@
         <w:pStyle w:val="FirstParagraph"/>
       </w:pPr>
       <w:r>
-        <w:t xml:space="preserve">Studies that declared weights were reproduced with weights, and those that did not, without. In the study of walking and cycling by Quinn and colleagues, which states that population weights and the jackknife were used, the weighted odds ratios matched 34 of 60 printed values and the unweighted ones 5; for the two commuting models, 29 of 30 matched to the printed precision or within two per cent. In the study of physical activity by season, the weighted odds ratios matched 21 of 21 printed values and the unweighted ones 6. In the other direction, the negative binomial study of shared mobility and trips, which reports an unweighted fit in R, was reproduced by the unweighted fit: 21 of 32 coefficients matched at the printed precision. The zero-inflated negative binomial study of vehicle ownership and ridesharing was reproduced by the unweighted fit within two per cent for 17 of 32 coefficients and within five per cent for 26. The elasticity of annual miles with respect to fuel cost per mile in the study of vehicle miles was −0.515 against the printed −0.510. These results support the first hypothesis: the printed numbers are recoverable from the public files when the declared estimator is used, and not otherwise.</w:t>
+        <w:t xml:space="preserve">Among the studies in which the unweighted and the weighted fit reproduce clearly different numbers of printed values, the declared estimator reproduced more. The study of walking and cycling by Quinn and colleagues states that population weights and the jackknife were used: the weighted odds ratios matched 34 of 60 printed values and the unweighted ones 2; for the two commuting models, 29 of 30 matched to the printed precision or within two per cent, but for the two transport models few did, which we attribute to the sample (we could not rebuild the printed one). In the study of physical activity by season the weighted odds ratios matched 21 of 21 printed values and the unweighted ones 6. In the other direction, the negative binomial study of shared mobility and trips, which reports an unweighted fit in R, was reproduced by the unweighted fit (30 of 32 coefficients within two per cent, 20 at the printed precision), and the zero-inflated study of vehicle ownership and ridesharing for 15 of 32 coefficients within two per cent and 25 within five per cent. In the other studies neither fit reproduced much: the elasticity of annual miles with respect to fuel cost per mile matched for one of 4 printed values (−0.515 against −0.510). The first hypothesis is therefore supported for the four studies in which the two estimators can be told apart, and not tested for the others; we do not generalise it to all studies.</w:t>
       </w:r>
     </w:p>
     <w:p>
@@ -3981,7 +3981,7 @@
         </w:r>
       </w:hyperlink>
       <w:r>
-        <w:t xml:space="preserve">, reference letter H). The same is true for the Midwest effect on active travel in 2001, with printed 0.67, weighted 0.67 and unweighted 0.83. Weights are informative about the outcome in these data, because response and selection vary with age, education and region, and an unweighted fit estimates the association in the sample, not in the population.</w:t>
+        <w:t xml:space="preserve">, reference letter H). The same happens for the Midwest effect on active travel in 2001, with printed 0.67, weighted 0.67 and unweighted 0.83. An unweighted fit estimates the association among respondents, and these results show that respondents differ from the population in ways that matter for this association; we did not test formally whether the weights are informative.</w:t>
       </w:r>
     </w:p>
     <w:tbl>
@@ -4078,7 +4078,10 @@
         <w:pStyle w:val="FirstParagraph"/>
       </w:pPr>
       <w:r>
-        <w:t xml:space="preserve">Across the 310 re-estimated coefficients of eight regression studies, the design-aware standard error was larger than the unweighted one by a median factor of 2.19 (interquartile range 1.86 to 2.66); for 95 per cent of the coefficients the factor exceeded one and a half (</w:t>
+        <w:t xml:space="preserve">Across the 310 re-estimated coefficients of eight regression studies, the design-aware standard error was a median of 2.19 times the unweighted one (interquartile range 1.86 to 2.66).</w:t>
+      </w:r>
+      <w:r>
+        <w:t xml:space="preserve"> </w:t>
       </w:r>
       <w:hyperlink w:anchor="fig-se">
         <w:r>
@@ -4089,7 +4092,18 @@
         </w:r>
       </w:hyperlink>
       <w:r>
-        <w:t xml:space="preserve">, panel A). Of the 244 coefficients that were significant at the five per cent level in the unweighted fit, 78 (32 per cent) were not under the design-aware fit, while 11 coefficients became significant; 26 coefficients (8.4 per cent) changed sign between the two fits. The shares differ by study (</w:t>
+        <w:t xml:space="preserve"> </w:t>
+      </w:r>
+      <w:r>
+        <w:t xml:space="preserve">(panel A) shows where this comes from. Weighting alone, with every observation its own cluster, raised the standard error by a median factor of 2.17; clustering persons within households added 1.06 on top of that, and the replicate-weight formula a further 0.99 (fifth to ninety-fifth percentile 0.70 to 1.44). An unweighted fit whose standard errors were clustered on households differed from its model-based standard errors by a median factor of only 1.10. The unweighted analyses were therefore not wrong about the precision of what they estimate, an association among respondents; the large standard errors are the price of estimating the population association with unequal weights.</w:t>
+      </w:r>
+    </w:p>
+    <w:p>
+      <w:pPr>
+        <w:pStyle w:val="BodyText"/>
+      </w:pPr>
+      <w:r>
+        <w:t xml:space="preserve">Under each study’s declared inference (unweighted for six studies, weighted with household-clustered errors for one; the study that itself used the jackknife is excluded), 42 of 174 coefficients that were significant at the five per cent level were not significant under the design-aware fit, 24 per cent with an exact ninety-five per cent interval of 18 to 31 per cent; pooled against the unweighted fit for all studies, the figures are 78 of 244. The share differs by study (</w:t>
       </w:r>
       <w:hyperlink w:anchor="fig-se">
         <w:r>
@@ -4114,7 +4128,7 @@
         </w:r>
       </w:hyperlink>
       <w:r>
-        <w:t xml:space="preserve">). These results support the second and third hypotheses: the median ratio exceeds one and a half, and more than one tenth of the significant coefficients were not significant under the design.</w:t>
+        <w:t xml:space="preserve">). The point estimates of 26 coefficients (8.4 per cent) differ in sign between the unweighted and the weighted fit, but only 8 of these were significant in the unweighted fit and 1 in both, so most sign changes concern coefficients that are close to zero. The second hypothesis (median ratio above one and a half) and the third (more than one tenth of significant coefficients lose significance, here with a lower interval limit above one tenth) are supported.</w:t>
       </w:r>
     </w:p>
     <w:tbl>
@@ -4139,7 +4153,7 @@
             <w:r>
               <w:drawing>
                 <wp:inline>
-                  <wp:extent cx="5334000" cy="2423554"/>
+                  <wp:extent cx="5334000" cy="2424866"/>
                   <wp:effectExtent b="0" l="0" r="0" t="0"/>
                   <wp:docPr descr="" title="" id="36" name="Picture"/>
                   <a:graphic>
@@ -4160,7 +4174,7 @@
                         <pic:spPr bwMode="auto">
                           <a:xfrm>
                             <a:off x="0" y="0"/>
-                            <a:ext cx="5334000" cy="2423554"/>
+                            <a:ext cx="5334000" cy="2424866"/>
                           </a:xfrm>
                           <a:prstGeom prst="rect">
                             <a:avLst/>
@@ -4189,7 +4203,7 @@
               <w:pStyle w:val="ImageCaption"/>
             </w:pPr>
             <w:r>
-              <w:t xml:space="preserve">Figure 4: Effect of the survey design on standard errors and significance. Panel A: ratio of the design-aware to the unweighted standard error over all re-estimated coefficients. Panel B: share of coefficients, significant in the unweighted fit, that lose significance under the design-aware fit, by study.</w:t>
+              <w:t xml:space="preserve">Figure 4: Where the standard-error difference comes from and what it changes. Panel A: ratios of standard errors over all re-estimated coefficients, by source (orange: median). Panel B: share of coefficients, significant under each study’s declared inference, that lose significance under the design-aware fit, by study.</w:t>
             </w:r>
           </w:p>
           <w:bookmarkEnd w:id="38"/>
@@ -4228,23 +4242,25 @@
               <w:pStyle w:val="ImageCaption"/>
             </w:pPr>
             <w:r>
-              <w:t xml:space="preserve">Table 4: Re-estimation of eight regression studies. SE ratio: design standard error over unweighted standard error. Significance lost: coefficients significant at 5 % in the unweighted fit that are not under the design-aware fit. Sign flip: unweighted and design-aware estimates differ in sign.</w:t>
+              <w:t xml:space="preserve">Table 4: Re-estimation of eight regression studies. The three ratio columns are median ratios of standard errors: weighted model-based over unweighted; weighted household-clustered over weighted model-based; replicate-weight over weighted household-clustered. Significance lost: coefficients significant under the study’s declared inference that are not under the design-aware fit (the study that itself used the jackknife has none). Sign flip: unweighted and design-aware estimates differ in sign.</w:t>
             </w:r>
           </w:p>
           <w:tbl>
             <w:tblPr>
               <w:tblStyle w:val="Table"/>
-              <w:tblW w:type="pct" w:w="4650"/>
+              <w:tblW w:type="pct" w:w="4800"/>
               <w:tblLayout w:type="fixed"/>
               <w:tblLook w:firstRow="1" w:lastRow="0" w:firstColumn="0" w:lastColumn="0" w:noHBand="0" w:noVBand="0" w:val="0020"/>
             </w:tblPr>
             <w:tblGrid>
-              <w:gridCol w:w="2059"/>
-              <w:gridCol w:w="871"/>
-              <w:gridCol w:w="1584"/>
-              <w:gridCol w:w="950"/>
-              <w:gridCol w:w="1108"/>
-              <w:gridCol w:w="792"/>
+              <w:gridCol w:w="1742"/>
+              <w:gridCol w:w="712"/>
+              <w:gridCol w:w="1346"/>
+              <w:gridCol w:w="633"/>
+              <w:gridCol w:w="633"/>
+              <w:gridCol w:w="712"/>
+              <w:gridCol w:w="1188"/>
+              <w:gridCol w:w="633"/>
             </w:tblGrid>
             <w:tr>
               <w:trPr>
@@ -4298,20 +4314,46 @@
                     <w:jc w:val="center"/>
                   </w:pPr>
                   <w:r>
-                    <w:t xml:space="preserve">Median SE ratio</w:t>
-                  </w:r>
-                </w:p>
-              </w:tc>
-              <w:tc>
-                <w:tcPr/>
-                <w:p>
-                  <w:pPr>
-                    <w:pStyle w:val="Compact"/>
-                    <w:jc w:val="right"/>
-                    <w:jc w:val="center"/>
-                  </w:pPr>
-                  <w:r>
-                    <w:t xml:space="preserve">Significance lost</w:t>
+                    <w:t xml:space="preserve">Weights</w:t>
+                  </w:r>
+                </w:p>
+              </w:tc>
+              <w:tc>
+                <w:tcPr/>
+                <w:p>
+                  <w:pPr>
+                    <w:pStyle w:val="Compact"/>
+                    <w:jc w:val="right"/>
+                    <w:jc w:val="center"/>
+                  </w:pPr>
+                  <w:r>
+                    <w:t xml:space="preserve">Clustering</w:t>
+                  </w:r>
+                </w:p>
+              </w:tc>
+              <w:tc>
+                <w:tcPr/>
+                <w:p>
+                  <w:pPr>
+                    <w:pStyle w:val="Compact"/>
+                    <w:jc w:val="right"/>
+                    <w:jc w:val="center"/>
+                  </w:pPr>
+                  <w:r>
+                    <w:t xml:space="preserve">Replicate formula</w:t>
+                  </w:r>
+                </w:p>
+              </w:tc>
+              <w:tc>
+                <w:tcPr/>
+                <w:p>
+                  <w:pPr>
+                    <w:pStyle w:val="Compact"/>
+                    <w:jc w:val="right"/>
+                    <w:jc w:val="center"/>
+                  </w:pPr>
+                  <w:r>
+                    <w:t xml:space="preserve">Significance lost (declared inference)</w:t>
                   </w:r>
                 </w:p>
               </w:tc>
@@ -4378,20 +4420,46 @@
                     <w:jc w:val="center"/>
                   </w:pPr>
                   <w:r>
-                    <w:t xml:space="preserve">1.86</w:t>
-                  </w:r>
-                </w:p>
-              </w:tc>
-              <w:tc>
-                <w:tcPr/>
-                <w:p>
-                  <w:pPr>
-                    <w:pStyle w:val="Compact"/>
-                    <w:jc w:val="right"/>
-                    <w:jc w:val="center"/>
-                  </w:pPr>
-                  <w:r>
-                    <w:t xml:space="preserve">14 / 40</w:t>
+                    <w:t xml:space="preserve">1.78</w:t>
+                  </w:r>
+                </w:p>
+              </w:tc>
+              <w:tc>
+                <w:tcPr/>
+                <w:p>
+                  <w:pPr>
+                    <w:pStyle w:val="Compact"/>
+                    <w:jc w:val="right"/>
+                    <w:jc w:val="center"/>
+                  </w:pPr>
+                  <w:r>
+                    <w:t xml:space="preserve">1.12</w:t>
+                  </w:r>
+                </w:p>
+              </w:tc>
+              <w:tc>
+                <w:tcPr/>
+                <w:p>
+                  <w:pPr>
+                    <w:pStyle w:val="Compact"/>
+                    <w:jc w:val="right"/>
+                    <w:jc w:val="center"/>
+                  </w:pPr>
+                  <w:r>
+                    <w:t xml:space="preserve">0.94</w:t>
+                  </w:r>
+                </w:p>
+              </w:tc>
+              <w:tc>
+                <w:tcPr/>
+                <w:p>
+                  <w:pPr>
+                    <w:pStyle w:val="Compact"/>
+                    <w:jc w:val="right"/>
+                    <w:jc w:val="center"/>
+                  </w:pPr>
+                  <w:r>
+                    <w:t xml:space="preserve">0 / 24</w:t>
                   </w:r>
                 </w:p>
               </w:tc>
@@ -4445,7 +4513,7 @@
                     <w:jc w:val="center"/>
                   </w:pPr>
                   <w:r>
-                    <w:t xml:space="preserve">5 / 34 / 60</w:t>
+                    <w:t xml:space="preserve">2 / 34 / 60</w:t>
                   </w:r>
                 </w:p>
               </w:tc>
@@ -4471,7 +4539,33 @@
                     <w:jc w:val="center"/>
                   </w:pPr>
                   <w:r>
-                    <w:t xml:space="preserve">22 / 54</w:t>
+                    <w:t xml:space="preserve">1.01</w:t>
+                  </w:r>
+                </w:p>
+              </w:tc>
+              <w:tc>
+                <w:tcPr/>
+                <w:p>
+                  <w:pPr>
+                    <w:pStyle w:val="Compact"/>
+                    <w:jc w:val="right"/>
+                    <w:jc w:val="center"/>
+                  </w:pPr>
+                  <w:r>
+                    <w:t xml:space="preserve">0.99</w:t>
+                  </w:r>
+                </w:p>
+              </w:tc>
+              <w:tc>
+                <w:tcPr/>
+                <w:p>
+                  <w:pPr>
+                    <w:pStyle w:val="Compact"/>
+                    <w:jc w:val="right"/>
+                    <w:jc w:val="center"/>
+                  </w:pPr>
+                  <w:r>
+                    <w:t xml:space="preserve">-</w:t>
                   </w:r>
                 </w:p>
               </w:tc>
@@ -4538,7 +4632,33 @@
                     <w:jc w:val="center"/>
                   </w:pPr>
                   <w:r>
-                    <w:t xml:space="preserve">1.84</w:t>
+                    <w:t xml:space="preserve">2.28</w:t>
+                  </w:r>
+                </w:p>
+              </w:tc>
+              <w:tc>
+                <w:tcPr/>
+                <w:p>
+                  <w:pPr>
+                    <w:pStyle w:val="Compact"/>
+                    <w:jc w:val="right"/>
+                    <w:jc w:val="center"/>
+                  </w:pPr>
+                  <w:r>
+                    <w:t xml:space="preserve">1.01</w:t>
+                  </w:r>
+                </w:p>
+              </w:tc>
+              <w:tc>
+                <w:tcPr/>
+                <w:p>
+                  <w:pPr>
+                    <w:pStyle w:val="Compact"/>
+                    <w:jc w:val="right"/>
+                    <w:jc w:val="center"/>
+                  </w:pPr>
+                  <w:r>
+                    <w:t xml:space="preserve">0.75</w:t>
                   </w:r>
                 </w:p>
               </w:tc>
@@ -4605,20 +4725,46 @@
                     <w:jc w:val="center"/>
                   </w:pPr>
                   <w:r>
-                    <w:t xml:space="preserve">0 / 0 / 2</w:t>
-                  </w:r>
-                </w:p>
-              </w:tc>
-              <w:tc>
-                <w:tcPr/>
-                <w:p>
-                  <w:pPr>
-                    <w:pStyle w:val="Compact"/>
-                    <w:jc w:val="right"/>
-                    <w:jc w:val="center"/>
-                  </w:pPr>
-                  <w:r>
-                    <w:t xml:space="preserve">1.96</w:t>
+                    <w:t xml:space="preserve">-</w:t>
+                  </w:r>
+                </w:p>
+              </w:tc>
+              <w:tc>
+                <w:tcPr/>
+                <w:p>
+                  <w:pPr>
+                    <w:pStyle w:val="Compact"/>
+                    <w:jc w:val="right"/>
+                    <w:jc w:val="center"/>
+                  </w:pPr>
+                  <w:r>
+                    <w:t xml:space="preserve">1.67</w:t>
+                  </w:r>
+                </w:p>
+              </w:tc>
+              <w:tc>
+                <w:tcPr/>
+                <w:p>
+                  <w:pPr>
+                    <w:pStyle w:val="Compact"/>
+                    <w:jc w:val="right"/>
+                    <w:jc w:val="center"/>
+                  </w:pPr>
+                  <w:r>
+                    <w:t xml:space="preserve">1.02</w:t>
+                  </w:r>
+                </w:p>
+              </w:tc>
+              <w:tc>
+                <w:tcPr/>
+                <w:p>
+                  <w:pPr>
+                    <w:pStyle w:val="Compact"/>
+                    <w:jc w:val="right"/>
+                    <w:jc w:val="center"/>
+                  </w:pPr>
+                  <w:r>
+                    <w:t xml:space="preserve">1.09</w:t>
                   </w:r>
                 </w:p>
               </w:tc>
@@ -4685,20 +4831,46 @@
                     <w:jc w:val="center"/>
                   </w:pPr>
                   <w:r>
-                    <w:t xml:space="preserve">17 / 6 / 32</w:t>
-                  </w:r>
-                </w:p>
-              </w:tc>
-              <w:tc>
-                <w:tcPr/>
-                <w:p>
-                  <w:pPr>
-                    <w:pStyle w:val="Compact"/>
-                    <w:jc w:val="right"/>
-                    <w:jc w:val="center"/>
-                  </w:pPr>
-                  <w:r>
-                    <w:t xml:space="preserve">2.54</w:t>
+                    <w:t xml:space="preserve">15 / 4 / 32</w:t>
+                  </w:r>
+                </w:p>
+              </w:tc>
+              <w:tc>
+                <w:tcPr/>
+                <w:p>
+                  <w:pPr>
+                    <w:pStyle w:val="Compact"/>
+                    <w:jc w:val="right"/>
+                    <w:jc w:val="center"/>
+                  </w:pPr>
+                  <w:r>
+                    <w:t xml:space="preserve">2.19</w:t>
+                  </w:r>
+                </w:p>
+              </w:tc>
+              <w:tc>
+                <w:tcPr/>
+                <w:p>
+                  <w:pPr>
+                    <w:pStyle w:val="Compact"/>
+                    <w:jc w:val="right"/>
+                    <w:jc w:val="center"/>
+                  </w:pPr>
+                  <w:r>
+                    <w:t xml:space="preserve">1.12</w:t>
+                  </w:r>
+                </w:p>
+              </w:tc>
+              <w:tc>
+                <w:tcPr/>
+                <w:p>
+                  <w:pPr>
+                    <w:pStyle w:val="Compact"/>
+                    <w:jc w:val="right"/>
+                    <w:jc w:val="center"/>
+                  </w:pPr>
+                  <w:r>
+                    <w:t xml:space="preserve">1.05</w:t>
                   </w:r>
                 </w:p>
               </w:tc>
@@ -4765,20 +4937,46 @@
                     <w:jc w:val="center"/>
                   </w:pPr>
                   <w:r>
-                    <w:t xml:space="preserve">0 / 0 / 2</w:t>
-                  </w:r>
-                </w:p>
-              </w:tc>
-              <w:tc>
-                <w:tcPr/>
-                <w:p>
-                  <w:pPr>
-                    <w:pStyle w:val="Compact"/>
-                    <w:jc w:val="right"/>
-                    <w:jc w:val="center"/>
-                  </w:pPr>
-                  <w:r>
-                    <w:t xml:space="preserve">2.42</w:t>
+                    <w:t xml:space="preserve">-</w:t>
+                  </w:r>
+                </w:p>
+              </w:tc>
+              <w:tc>
+                <w:tcPr/>
+                <w:p>
+                  <w:pPr>
+                    <w:pStyle w:val="Compact"/>
+                    <w:jc w:val="right"/>
+                    <w:jc w:val="center"/>
+                  </w:pPr>
+                  <w:r>
+                    <w:t xml:space="preserve">2.18</w:t>
+                  </w:r>
+                </w:p>
+              </w:tc>
+              <w:tc>
+                <w:tcPr/>
+                <w:p>
+                  <w:pPr>
+                    <w:pStyle w:val="Compact"/>
+                    <w:jc w:val="right"/>
+                    <w:jc w:val="center"/>
+                  </w:pPr>
+                  <w:r>
+                    <w:t xml:space="preserve">1.09</w:t>
+                  </w:r>
+                </w:p>
+              </w:tc>
+              <w:tc>
+                <w:tcPr/>
+                <w:p>
+                  <w:pPr>
+                    <w:pStyle w:val="Compact"/>
+                    <w:jc w:val="right"/>
+                    <w:jc w:val="center"/>
+                  </w:pPr>
+                  <w:r>
+                    <w:t xml:space="preserve">1.06</w:t>
                   </w:r>
                 </w:p>
               </w:tc>
@@ -4845,20 +5043,46 @@
                     <w:jc w:val="center"/>
                   </w:pPr>
                   <w:r>
-                    <w:t xml:space="preserve">31 / 13 / 32</w:t>
-                  </w:r>
-                </w:p>
-              </w:tc>
-              <w:tc>
-                <w:tcPr/>
-                <w:p>
-                  <w:pPr>
-                    <w:pStyle w:val="Compact"/>
-                    <w:jc w:val="right"/>
-                    <w:jc w:val="center"/>
-                  </w:pPr>
-                  <w:r>
-                    <w:t xml:space="preserve">2.45</w:t>
+                    <w:t xml:space="preserve">30 / 12 / 32</w:t>
+                  </w:r>
+                </w:p>
+              </w:tc>
+              <w:tc>
+                <w:tcPr/>
+                <w:p>
+                  <w:pPr>
+                    <w:pStyle w:val="Compact"/>
+                    <w:jc w:val="right"/>
+                    <w:jc w:val="center"/>
+                  </w:pPr>
+                  <w:r>
+                    <w:t xml:space="preserve">2.12</w:t>
+                  </w:r>
+                </w:p>
+              </w:tc>
+              <w:tc>
+                <w:tcPr/>
+                <w:p>
+                  <w:pPr>
+                    <w:pStyle w:val="Compact"/>
+                    <w:jc w:val="right"/>
+                    <w:jc w:val="center"/>
+                  </w:pPr>
+                  <w:r>
+                    <w:t xml:space="preserve">1.04</w:t>
+                  </w:r>
+                </w:p>
+              </w:tc>
+              <w:tc>
+                <w:tcPr/>
+                <w:p>
+                  <w:pPr>
+                    <w:pStyle w:val="Compact"/>
+                    <w:jc w:val="right"/>
+                    <w:jc w:val="center"/>
+                  </w:pPr>
+                  <w:r>
+                    <w:t xml:space="preserve">1.15</w:t>
                   </w:r>
                 </w:p>
               </w:tc>
@@ -4925,20 +5149,46 @@
                     <w:jc w:val="center"/>
                   </w:pPr>
                   <w:r>
-                    <w:t xml:space="preserve">9 / 7 / 14</w:t>
-                  </w:r>
-                </w:p>
-              </w:tc>
-              <w:tc>
-                <w:tcPr/>
-                <w:p>
-                  <w:pPr>
-                    <w:pStyle w:val="Compact"/>
-                    <w:jc w:val="right"/>
-                    <w:jc w:val="center"/>
-                  </w:pPr>
-                  <w:r>
-                    <w:t xml:space="preserve">2.43</w:t>
+                    <w:t xml:space="preserve">8 / 6 / 14</w:t>
+                  </w:r>
+                </w:p>
+              </w:tc>
+              <w:tc>
+                <w:tcPr/>
+                <w:p>
+                  <w:pPr>
+                    <w:pStyle w:val="Compact"/>
+                    <w:jc w:val="right"/>
+                    <w:jc w:val="center"/>
+                  </w:pPr>
+                  <w:r>
+                    <w:t xml:space="preserve">2.34</w:t>
+                  </w:r>
+                </w:p>
+              </w:tc>
+              <w:tc>
+                <w:tcPr/>
+                <w:p>
+                  <w:pPr>
+                    <w:pStyle w:val="Compact"/>
+                    <w:jc w:val="right"/>
+                    <w:jc w:val="center"/>
+                  </w:pPr>
+                  <w:r>
+                    <w:t xml:space="preserve">1.16</w:t>
+                  </w:r>
+                </w:p>
+              </w:tc>
+              <w:tc>
+                <w:tcPr/>
+                <w:p>
+                  <w:pPr>
+                    <w:pStyle w:val="Compact"/>
+                    <w:jc w:val="right"/>
+                    <w:jc w:val="center"/>
+                  </w:pPr>
+                  <w:r>
+                    <w:t xml:space="preserve">0.94</w:t>
                   </w:r>
                 </w:p>
               </w:tc>
@@ -4980,7 +5230,7 @@
         <w:pStyle w:val="BodyText"/>
       </w:pPr>
       <w:r>
-        <w:t xml:space="preserve">A concrete example is the negative binomial study of shared mobility and trips. Its conclusion is that ride-hailing use is a significant predictor of daily trips. The coefficient reproduces (0.33 per cent more trips per additional use in the past month on weekdays) and is highly significant in the unweighted fit, with a p-value &lt; 0.001. With the design-aware variance the standard error is 0.0024 instead of 0.0008, and the p-value becomes = 0.17; on weekends it is = 0.11 (</w:t>
+        <w:t xml:space="preserve">A concrete example is the negative binomial study of shared mobility and trips, whose conclusion is that ride-hailing use is a significant predictor of daily trips. The unweighted fit reproduces the printed coefficient (0.44 per cent more trips per additional use in the past month on weekdays) and gives a p-value &lt; 0.001. The weighted estimate is smaller (0.33 per cent, a change of −24 per cent); its household-clustered p-value is = 0.045 and the replicate-weight standard error of 0.0024 (against 0.0008 unweighted) gives a p-value = 0.17; on weekends the replicate p-value is = 0.11 (</w:t>
       </w:r>
       <w:hyperlink w:anchor="fig-case">
         <w:r>
@@ -4991,7 +5241,7 @@
         </w:r>
       </w:hyperlink>
       <w:r>
-        <w:t xml:space="preserve">, reference letter R). The point estimate does not move; the evidence for it does. Bike-sharing, by contrast, is significant on weekdays under both fits. A second example is the number of household vehicles in the ZINB model of ridesharing, which is stable, whereas the effect of being a driver on the count of rides, significant in the unweighted fit (p &lt; 0.001), becomes uncertain under the design-aware fit (p = 0.14).</w:t>
+        <w:t xml:space="preserve">, reference letter R). Significance, on which the conclusion rests, therefore depends on both the weighting and the variance estimator. A second example is the effect of being a driver on the count of rides in the zero-inflated model: the estimate changes from −0.43 to −0.19, and the p-value from &lt; 0.001 (unweighted) to = 0.015 (weighted, clustered) and = 0.14 (replicate weights).</w:t>
       </w:r>
     </w:p>
     <w:tbl>
@@ -5088,7 +5338,24 @@
         <w:pStyle w:val="FirstParagraph"/>
       </w:pPr>
       <w:r>
-        <w:t xml:space="preserve">The design-aware fit differs from the unweighted one in three layers: the weights change the estimate; treating persons of a household as a cluster inflates the standard error; and the replicate formula captures the stratification and the remaining structure. Most of the difference in the standard error is due to the second layer. A weighted fit with a household-clustered sandwich variance gave standard errors whose median ratio to the replicate-weight ones was 0.99; of the 182 coefficients significant under that fit, only 16 (9 per cent) lost significance under the replicate variance. In practice, a weighted fit with household-clustered standard errors is a good approximation to the replicate variance in these data, which is useful for the 2022 wave, where no replicate weights exist and the design is expressed through strata and clusters.</w:t>
+        <w:t xml:space="preserve">The decomposition in</w:t>
+      </w:r>
+      <w:r>
+        <w:t xml:space="preserve"> </w:t>
+      </w:r>
+      <w:hyperlink w:anchor="fig-se">
+        <w:r>
+          <w:rPr>
+            <w:rStyle w:val="Hyperlink"/>
+          </w:rPr>
+          <w:t xml:space="preserve">Figure 4</w:t>
+        </w:r>
+      </w:hyperlink>
+      <w:r>
+        <w:t xml:space="preserve"> </w:t>
+      </w:r>
+      <w:r>
+        <w:t xml:space="preserve">(panel A) says that the weights drive the difference and that, on average, the household clustering and the replicate formula add little. This is not a licence to skip the replicate formula. Per study, the median ratio of the replicate-weight to the household-clustered standard error ranged from 0.75 to 1.15, and for individual coefficients from 0.70 to 1.44 (fifth to ninety-fifth percentile); of the 182 coefficients significant under the weighted household-clustered fit, 16 (9 per cent) lost significance under the replicate variance, including the ride-hailing coefficient above. Where replicate weights exist they should be used; the household-clustered weighted fit is a reasonable fallback for the 2022 wave, where the design is expressed through strata and clusters, but it is an approximation that fails in some of exactly the cases that matter.</w:t>
       </w:r>
     </w:p>
     <w:bookmarkEnd w:id="45"/>
@@ -5106,7 +5373,7 @@
         <w:pStyle w:val="FirstParagraph"/>
       </w:pPr>
       <w:r>
-        <w:t xml:space="preserve">The structural equation model of online shopping and shopping trips, which prints standardised coefficients, was fitted with the same variables except two that come from other sources. Its two cross-effects were −0.08 and 0.17 in our weighted fit against 0.12 and 0.21 printed, with design standard errors of about 0.02; signs of exogenous effects agree with the printed ones up to the arbitrary sign of a latent scale, so we grade it as reproduced only qualitatively. For the propensity-score matching study of ride-hailing and vehicle miles, a greedy nearest-neighbour matching in the same strata gave 2,664 matched triples of persons with household vehicle access against about five thousand printed. Matched mean daily miles differed from the printed means (for frequent users 29.8 against 24.8 miles), but the decline in the number of household vehicles when moving from non-users to occasional users was close to the printed one (−0.067 against −0.065). The paired test used in the paper gives a t statistic of 2.45 for this contrast; with the replicate-weight variance it is 0.95. The other two vehicle contrasts have statistics of 0.00 and 1.62 under the design, so none of the three differences in household vehicles is distinguishable from zero in our matched samples under the design.</w:t>
+        <w:t xml:space="preserve">The structural equation model of online shopping and shopping trips, which prints standardised coefficients, was fitted with the same variables except two that come from other sources, on 106,136 persons against the printed 85,663. Its two cross-effects were −0.08 and 0.17 in our weighted fit against 0.12 and 0.21 printed, with design standard errors of about 0.02. One cross-effect has the opposite sign and the other a different size, and the sign convention of the latent variables cannot repair both; we grade the model as not reproduced. For the propensity-score matching study of ride-hailing and vehicle miles, a greedy nearest-neighbour matching in the same strata gave 2,664 matched triples of persons with household vehicle access against about five thousand printed. Matched mean daily miles differed from the printed means (for frequent users 29.8 against 24.8 miles) and only one of the three vehicle contrasts was close to its printed value (non-users to occasional users −0.067 against −0.065); we grade the study as not reproduced. A design-aware comparison of matched samples is not straightforward, because weighting the two arms separately breaks the pairing and the replicate variance treats the matched sample as fixed; we report only that none of the three vehicle contrasts has a t statistic above two when the arms are weighted (0.95, 0.00 and 1.62), without comparing it with the paired statistic of the paper (2.45 for the first contrast).</w:t>
       </w:r>
     </w:p>
     <w:bookmarkEnd w:id="46"/>
@@ -5124,7 +5391,7 @@
         <w:pStyle w:val="FirstParagraph"/>
       </w:pPr>
       <w:r>
-        <w:t xml:space="preserve">Classifiers of alternative-fuel and electric vehicle adoption showed the largest dependence on the pipeline. When the rarer class was oversampled before the rows were split, the area under the curve of the random forest was 0.99 (alternative-fuel vehicles) and 1.00 (electric vehicles) and of the decision tree 0.98 and 0.99, close to the printed 0.92 and 0.91 (</w:t>
+        <w:t xml:space="preserve">Classifiers of alternative-fuel and electric vehicle adoption showed the largest dependence on the pipeline (</w:t>
       </w:r>
       <w:hyperlink w:anchor="fig-leak">
         <w:r>
@@ -5135,7 +5402,26 @@
         </w:r>
       </w:hyperlink>
       <w:r>
-        <w:t xml:space="preserve">, reference letter L). When the split came first, the same models scored 0.64 and 0.73 for the random forest and 0.52 and 0.54 for the tree, and splitting by household did not change this (0.64 and 0.72; weighted by the survey weight, 0.64 and 0.72). The inflation was therefore 0.35 (alternative-fuel) and 0.28 (electric) for the random forest, and 0.45 and 0.46 for the decision tree. The decision tree, which scored 0.98 in the leaky pipeline, is barely better than chance (0.52) when evaluated honestly. This supports the fourth hypothesis: the printed scores can only be approached in a pipeline in which copies of test rows reach the training data. Tuning all models alike did not remove the gap. The tuned random forest scored 0.99 when oversampling came first and 0.66 by household (an inflation of 0.33; for electric vehicles 0.23), and the tuned decision tree rose from 0.52 to 0.63 but stayed far below its leaky score of 0.98. The second master seed gave the same pattern (largest standard deviation of a mean over seeds 0.026).</w:t>
+        <w:t xml:space="preserve">). When the rarer class was oversampled before the rows were split, the area under the curve of the random forest was 0.99 (alternative-fuel vehicles) and 1.00 (electric vehicles) and of the decision tree 0.98 and 0.99. When the split came first, the same models scored 0.64 and 0.73 for the random forest and 0.52 and 0.54 for the tree; splitting by household changed this little (0.63 and 0.71), as expected because only 20 per cent of the rows share a household with another row, so the leak that matters here is the oversampling. Weighted by the survey weight, the random forest scored 0.65 and 0.69. The inflation of the random forest was 0.36 (alternative-fuel) and 0.29 (electric); the decision tree, which scored 0.98 in the leaky pipeline, is barely better than chance (0.54) when evaluated honestly.</w:t>
+      </w:r>
+    </w:p>
+    <w:p>
+      <w:pPr>
+        <w:pStyle w:val="BodyText"/>
+      </w:pPr>
+      <w:r>
+        <w:t xml:space="preserve">The printed values for alternative-fuel vehicles, 0.92 for the random forest and 0.91 for the decision tree, lie between the leaky and the honest scores and are reproduced by neither (</w:t>
+      </w:r>
+      <w:hyperlink w:anchor="fig-leak">
+        <w:r>
+          <w:rPr>
+            <w:rStyle w:val="Hyperlink"/>
+          </w:rPr>
+          <w:t xml:space="preserve">Figure 6</w:t>
+        </w:r>
+      </w:hyperlink>
+      <w:r>
+        <w:t xml:space="preserve">, reference letter L); our sample is also smaller than the printed one. The printed accuracies, above ninety per cent for all five models, are consistent with an honest test set of a rare class, where predicting the majority class gives 0.96, and not with the leaky pipeline, where accuracy was 0.64 for logistic regression, 0.66 for naive Bayes and 0.83 for the support vector machine. We therefore do not claim that the published pipeline leaked; we show that oversampling before splitting inflates the score of three of five models by more than fifteen percentage points (the random forest by 0.36, the decision tree by 0.44 and the support vector machine by 0.30) and of the other two, logistic regression and naive Bayes, by 0.02 and 0.11. The fourth hypothesis, as originally worded (the printed score is reproduced only in a leaky pipeline), is not supported; the inflation it rests on is. Tuning all models alike did not remove the gap. The tuned random forest scored 0.99 when oversampling came first and 0.66 by household (an inflation of 0.33; for electric vehicles 0.23), and the tuned decision tree rose from 0.54 to 0.63 but stayed far below its leaky score of 0.98. The largest standard deviation of a mean score over the seeds was 0.033 for the default settings and 0.039 (0.075 for the weighted score) for the tuned models.</w:t>
       </w:r>
     </w:p>
     <w:tbl>
@@ -5366,7 +5652,7 @@
                     <w:jc w:val="center"/>
                   </w:pPr>
                   <w:r>
-                    <w:t xml:space="preserve">0.68</w:t>
+                    <w:t xml:space="preserve">0.66</w:t>
                   </w:r>
                 </w:p>
               </w:tc>
@@ -5459,20 +5745,20 @@
                     <w:jc w:val="center"/>
                   </w:pPr>
                   <w:r>
-                    <w:t xml:space="preserve">0.64</w:t>
-                  </w:r>
-                </w:p>
-              </w:tc>
-              <w:tc>
-                <w:tcPr/>
-                <w:p>
-                  <w:pPr>
-                    <w:pStyle w:val="Compact"/>
-                    <w:jc w:val="right"/>
-                    <w:jc w:val="center"/>
-                  </w:pPr>
-                  <w:r>
-                    <w:t xml:space="preserve">0.67</w:t>
+                    <w:t xml:space="preserve">0.62</w:t>
+                  </w:r>
+                </w:p>
+              </w:tc>
+              <w:tc>
+                <w:tcPr/>
+                <w:p>
+                  <w:pPr>
+                    <w:pStyle w:val="Compact"/>
+                    <w:jc w:val="right"/>
+                    <w:jc w:val="center"/>
+                  </w:pPr>
+                  <w:r>
+                    <w:t xml:space="preserve">0.63</w:t>
                   </w:r>
                 </w:p>
               </w:tc>
@@ -5565,7 +5851,7 @@
                     <w:jc w:val="center"/>
                   </w:pPr>
                   <w:r>
-                    <w:t xml:space="preserve">0.52</w:t>
+                    <w:t xml:space="preserve">0.54</w:t>
                   </w:r>
                 </w:p>
               </w:tc>
@@ -5671,20 +5957,20 @@
                     <w:jc w:val="center"/>
                   </w:pPr>
                   <w:r>
-                    <w:t xml:space="preserve">0.64</w:t>
-                  </w:r>
-                </w:p>
-              </w:tc>
-              <w:tc>
-                <w:tcPr/>
-                <w:p>
-                  <w:pPr>
-                    <w:pStyle w:val="Compact"/>
-                    <w:jc w:val="right"/>
-                    <w:jc w:val="center"/>
-                  </w:pPr>
-                  <w:r>
-                    <w:t xml:space="preserve">0.64</w:t>
+                    <w:t xml:space="preserve">0.63</w:t>
+                  </w:r>
+                </w:p>
+              </w:tc>
+              <w:tc>
+                <w:tcPr/>
+                <w:p>
+                  <w:pPr>
+                    <w:pStyle w:val="Compact"/>
+                    <w:jc w:val="right"/>
+                    <w:jc w:val="center"/>
+                  </w:pPr>
+                  <w:r>
+                    <w:t xml:space="preserve">0.65</w:t>
                   </w:r>
                 </w:p>
               </w:tc>
@@ -5790,7 +6076,7 @@
                     <w:jc w:val="center"/>
                   </w:pPr>
                   <w:r>
-                    <w:t xml:space="preserve">0.57</w:t>
+                    <w:t xml:space="preserve">0.56</w:t>
                   </w:r>
                 </w:p>
               </w:tc>
@@ -5989,20 +6275,20 @@
                     <w:jc w:val="center"/>
                   </w:pPr>
                   <w:r>
-                    <w:t xml:space="preserve">0.74</w:t>
-                  </w:r>
-                </w:p>
-              </w:tc>
-              <w:tc>
-                <w:tcPr/>
-                <w:p>
-                  <w:pPr>
-                    <w:pStyle w:val="Compact"/>
-                    <w:jc w:val="right"/>
-                    <w:jc w:val="center"/>
-                  </w:pPr>
-                  <w:r>
-                    <w:t xml:space="preserve">0.76</w:t>
+                    <w:t xml:space="preserve">0.73</w:t>
+                  </w:r>
+                </w:p>
+              </w:tc>
+              <w:tc>
+                <w:tcPr/>
+                <w:p>
+                  <w:pPr>
+                    <w:pStyle w:val="Compact"/>
+                    <w:jc w:val="right"/>
+                    <w:jc w:val="center"/>
+                  </w:pPr>
+                  <w:r>
+                    <w:t xml:space="preserve">0.73</w:t>
                   </w:r>
                 </w:p>
               </w:tc>
@@ -6108,7 +6394,7 @@
                     <w:jc w:val="center"/>
                   </w:pPr>
                   <w:r>
-                    <w:t xml:space="preserve">0.54</w:t>
+                    <w:t xml:space="preserve">0.53</w:t>
                   </w:r>
                 </w:p>
               </w:tc>
@@ -6201,20 +6487,20 @@
                     <w:jc w:val="center"/>
                   </w:pPr>
                   <w:r>
-                    <w:t xml:space="preserve">0.72</w:t>
-                  </w:r>
-                </w:p>
-              </w:tc>
-              <w:tc>
-                <w:tcPr/>
-                <w:p>
-                  <w:pPr>
-                    <w:pStyle w:val="Compact"/>
-                    <w:jc w:val="right"/>
-                    <w:jc w:val="center"/>
-                  </w:pPr>
-                  <w:r>
-                    <w:t xml:space="preserve">0.72</w:t>
+                    <w:t xml:space="preserve">0.71</w:t>
+                  </w:r>
+                </w:p>
+              </w:tc>
+              <w:tc>
+                <w:tcPr/>
+                <w:p>
+                  <w:pPr>
+                    <w:pStyle w:val="Compact"/>
+                    <w:jc w:val="right"/>
+                    <w:jc w:val="center"/>
+                  </w:pPr>
+                  <w:r>
+                    <w:t xml:space="preserve">0.69</w:t>
                   </w:r>
                 </w:p>
               </w:tc>
@@ -6320,7 +6606,7 @@
                     <w:jc w:val="center"/>
                   </w:pPr>
                   <w:r>
-                    <w:t xml:space="preserve">0.65</w:t>
+                    <w:t xml:space="preserve">0.63</w:t>
                   </w:r>
                 </w:p>
               </w:tc>
@@ -6460,7 +6746,7 @@
         </w:r>
       </w:hyperlink>
       <w:r>
-        <w:t xml:space="preserve">). The gap of about 0.51 is not explained by the validation design; the printed variable table contains percentages above one hundred and a variable listed twice, so we cannot say which variables entered the printed model, and we make no claim about its correctness.</w:t>
+        <w:t xml:space="preserve">). The validation design does not explain the gap: even on its training households the model explained only 0.29 in 2017, and our linear regression scored 0.20 against 0.11 printed, so the target or the variables differ. The printed variable table contains percentages above one hundred and a variable listed twice, so we cannot say which variables entered the printed model, and we make no claim about its correctness or about leakage.</w:t>
       </w:r>
     </w:p>
     <w:tbl>
@@ -6568,7 +6854,7 @@
         <w:t xml:space="preserve"> </w:t>
       </w:r>
       <w:r>
-        <w:t xml:space="preserve">For a typical NHTS regression, the printed numbers are recoverable from the public files, provided the reader knows whether the authors weighted, and that is information the paper often has to be read twice to give. The next rung is where the findings move. Median standard errors are about 2.2 times larger under the design, 32 per cent of the significant coefficients lose significance, and 8 per cent change sign. These are not signs of error in the original papers, most of which state what they did; they show that the estimator was a choice with consequences that the article rarely discusses. A reader looking at a significance star in an unweighted NHTS regression is looking at a quantity whose probability statement does not apply to the population the survey describes.</w:t>
+        <w:t xml:space="preserve">For a typical NHTS regression, the printed numbers are recoverable from the public files, provided the reader knows whether the authors weighted, which the paper often has to be read twice to give; where the two estimators can be told apart, the declared one reproduces the printed numbers. The next rung is where the findings move. The design-aware standard error is a median of 2.2 times the unweighted one, and under the studies’ own declared inference 24 per cent of the significant coefficients are not significant under the design. These are not errors in the original papers, most of which state what they did; they show that the choice between an unweighted and a weighted, design-aware analysis has consequences that the articles rarely discuss.</w:t>
       </w:r>
     </w:p>
     <w:p>
@@ -6580,13 +6866,13 @@
           <w:b/>
           <w:bCs/>
         </w:rPr>
-        <w:t xml:space="preserve">Engineering interpretation.</w:t>
-      </w:r>
-      <w:r>
-        <w:t xml:space="preserve"> </w:t>
-      </w:r>
-      <w:r>
-        <w:t xml:space="preserve">For a planner the question is whether a coefficient can be used to project demand. The ride-hailing example is instructive. A coefficient of about 0.3 per cent more trips per additional use is small, and its sign would not change under any regime, but its significance, on which the paper’s headline rests, does. An unweighted result that holds only in the sample of respondents is a description of respondents; a design-aware result carries the uncertainty that a forecast needs. For the vehicle-miles matching study the conclusion that people change household vehicles as they shift from non-use to frequent use is not supported by our matched samples under the design, which means that the qualitative story about vehicle shedding rests on a sample-level test. Neither conclusion is refuted; both lose the support that an unweighted test gave them.</w:t>
+        <w:t xml:space="preserve">What the standard errors mean.</w:t>
+      </w:r>
+      <w:r>
+        <w:t xml:space="preserve"> </w:t>
+      </w:r>
+      <w:r>
+        <w:t xml:space="preserve">The unweighted analyses estimate an association among respondents, and their standard errors are nearly right for that estimand (understated by a median factor of only 1.10). The design-aware standard errors are large because estimating the population association with unequal weights is less precise. A planner who wants to project demand needs the population association and therefore the weighted fit with its honest uncertainty; a researcher interested in respondents may legitimately stay unweighted, but should say so. In the ride-hailing example, the coefficient is small under both fits, its significance, on which the headline rests, depends on the estimator, and the weighted estimate is a quarter smaller than the unweighted one. For the vehicle-miles matching study, our matched samples do not reproduce the printed contrasts, so we make no statement about vehicle shedding.</w:t>
       </w:r>
     </w:p>
     <w:p>
@@ -6598,13 +6884,13 @@
           <w:b/>
           <w:bCs/>
         </w:rPr>
-        <w:t xml:space="preserve">Why the design effect arises mostly from clustering.</w:t>
-      </w:r>
-      <w:r>
-        <w:t xml:space="preserve"> </w:t>
-      </w:r>
-      <w:r>
-        <w:t xml:space="preserve">Persons of a household share location, income, vehicles and travel opportunities, so the effective sample size for a household-level regressor is smaller than the number of rows. Replicate weights add the stratification and the unequal selection, but with this survey the clustering by household accounts for almost the entire correction. That is encouraging for users of the 2022 wave, who must work with strata and clusters instead of replicate weights, and a practical rule: whenever replicate weights are not an option, cluster at the household level and weight.</w:t>
+        <w:t xml:space="preserve">Why clustering matters little here.</w:t>
+      </w:r>
+      <w:r>
+        <w:t xml:space="preserve"> </w:t>
+      </w:r>
+      <w:r>
+        <w:t xml:space="preserve">Persons of a household share location, income and vehicles, but the outcomes studied (trip counts, mode use) are only weakly correlated within households once the covariates are in the model, and many rows have no other member in the sample. The effect of weights on the standard error is much larger because the NHTS weights vary strongly across persons. Replicate weights add the stratification and the unequal selection and change individual verdicts, so they should be used when available.</w:t>
       </w:r>
     </w:p>
     <w:p>
@@ -6622,7 +6908,7 @@
         <w:t xml:space="preserve"> </w:t>
       </w:r>
       <w:r>
-        <w:t xml:space="preserve">The scores printed for the classifiers of vehicle adoption can only be approached in a pipeline in which synthetic copies of a test row reach the training data, a leak documented in other fields</w:t>
+        <w:t xml:space="preserve">Oversampling before splitting inflates the score of a decision tree, a random forest and a support vector machine by more than fifteen percentage points, a leak documented in other fields</w:t>
       </w:r>
       <w:r>
         <w:t xml:space="preserve"> </w:t>
@@ -6631,7 +6917,7 @@
         <w:t xml:space="preserve">(Demircioğlu, 2024; Kapoor and Narayanan, 2023)</w:t>
       </w:r>
       <w:r>
-        <w:t xml:space="preserve">. We cannot know from the papers which order was used, and our result does not prove that the original pipeline leaked; it shows that the printed numbers are in the leaky range. A reader can check the claim with</w:t>
+        <w:t xml:space="preserve">. The printed scores are not reproduced by either pipeline and the printed accuracies argue against the leaky one, so the result is a warning, not a verdict on the original studies. A reader can check any pipeline with</w:t>
       </w:r>
       <w:r>
         <w:t xml:space="preserve"> </w:t>
@@ -6643,7 +6929,7 @@
         <w:t xml:space="preserve">pynhts.validate.audit_classifier</w:t>
       </w:r>
       <w:r>
-        <w:t xml:space="preserve">, which takes a few seconds. When the data are split by household and only the training rows are oversampled, a random forest of alternative-fuel adoption, about as accurate as logistic regression (0.64 and 0.67), has an area under the curve that is modest, which is worth knowing before using the model to target adoption policy. The regression-score gap of the online shopping study is of another kind: the validation design cannot explain it, and without the printed variable definitions it remains unexplained.</w:t>
+        <w:t xml:space="preserve">, which takes a few seconds. When the data are split before oversampling, a random forest of alternative-fuel adoption has an area under the curve of 0.63, about that of logistic regression (0.67), which is modest and worth knowing before using it to target adoption policy. The regression-score gap of the online shopping study is of another kind: the validation design does not explain it.</w:t>
       </w:r>
     </w:p>
     <w:p>
@@ -6661,7 +6947,7 @@
         <w:t xml:space="preserve"> </w:t>
       </w:r>
       <w:r>
-        <w:t xml:space="preserve">The study required three tools that did not exist in the package: a regression that returns weighted estimates with the wave’s variance design, a check of prediction pipelines for leakage, and a way to compare a printed number with a rebuilt one. The first two are released in pynhts as</w:t>
+        <w:t xml:space="preserve">The study required tools that did not exist in the package: a regression that returns weighted estimates with the wave’s variance design, a check of prediction pipelines for leakage, and a way to compare a printed number with a rebuilt one. The first two are released in pynhts as</w:t>
       </w:r>
       <w:r>
         <w:t xml:space="preserve"> </w:t>
@@ -6676,7 +6962,7 @@
         <w:t xml:space="preserve"> </w:t>
       </w:r>
       <w:r>
-        <w:t xml:space="preserve">and</w:t>
+        <w:t xml:space="preserve">(now with the unweighted, clustered, weighted and design-aware fits and a warning when the verdicts differ) and</w:t>
       </w:r>
       <w:r>
         <w:t xml:space="preserve"> </w:t>
@@ -6688,7 +6974,7 @@
         <w:t xml:space="preserve">pynhts.validate</w:t>
       </w:r>
       <w:r>
-        <w:t xml:space="preserve">, validated against R and with tests, and the rules of the package’s agent guide now say to use them. Three further developments follow from the evidence and are planned: a formula interface and ordinal and multinomial families for the discrete-choice papers that the present set does not include; household-level multilevel models with partial pooling for regional comparisons; and a library of replication recipes, one per published study, so that the registered gaps become regression tests that any user can run.</w:t>
+        <w:t xml:space="preserve">, validated against R for the replicate-weight and the Taylor designs, and the rules of the package’s agent guide say to use them. Three further developments follow from the evidence and are planned: a formula interface and ordinal and multinomial families for the discrete-choice papers that the present set does not include; household-level multilevel models with partial pooling for regional comparisons; and a library of replication recipes, one per published study, so that the registered gaps become regression tests that any user can run.</w:t>
       </w:r>
     </w:p>
     <w:p>
@@ -6706,7 +6992,7 @@
         <w:t xml:space="preserve"> </w:t>
       </w:r>
       <w:r>
-        <w:t xml:space="preserve">The case-study set is a convenience set of 22 studies, and 13 of them were refitted; the share of fragile conclusions among all NHTS papers is therefore not estimated. For two studies the printed target is a headline derived from a percentage in the abstract, and the grading of those is approximate. Our unweighted fits reproduce some printed values only approximately because the published samples cannot be rebuilt exactly. The matching study was repeated with a greedy matching, not the optimal matching of the original. The ML experiments use five classifiers with ten tuning trials each, a modest search that makes the comparison fair but not exhaustive; the published models may have been tuned further. The survey has no replicate weights in 2022, so the design-aware fit there would use linearisation, which is implemented in the package but not exercised in this paper. Finally, we describe conclusions as design-sensitive; we do not say they are wrong.</w:t>
+        <w:t xml:space="preserve">The case-study set is a convenience set of 22 studies, and 13 of them were refitted; the share of fragile conclusions among all NHTS papers is therefore not estimated. The pooled census mixes studies of different size; the declared-inference version restricts the comparison to what each study did. Two zero-inflated studies could not be graded because their printed headline cannot be mapped onto a coefficient; they contribute design effects only. Our fits reproduce some printed values only approximately because the published samples cannot be rebuilt exactly. The matching study used a greedy matching, not the optimal matching of the original. The machine-learning experiments use five classifiers with ten tuning trials each, a modest search that makes the comparison fair but not exhaustive, and score person rows with the household weight. We did not test whether the weights are informative about the outcomes, which would be the formal basis for choosing between the weighted and the unweighted estimand. The 2022 wave, which has no replicate weights, would use linearisation; it is implemented and checked against R but not exercised on the case studies. Finally, we describe conclusions as design-sensitive; we do not say they are wrong.</w:t>
       </w:r>
     </w:p>
     <w:p>
@@ -6724,7 +7010,7 @@
         <w:t xml:space="preserve"> </w:t>
       </w:r>
       <w:r>
-        <w:t xml:space="preserve">For authors: state whether weights were used and why; report the standard error from the survey design or, when only strata and clusters are available, with household-clustered errors; and give the sample-flow table with the number of records removed by each rule. For prediction models: split by household before anything else, oversample only the training rows, report a weighted score, and tune every model alike. For reviewers: a significance star from an unweighted NHTS regression and an area under the curve from a random split of oversampled rows should each trigger a question.</w:t>
+        <w:t xml:space="preserve">For authors: state whether weights were used and why, and for which population the coefficients are meant; report standard errors from the survey design or, when only strata and clusters are available, with household-clustered errors; and give the sample-flow table with the number of records removed by each rule. For prediction models: split by household before anything else, oversample only the training rows, report a weighted score, and tune every model alike. For reviewers: a significance star from an unweighted NHTS regression is a statement about respondents, and an area under the curve from a random split of oversampled rows should trigger a question.</w:t>
       </w:r>
     </w:p>
     <w:bookmarkEnd w:id="58"/>
@@ -6742,7 +7028,7 @@
         <w:pStyle w:val="FirstParagraph"/>
       </w:pPr>
       <w:r>
-        <w:t xml:space="preserve">A four-rung reproducibility ladder with design-aware re-estimation turns a general worry about survey-based transport research into numbers. On 22 published NHTS studies, the printed numbers were recoverable when the declared estimator was used; standard errors were about 2.2 times larger under the survey design; 32 per cent of the coefficients that were significant without the design were not; and printed prediction scores of vehicle adoption were reproduced only in a pipeline in which test rows leak into training. The household-clustered sandwich variance recovered most of the replicate-weight correction. The machinery is released as</w:t>
+        <w:t xml:space="preserve">A four-rung reproducibility ladder with design-aware re-estimation turns a general worry about survey-based transport research into numbers. On 22 published NHTS studies, the printed numbers were recoverable with the declared estimator where the estimators can be told apart; design-aware standard errors were about 2.2 times the unweighted ones, almost entirely because of the unequal weights; 24 per cent of the coefficients that were significant under the studies’ own inference were not significant under the design; and oversampling before splitting inflated the scores of classifiers of vehicle adoption by up to 0.44 area under the curve, while the printed scores were reproduced by neither pipeline. The machinery is released as</w:t>
       </w:r>
       <w:r>
         <w:t xml:space="preserve"> </w:t>
@@ -6855,1195 +7141,43 @@
       </w:r>
     </w:p>
     <w:bookmarkEnd w:id="60"/>
-    <w:bookmarkStart w:id="172" w:name="references"/>
+    <w:bookmarkStart w:id="66" w:name="supplementary-material"/>
     <w:p>
       <w:pPr>
         <w:pStyle w:val="Heading2"/>
       </w:pPr>
       <w:r>
-        <w:t xml:space="preserve">References</w:t>
-      </w:r>
-    </w:p>
-    <w:bookmarkStart w:id="171" w:name="refs"/>
-    <w:bookmarkStart w:id="62" w:name="ref-alberini2021"/>
-    <w:p>
-      <w:pPr>
-        <w:pStyle w:val="Bibliography"/>
-      </w:pPr>
-      <w:r>
-        <w:t xml:space="preserve">Alberini, A., Teja Burra, L., Cirillo, C., Shen, C., 2021. Counting vehicle miles traveled: What can we learn from the NHTS? Transportation Research Part D: Transport and Environment 98, 102984.</w:t>
-      </w:r>
-      <w:r>
-        <w:t xml:space="preserve"> </w:t>
-      </w:r>
-      <w:hyperlink r:id="rId61">
-        <w:r>
-          <w:rPr>
-            <w:rStyle w:val="Hyperlink"/>
-          </w:rPr>
-          <w:t xml:space="preserve">https://doi.org/10.1016/j.trd.2021.102984</w:t>
-        </w:r>
-      </w:hyperlink>
-    </w:p>
-    <w:bookmarkEnd w:id="62"/>
-    <w:bookmarkStart w:id="64" w:name="ref-barua2021"/>
-    <w:p>
-      <w:pPr>
-        <w:pStyle w:val="Bibliography"/>
-      </w:pPr>
-      <w:r>
-        <w:t xml:space="preserve">Barua, L., Zou, B., Zhou, Y., Liu, Y., 2021. Modeling household online shopping demand in the u.s.: A machine learning approach and comparative investigation between 2009 and 2017. Transportation 50, 437–476.</w:t>
-      </w:r>
-      <w:r>
-        <w:t xml:space="preserve"> </w:t>
-      </w:r>
-      <w:hyperlink r:id="rId63">
-        <w:r>
-          <w:rPr>
-            <w:rStyle w:val="Hyperlink"/>
-          </w:rPr>
-          <w:t xml:space="preserve">https://doi.org/10.1007/s11116-021-10250-z</w:t>
-        </w:r>
-      </w:hyperlink>
-    </w:p>
-    <w:bookmarkEnd w:id="64"/>
-    <w:bookmarkStart w:id="66" w:name="ref-birrell2019"/>
-    <w:p>
-      <w:pPr>
-        <w:pStyle w:val="Bibliography"/>
-      </w:pPr>
-      <w:r>
-        <w:t xml:space="preserve">Birrell, C.L., Steel, D.G., Batterham, M.J., Arya, A., 2019. How to use replicate weights in health survey analysis using the national nutrition and physical activity survey as an example. Public Health Nutrition 22, 3315–3326.</w:t>
-      </w:r>
-      <w:r>
-        <w:t xml:space="preserve"> </w:t>
-      </w:r>
-      <w:hyperlink r:id="rId65">
-        <w:r>
-          <w:rPr>
-            <w:rStyle w:val="Hyperlink"/>
-          </w:rPr>
-          <w:t xml:space="preserve">https://doi.org/10.1017/s1368980019001927</w:t>
-        </w:r>
-      </w:hyperlink>
-    </w:p>
-    <w:bookmarkEnd w:id="66"/>
-    <w:bookmarkStart w:id="68" w:name="ref-blagus2013"/>
-    <w:p>
-      <w:pPr>
-        <w:pStyle w:val="Bibliography"/>
-      </w:pPr>
-      <w:r>
-        <w:t xml:space="preserve">Blagus, R., Lusa, L., 2013. SMOTE for high-dimensional class-imbalanced data. BMC Bioinformatics 14, 106.</w:t>
-      </w:r>
-      <w:r>
-        <w:t xml:space="preserve"> </w:t>
-      </w:r>
-      <w:hyperlink r:id="rId67">
-        <w:r>
-          <w:rPr>
-            <w:rStyle w:val="Hyperlink"/>
-          </w:rPr>
-          <w:t xml:space="preserve">https://doi.org/10.1186/1471-2105-14-106</w:t>
-        </w:r>
-      </w:hyperlink>
-    </w:p>
-    <w:bookmarkEnd w:id="68"/>
-    <w:bookmarkStart w:id="70" w:name="ref-bollen2016"/>
-    <w:p>
-      <w:pPr>
-        <w:pStyle w:val="Bibliography"/>
-      </w:pPr>
-      <w:r>
-        <w:t xml:space="preserve">Bollen, K.A., Biemer, P.P., Karr, A.F., Tueller, S., Berzofsky, M.E., 2016. Are survey weights needed? A review of diagnostic tests in regression analysis. Annual Review of Statistics and Its Application 3, 375–392.</w:t>
-      </w:r>
-      <w:r>
-        <w:t xml:space="preserve"> </w:t>
-      </w:r>
-      <w:hyperlink r:id="rId69">
-        <w:r>
-          <w:rPr>
-            <w:rStyle w:val="Hyperlink"/>
-          </w:rPr>
-          <w:t xml:space="preserve">https://doi.org/10.1146/annurev-statistics-011516-012958</w:t>
-        </w:r>
-      </w:hyperlink>
-    </w:p>
-    <w:bookmarkEnd w:id="70"/>
-    <w:bookmarkStart w:id="72" w:name="ref-chawla2002"/>
-    <w:p>
-      <w:pPr>
-        <w:pStyle w:val="Bibliography"/>
-      </w:pPr>
-      <w:r>
-        <w:t xml:space="preserve">Chawla, N.V., Bowyer, K.W., Hall, L.O., Kegelmeyer, W.P., 2002. SMOTE: Synthetic minority over-sampling technique. Journal of Artificial Intelligence Research 16, 321–357.</w:t>
-      </w:r>
-      <w:r>
-        <w:t xml:space="preserve"> </w:t>
-      </w:r>
-      <w:hyperlink r:id="rId71">
-        <w:r>
-          <w:rPr>
-            <w:rStyle w:val="Hyperlink"/>
-          </w:rPr>
-          <w:t xml:space="preserve">https://doi.org/10.1613/jair.953</w:t>
-        </w:r>
-      </w:hyperlink>
-    </w:p>
-    <w:bookmarkEnd w:id="72"/>
-    <w:bookmarkStart w:id="74" w:name="ref-conway2018"/>
-    <w:p>
-      <w:pPr>
-        <w:pStyle w:val="Bibliography"/>
-      </w:pPr>
-      <w:r>
-        <w:t xml:space="preserve">Conway, M.W., Salon, D., King, D.A., 2018. Trends in taxi use and the advent of ridehailing, 1995–2017: Evidence from the US national household travel survey. Urban Science 2, 79.</w:t>
-      </w:r>
-      <w:r>
-        <w:t xml:space="preserve"> </w:t>
-      </w:r>
-      <w:hyperlink r:id="rId73">
-        <w:r>
-          <w:rPr>
-            <w:rStyle w:val="Hyperlink"/>
-          </w:rPr>
-          <w:t xml:space="preserve">https://doi.org/10.3390/urbansci2030079</w:t>
-        </w:r>
-      </w:hyperlink>
-    </w:p>
-    <w:bookmarkEnd w:id="74"/>
-    <w:bookmarkStart w:id="76" w:name="ref-deka2019"/>
-    <w:p>
-      <w:pPr>
-        <w:pStyle w:val="Bibliography"/>
-      </w:pPr>
-      <w:r>
-        <w:t xml:space="preserve">Deka, D., Fei, D., 2019. A comparison of the personal and neighborhood characteristics associated with ridesourcing, transit use, and driving with NHTS data. Journal of Transport Geography 76, 24–33.</w:t>
-      </w:r>
-      <w:r>
-        <w:t xml:space="preserve"> </w:t>
-      </w:r>
-      <w:hyperlink r:id="rId75">
-        <w:r>
-          <w:rPr>
-            <w:rStyle w:val="Hyperlink"/>
-          </w:rPr>
-          <w:t xml:space="preserve">https://doi.org/10.1016/j.jtrangeo.2019.03.001</w:t>
-        </w:r>
-      </w:hyperlink>
-    </w:p>
-    <w:bookmarkEnd w:id="76"/>
-    <w:bookmarkStart w:id="78" w:name="ref-demircioglu2024"/>
-    <w:p>
-      <w:pPr>
-        <w:pStyle w:val="Bibliography"/>
-      </w:pPr>
-      <w:r>
-        <w:t xml:space="preserve">Demircioğlu, A., 2024. Applying oversampling before cross-validation will lead to high bias in radiomics. Scientific Reports 14, 11563.</w:t>
-      </w:r>
-      <w:r>
-        <w:t xml:space="preserve"> </w:t>
-      </w:r>
-      <w:hyperlink r:id="rId77">
-        <w:r>
-          <w:rPr>
-            <w:rStyle w:val="Hyperlink"/>
-          </w:rPr>
-          <w:t xml:space="preserve">https://doi.org/10.1038/s41598-024-62585-z</w:t>
-        </w:r>
-      </w:hyperlink>
-    </w:p>
-    <w:bookmarkEnd w:id="78"/>
-    <w:bookmarkStart w:id="80" w:name="ref-fu2020"/>
-    <w:p>
-      <w:pPr>
-        <w:pStyle w:val="Bibliography"/>
-      </w:pPr>
-      <w:r>
-        <w:t xml:space="preserve">Fu, Z., Liu, W., Zhu, J., Yuan, Y., 2020. Trip chain simulation of electric vehicles based on NHTS data. 2020 12th IEEE PES Asia-Pacific Power and Energy Engineering Conference (APPEEC) 1–6.</w:t>
-      </w:r>
-      <w:r>
-        <w:t xml:space="preserve"> </w:t>
-      </w:r>
-      <w:hyperlink r:id="rId79">
-        <w:r>
-          <w:rPr>
-            <w:rStyle w:val="Hyperlink"/>
-          </w:rPr>
-          <w:t xml:space="preserve">https://doi.org/10.1109/appeec48164.2020.9220726</w:t>
-        </w:r>
-      </w:hyperlink>
-    </w:p>
-    <w:bookmarkEnd w:id="80"/>
-    <w:bookmarkStart w:id="82" w:name="ref-gard2023"/>
-    <w:p>
-      <w:pPr>
-        <w:pStyle w:val="Bibliography"/>
-      </w:pPr>
-      <w:r>
-        <w:t xml:space="preserve">Gard, A.M., Hyde, L.W., Heeringa, S.G., West, B.T., Mitchell, C., 2023. Why weight? Analytic approaches for large-scale population neuroscience data. Developmental Cognitive Neuroscience 59, 101196.</w:t>
-      </w:r>
-      <w:r>
-        <w:t xml:space="preserve"> </w:t>
-      </w:r>
-      <w:hyperlink r:id="rId81">
-        <w:r>
-          <w:rPr>
-            <w:rStyle w:val="Hyperlink"/>
-          </w:rPr>
-          <w:t xml:space="preserve">https://doi.org/10.1016/j.dcn.2023.101196</w:t>
-        </w:r>
-      </w:hyperlink>
-    </w:p>
-    <w:bookmarkEnd w:id="82"/>
-    <w:bookmarkStart w:id="84" w:name="ref-gelman2007"/>
-    <w:p>
-      <w:pPr>
-        <w:pStyle w:val="Bibliography"/>
-      </w:pPr>
-      <w:r>
-        <w:t xml:space="preserve">Gelman, A., 2007. Struggles with survey weighting and regression modeling. Statistical Science 22, 153–164.</w:t>
-      </w:r>
-      <w:r>
-        <w:t xml:space="preserve"> </w:t>
-      </w:r>
-      <w:hyperlink r:id="rId83">
-        <w:r>
-          <w:rPr>
-            <w:rStyle w:val="Hyperlink"/>
-          </w:rPr>
-          <w:t xml:space="preserve">https://doi.org/10.1214/088342306000000691</w:t>
-        </w:r>
-      </w:hyperlink>
-    </w:p>
-    <w:bookmarkEnd w:id="84"/>
-    <w:bookmarkStart w:id="86" w:name="ref-hagenauer2017"/>
-    <w:p>
-      <w:pPr>
-        <w:pStyle w:val="Bibliography"/>
-      </w:pPr>
-      <w:r>
-        <w:t xml:space="preserve">Hagenauer, J., Helbich, M., 2017. A comparative study of machine learning classifiers for modeling travel mode choice. Expert Systems with Applications 78, 273–282.</w:t>
-      </w:r>
-      <w:r>
-        <w:t xml:space="preserve"> </w:t>
-      </w:r>
-      <w:hyperlink r:id="rId85">
-        <w:r>
-          <w:rPr>
-            <w:rStyle w:val="Hyperlink"/>
-          </w:rPr>
-          <w:t xml:space="preserve">https://doi.org/10.1016/j.eswa.2017.01.057</w:t>
-        </w:r>
-      </w:hyperlink>
-    </w:p>
-    <w:bookmarkEnd w:id="86"/>
-    <w:bookmarkStart w:id="88" w:name="ref-hardwicke2021"/>
-    <w:p>
-      <w:pPr>
-        <w:pStyle w:val="Bibliography"/>
-      </w:pPr>
-      <w:r>
-        <w:t xml:space="preserve">Hardwicke, T.E., Bohn, M., MacDonald, K., Hembacher, E., Nuijten, M.B., Peloquin, B.N., deMayo, B.E., Long, B., Yoon, E.J., Frank, M.C.</w:t>
-      </w:r>
-      <w:r>
-        <w:t xml:space="preserve">, 2021. Analytic reproducibility in articles receiving open data badges at the journal psychological science : An observational study. Royal Society Open Science 8, 201494.</w:t>
-      </w:r>
-      <w:r>
-        <w:t xml:space="preserve"> </w:t>
-      </w:r>
-      <w:hyperlink r:id="rId87">
-        <w:r>
-          <w:rPr>
-            <w:rStyle w:val="Hyperlink"/>
-          </w:rPr>
-          <w:t xml:space="preserve">https://doi.org/10.1098/rsos.201494</w:t>
-        </w:r>
-      </w:hyperlink>
-    </w:p>
-    <w:bookmarkEnd w:id="88"/>
-    <w:bookmarkStart w:id="90" w:name="ref-horl2021"/>
-    <w:p>
-      <w:pPr>
-        <w:pStyle w:val="Bibliography"/>
-      </w:pPr>
-      <w:r>
-        <w:t xml:space="preserve">Hörl, S., Balac, M., 2021. Synthetic population and travel demand for paris and île-de-france based on open and publicly available data. Transportation Research Part C: Emerging Technologies 130, 103291.</w:t>
-      </w:r>
-      <w:r>
-        <w:t xml:space="preserve"> </w:t>
-      </w:r>
-      <w:hyperlink r:id="rId89">
-        <w:r>
-          <w:rPr>
-            <w:rStyle w:val="Hyperlink"/>
-          </w:rPr>
-          <w:t xml:space="preserve">https://doi.org/10.1016/j.trc.2021.103291</w:t>
-        </w:r>
-      </w:hyperlink>
-    </w:p>
-    <w:bookmarkEnd w:id="90"/>
-    <w:bookmarkStart w:id="92" w:name="ref-jia2019"/>
-    <w:p>
-      <w:pPr>
-        <w:pStyle w:val="Bibliography"/>
-      </w:pPr>
-      <w:r>
-        <w:t xml:space="preserve">Jia, J., 2019. Analysis of alternative fuel vehicle (AFV) adoption utilizing different machine learning methods: A case study of 2017 NHTS. IEEE Access 7, 112726–112735.</w:t>
-      </w:r>
-      <w:r>
-        <w:t xml:space="preserve"> </w:t>
-      </w:r>
-      <w:hyperlink r:id="rId91">
-        <w:r>
-          <w:rPr>
-            <w:rStyle w:val="Hyperlink"/>
-          </w:rPr>
-          <w:t xml:space="preserve">https://doi.org/10.1109/ACCESS.2019.2934780</w:t>
-        </w:r>
-      </w:hyperlink>
-    </w:p>
-    <w:bookmarkEnd w:id="92"/>
-    <w:bookmarkStart w:id="94" w:name="ref-jia2020"/>
-    <w:p>
-      <w:pPr>
-        <w:pStyle w:val="Bibliography"/>
-      </w:pPr>
-      <w:r>
-        <w:t xml:space="preserve">Jia, J., Shi, B., Che, F., Zhang, H., 2020. Predicting the regional adoption of electric vehicle (EV) with comprehensive models. IEEE Access 8, 147275–147285.</w:t>
-      </w:r>
-      <w:r>
-        <w:t xml:space="preserve"> </w:t>
-      </w:r>
-      <w:hyperlink r:id="rId93">
-        <w:r>
-          <w:rPr>
-            <w:rStyle w:val="Hyperlink"/>
-          </w:rPr>
-          <w:t xml:space="preserve">https://doi.org/10.1109/ACCESS.2020.3014851</w:t>
-        </w:r>
-      </w:hyperlink>
-    </w:p>
-    <w:bookmarkEnd w:id="94"/>
-    <w:bookmarkStart w:id="96" w:name="ref-jiao2020"/>
-    <w:p>
-      <w:pPr>
-        <w:pStyle w:val="Bibliography"/>
-      </w:pPr>
-      <w:r>
-        <w:t xml:space="preserve">Jiao, J., Bischak, C., Hyden, S., 2020. The impact of shared mobility on trip generation behavior in the US: Findings from the 2017 national household travel survey. Travel Behaviour and Society 19, 1–7.</w:t>
-      </w:r>
-      <w:r>
-        <w:t xml:space="preserve"> </w:t>
-      </w:r>
-      <w:hyperlink r:id="rId95">
-        <w:r>
-          <w:rPr>
-            <w:rStyle w:val="Hyperlink"/>
-          </w:rPr>
-          <w:t xml:space="preserve">https://doi.org/10.1016/j.tbs.2019.11.001</w:t>
-        </w:r>
-      </w:hyperlink>
-    </w:p>
-    <w:bookmarkEnd w:id="96"/>
-    <w:bookmarkStart w:id="98" w:name="ref-kapoor2024reforms"/>
-    <w:p>
-      <w:pPr>
-        <w:pStyle w:val="Bibliography"/>
-      </w:pPr>
-      <w:r>
-        <w:t xml:space="preserve">Kapoor, S., Cantrell, E.M., Peng, K., Pham, T.H., Bail, C.A., Gundersen, O.E., Hofman, J.M., Hullman, J., Lones, M.A., Malik, M.M., Nanayakkara, P., Poldrack, R.A., Raji, I.D., Roberts, M., Salganik, M.J., Serra-Garcia, M., Stewart, B.M., Vandewiele, G., Narayanan, A., 2024. REFORMS: Consensus-based recommendations for machine-learning-based science. Science Advances 10, eadk3452.</w:t>
-      </w:r>
-      <w:r>
-        <w:t xml:space="preserve"> </w:t>
-      </w:r>
-      <w:hyperlink r:id="rId97">
-        <w:r>
-          <w:rPr>
-            <w:rStyle w:val="Hyperlink"/>
-          </w:rPr>
-          <w:t xml:space="preserve">https://doi.org/10.1126/sciadv.adk3452</w:t>
-        </w:r>
-      </w:hyperlink>
-    </w:p>
-    <w:bookmarkEnd w:id="98"/>
-    <w:bookmarkStart w:id="100" w:name="ref-kapoor2023"/>
-    <w:p>
-      <w:pPr>
-        <w:pStyle w:val="Bibliography"/>
-      </w:pPr>
-      <w:r>
-        <w:t xml:space="preserve">Kapoor, S., Narayanan, A., 2023. Leakage and the reproducibility crisis in machine-learning-based science. Patterns 4, 100804.</w:t>
-      </w:r>
-      <w:r>
-        <w:t xml:space="preserve"> </w:t>
-      </w:r>
-      <w:hyperlink r:id="rId99">
-        <w:r>
-          <w:rPr>
-            <w:rStyle w:val="Hyperlink"/>
-          </w:rPr>
-          <w:t xml:space="preserve">https://doi.org/10.1016/j.patter.2023.100804</w:t>
-        </w:r>
-      </w:hyperlink>
-    </w:p>
-    <w:bookmarkEnd w:id="100"/>
-    <w:bookmarkStart w:id="102" w:name="ref-krizek2019"/>
-    <w:p>
-      <w:pPr>
-        <w:pStyle w:val="Bibliography"/>
-      </w:pPr>
-      <w:r>
-        <w:t xml:space="preserve">Krizek, K.J., McGuckin, N., 2019. Shedding NHTS light on the use of</w:t>
-      </w:r>
-      <w:r>
-        <w:t xml:space="preserve"> </w:t>
-      </w:r>
-      <w:r>
-        <w:t xml:space="preserve">“little vehicles”</w:t>
-      </w:r>
-      <w:r>
-        <w:t xml:space="preserve"> </w:t>
-      </w:r>
-      <w:r>
-        <w:t xml:space="preserve">in urban areas. Transport Findings.</w:t>
-      </w:r>
-      <w:r>
-        <w:t xml:space="preserve"> </w:t>
-      </w:r>
-      <w:hyperlink r:id="rId101">
-        <w:r>
-          <w:rPr>
-            <w:rStyle w:val="Hyperlink"/>
-          </w:rPr>
-          <w:t xml:space="preserve">https://doi.org/10.32866/10777</w:t>
-        </w:r>
-      </w:hyperlink>
-    </w:p>
-    <w:bookmarkEnd w:id="102"/>
-    <w:bookmarkStart w:id="104" w:name="ref-lambert1992"/>
-    <w:p>
-      <w:pPr>
-        <w:pStyle w:val="Bibliography"/>
-      </w:pPr>
-      <w:r>
-        <w:t xml:space="preserve">Lambert, D., 1992. Zero-inflated poisson regression, with an application to defects in manufacturing. Technometrics 34, 1.</w:t>
-      </w:r>
-      <w:r>
-        <w:t xml:space="preserve"> </w:t>
-      </w:r>
-      <w:hyperlink r:id="rId103">
-        <w:r>
-          <w:rPr>
-            <w:rStyle w:val="Hyperlink"/>
-          </w:rPr>
-          <w:t xml:space="preserve">https://doi.org/10.2307/1269547</w:t>
-        </w:r>
-      </w:hyperlink>
-    </w:p>
-    <w:bookmarkEnd w:id="104"/>
-    <w:bookmarkStart w:id="106" w:name="ref-lidbe2021"/>
-    <w:p>
-      <w:pPr>
-        <w:pStyle w:val="Bibliography"/>
-      </w:pPr>
-      <w:r>
-        <w:t xml:space="preserve">Lidbe, A., Adanu, E.K., Penmetsa, P., Jones, S., 2021. Changes in the travel patterns of older americans with medical conditions: A comparison of 2001 and 2017 NHTS data. Transportation Research Interdisciplinary Perspectives 11, 100463.</w:t>
-      </w:r>
-      <w:r>
-        <w:t xml:space="preserve"> </w:t>
-      </w:r>
-      <w:hyperlink r:id="rId105">
-        <w:r>
-          <w:rPr>
-            <w:rStyle w:val="Hyperlink"/>
-          </w:rPr>
-          <w:t xml:space="preserve">https://doi.org/10.1016/j.trip.2021.100463</w:t>
-        </w:r>
-      </w:hyperlink>
-    </w:p>
-    <w:bookmarkEnd w:id="106"/>
-    <w:bookmarkStart w:id="108" w:name="ref-lumley2004"/>
-    <w:p>
-      <w:pPr>
-        <w:pStyle w:val="Bibliography"/>
-      </w:pPr>
-      <w:r>
-        <w:t xml:space="preserve">Lumley, T., 2004. Analysis of complex survey samples. Journal of Statistical Software 9.</w:t>
-      </w:r>
-      <w:r>
-        <w:t xml:space="preserve"> </w:t>
-      </w:r>
-      <w:hyperlink r:id="rId107">
-        <w:r>
-          <w:rPr>
-            <w:rStyle w:val="Hyperlink"/>
-          </w:rPr>
-          <w:t xml:space="preserve">https://doi.org/10.18637/jss.v009.i08</w:t>
-        </w:r>
-      </w:hyperlink>
-    </w:p>
-    <w:bookmarkEnd w:id="108"/>
-    <w:bookmarkStart w:id="110" w:name="ref-martinbaos2023"/>
-    <w:p>
-      <w:pPr>
-        <w:pStyle w:val="Bibliography"/>
-      </w:pPr>
-      <w:r>
-        <w:t xml:space="preserve">Martín-Baos, J.Á., López-Gómez, J.A., Rodriguez-Benitez, L., Hillel, T., García-Ródenas, R., 2023. A prediction and behavioural analysis of machine learning methods for modelling travel mode choice. Transportation Research Part C: Emerging Technologies 156, 104318.</w:t>
-      </w:r>
-      <w:r>
-        <w:t xml:space="preserve"> </w:t>
-      </w:r>
-      <w:hyperlink r:id="rId109">
-        <w:r>
-          <w:rPr>
-            <w:rStyle w:val="Hyperlink"/>
-          </w:rPr>
-          <w:t xml:space="preserve">https://doi.org/10.1016/j.trc.2023.104318</w:t>
-        </w:r>
-      </w:hyperlink>
-    </w:p>
-    <w:bookmarkEnd w:id="110"/>
-    <w:bookmarkStart w:id="112" w:name="ref-naseralavi2025"/>
-    <w:p>
-      <w:pPr>
-        <w:pStyle w:val="Bibliography"/>
-      </w:pPr>
-      <w:r>
-        <w:t xml:space="preserve">Naseralavi, S., Soltanirad, M., Ranjbar, E., Lucero, M., Gorzin, F., Hakiminejad, Y., Azimi, S., Baghersad, M., Mazaheri, A., 2025. Machine learning modeling of household trip generation by state using NHTS data. Urban Science 9, 353.</w:t>
-      </w:r>
-      <w:r>
-        <w:t xml:space="preserve"> </w:t>
-      </w:r>
-      <w:hyperlink r:id="rId111">
-        <w:r>
-          <w:rPr>
-            <w:rStyle w:val="Hyperlink"/>
-          </w:rPr>
-          <w:t xml:space="preserve">https://doi.org/10.3390/urbansci9090353</w:t>
-        </w:r>
-      </w:hyperlink>
-    </w:p>
-    <w:bookmarkEnd w:id="112"/>
-    <w:bookmarkStart w:id="114" w:name="ref-peng2011"/>
-    <w:p>
-      <w:pPr>
-        <w:pStyle w:val="Bibliography"/>
-      </w:pPr>
-      <w:r>
-        <w:t xml:space="preserve">Peng, R.D., 2011. Reproducible research in computational science. Science 334, 1226–1227.</w:t>
-      </w:r>
-      <w:r>
-        <w:t xml:space="preserve"> </w:t>
-      </w:r>
-      <w:hyperlink r:id="rId113">
-        <w:r>
-          <w:rPr>
-            <w:rStyle w:val="Hyperlink"/>
-          </w:rPr>
-          <w:t xml:space="preserve">https://doi.org/10.1126/science.1213847</w:t>
-        </w:r>
-      </w:hyperlink>
-    </w:p>
-    <w:bookmarkEnd w:id="114"/>
-    <w:bookmarkStart w:id="116" w:name="ref-ploton2020"/>
-    <w:p>
-      <w:pPr>
-        <w:pStyle w:val="Bibliography"/>
-      </w:pPr>
-      <w:r>
-        <w:t xml:space="preserve">Ploton, P., Mortier, F., Réjou-Méchain, M., Barbier, N., Picard, N., Rossi, V., Dormann, C., Cornu, G., Viennois, G., Bayol, N., Lyapustin, A., Gourlet-Fleury, S., Pélissier, R., 2020. Spatial validation reveals poor predictive performance of large-scale ecological mapping models. Nature Communications 11, 4540.</w:t>
-      </w:r>
-      <w:r>
-        <w:t xml:space="preserve"> </w:t>
-      </w:r>
-      <w:hyperlink r:id="rId115">
-        <w:r>
-          <w:rPr>
-            <w:rStyle w:val="Hyperlink"/>
-          </w:rPr>
-          <w:t xml:space="preserve">https://doi.org/10.1038/s41467-020-18321-y</w:t>
-        </w:r>
-      </w:hyperlink>
-    </w:p>
-    <w:bookmarkEnd w:id="116"/>
-    <w:bookmarkStart w:id="118" w:name="ref-quinn2016"/>
-    <w:p>
-      <w:pPr>
-        <w:pStyle w:val="Bibliography"/>
-      </w:pPr>
-      <w:r>
-        <w:t xml:space="preserve">Quinn, T.D., Jakicic, J.M., Fertman, C.I., Barone Gibbs, B., 2016. Demographic factors, workplace factors and active transportation use in the USA: A secondary analysis of 2009 NHTS data. Journal of Epidemiology and Community Health 71, 480–486.</w:t>
-      </w:r>
-      <w:r>
-        <w:t xml:space="preserve"> </w:t>
-      </w:r>
-      <w:hyperlink r:id="rId117">
-        <w:r>
-          <w:rPr>
-            <w:rStyle w:val="Hyperlink"/>
-          </w:rPr>
-          <w:t xml:space="preserve">https://doi.org/10.1136/jech-2016-207820</w:t>
-        </w:r>
-      </w:hyperlink>
-    </w:p>
-    <w:bookmarkEnd w:id="118"/>
-    <w:bookmarkStart w:id="120" w:name="ref-roberts2017"/>
-    <w:p>
-      <w:pPr>
-        <w:pStyle w:val="Bibliography"/>
-      </w:pPr>
-      <w:r>
-        <w:t xml:space="preserve">Roberts, D.R., Bahn, V., Ciuti, S., Boyce, M.S., Elith, J., Guillera‐Arroita, G., Hauenstein, S., Lahoz‐Monfort, J.J., Schröder, B., Thuiller, W., Warton, D.I., Wintle, B.A., Hartig, F., Dormann, C.F., 2017. Cross‐validation strategies for data with temporal, spatial, hierarchical, or phylogenetic structure. Ecography 40, 913–929.</w:t>
-      </w:r>
-      <w:r>
-        <w:t xml:space="preserve"> </w:t>
-      </w:r>
-      <w:hyperlink r:id="rId119">
-        <w:r>
-          <w:rPr>
-            <w:rStyle w:val="Hyperlink"/>
-          </w:rPr>
-          <w:t xml:space="preserve">https://doi.org/10.1111/ecog.02881</w:t>
-        </w:r>
-      </w:hyperlink>
-    </w:p>
-    <w:bookmarkEnd w:id="120"/>
-    <w:bookmarkStart w:id="122" w:name="ref-rosenblatt2024"/>
-    <w:p>
-      <w:pPr>
-        <w:pStyle w:val="Bibliography"/>
-      </w:pPr>
-      <w:r>
-        <w:t xml:space="preserve">Rosenblatt, M., Tejavibulya, L., Jiang, R., Noble, S., Scheinost, D., 2024. Data leakage inflates prediction performance in connectome-based machine learning models. Nature Communications 15, 1829.</w:t>
-      </w:r>
-      <w:r>
-        <w:t xml:space="preserve"> </w:t>
-      </w:r>
-      <w:hyperlink r:id="rId121">
-        <w:r>
-          <w:rPr>
-            <w:rStyle w:val="Hyperlink"/>
-          </w:rPr>
-          <w:t xml:space="preserve">https://doi.org/10.1038/s41467-024-46150-w</w:t>
-        </w:r>
-      </w:hyperlink>
-    </w:p>
-    <w:bookmarkEnd w:id="122"/>
-    <w:bookmarkStart w:id="124" w:name="ref-rust1996"/>
-    <w:p>
-      <w:pPr>
-        <w:pStyle w:val="Bibliography"/>
-      </w:pPr>
-      <w:r>
-        <w:t xml:space="preserve">Rust, K., Rao, J., 1996. Variance estimation for complex surveys using replication techniques. Statistical Methods in Medical Research 5, 283–310.</w:t>
-      </w:r>
-      <w:r>
-        <w:t xml:space="preserve"> </w:t>
-      </w:r>
-      <w:hyperlink r:id="rId123">
-        <w:r>
-          <w:rPr>
-            <w:rStyle w:val="Hyperlink"/>
-          </w:rPr>
-          <w:t xml:space="preserve">https://doi.org/10.1177/096228029600500305</w:t>
-        </w:r>
-      </w:hyperlink>
-    </w:p>
-    <w:bookmarkEnd w:id="124"/>
-    <w:bookmarkStart w:id="126" w:name="ref-sabouri2020"/>
-    <w:p>
-      <w:pPr>
-        <w:pStyle w:val="Bibliography"/>
-      </w:pPr>
-      <w:r>
-        <w:t xml:space="preserve">Sabouri, S., Brewer, S., Ewing, R., 2020. Exploring the relationship between ride-sourcing services and vehicle ownership, using both inferential and machine learning approaches. Landscape and Urban Planning 198, 103797.</w:t>
-      </w:r>
-      <w:r>
-        <w:t xml:space="preserve"> </w:t>
-      </w:r>
-      <w:hyperlink r:id="rId125">
-        <w:r>
-          <w:rPr>
-            <w:rStyle w:val="Hyperlink"/>
-          </w:rPr>
-          <w:t xml:space="preserve">https://doi.org/10.1016/j.landurbplan.2020.103797</w:t>
-        </w:r>
-      </w:hyperlink>
-    </w:p>
-    <w:bookmarkEnd w:id="126"/>
-    <w:bookmarkStart w:id="128" w:name="ref-sadeghvaziri2020"/>
-    <w:p>
-      <w:pPr>
-        <w:pStyle w:val="Bibliography"/>
-      </w:pPr>
-      <w:r>
-        <w:t xml:space="preserve">Sadeghvaziri, E., Tawfik, A., 2020. Using the 2017 national household travel survey data to explore the elderly’s travel patterns. International Conference on Transportation and Development 2020 86–94.</w:t>
-      </w:r>
-      <w:r>
-        <w:t xml:space="preserve"> </w:t>
-      </w:r>
-      <w:hyperlink r:id="rId127">
-        <w:r>
-          <w:rPr>
-            <w:rStyle w:val="Hyperlink"/>
-          </w:rPr>
-          <w:t xml:space="preserve">https://doi.org/10.1061/9780784483169.008</w:t>
-        </w:r>
-      </w:hyperlink>
-    </w:p>
-    <w:bookmarkEnd w:id="128"/>
-    <w:bookmarkStart w:id="130" w:name="ref-schweinsberg2021"/>
-    <w:p>
-      <w:pPr>
-        <w:pStyle w:val="Bibliography"/>
-      </w:pPr>
-      <w:r>
-        <w:t xml:space="preserve">Schweinsberg, M., Feldman, M., Staub, N., Akker, O.R. van den, Aert, R.C.M. van, Assen, M.A.L.M. van, Liu, Y., Althoff, T., Heer, J., Kale, A., Mohamed, Z., Amireh, H., Venkatesh Prasad, V., Bernstein, A., Robinson, E., Snellman, K., Amy Sommer, S., Otner, S.M.G., Robinson, D., Madan, N., Silberzahn, R., Goldstein, P., Tierney, W., Murase, T., Mandl, B., Viganola, D., Strobl, C., Schaumans, C.B.C., Kelchtermans, S., Naseeb, C., Mason Garrison, S., Yarkoni, T., Richard Chan, C.S., Adie, P., Alaburda, P., Albers, C., Alspaugh, S., Alstott, J., Nelson, A.A., Ariño de la Rubia, E., 2021. Same data, different conclusions: Radical dispersion in empirical results when independent analysts operationalize and test the same hypothesis. Organizational Behavior and Human Decision Processes 165, 228–249.</w:t>
-      </w:r>
-      <w:r>
-        <w:t xml:space="preserve"> </w:t>
-      </w:r>
-      <w:hyperlink r:id="rId129">
-        <w:r>
-          <w:rPr>
-            <w:rStyle w:val="Hyperlink"/>
-          </w:rPr>
-          <w:t xml:space="preserve">https://doi.org/10.1016/j.obhdp.2021.02.003</w:t>
-        </w:r>
-      </w:hyperlink>
-    </w:p>
-    <w:bookmarkEnd w:id="130"/>
-    <w:bookmarkStart w:id="132" w:name="ref-shirgaokar2021"/>
-    <w:p>
-      <w:pPr>
-        <w:pStyle w:val="Bibliography"/>
-      </w:pPr>
-      <w:r>
-        <w:t xml:space="preserve">Shirgaokar, M., Nobler, E., 2021. Differences in daily trips between immigrants and US-born individuals: Implications for social integration. Transport Policy 105, 103–114.</w:t>
-      </w:r>
-      <w:r>
-        <w:t xml:space="preserve"> </w:t>
-      </w:r>
-      <w:hyperlink r:id="rId131">
-        <w:r>
-          <w:rPr>
-            <w:rStyle w:val="Hyperlink"/>
-          </w:rPr>
-          <w:t xml:space="preserve">https://doi.org/10.1016/j.tranpol.2021.03.008</w:t>
-        </w:r>
-      </w:hyperlink>
-    </w:p>
-    <w:bookmarkEnd w:id="132"/>
-    <w:bookmarkStart w:id="134" w:name="ref-silberzahn2018"/>
-    <w:p>
-      <w:pPr>
-        <w:pStyle w:val="Bibliography"/>
-      </w:pPr>
-      <w:r>
-        <w:t xml:space="preserve">Silberzahn, R., Uhlmann, E.L., Martin, D.P., Anselmi, P., Aust, F., Awtrey, E., Bahník, Š., Bai, F., Bannard, C., Bonnier, E., Carlsson, R., Cheung, F., Christensen, G., Clay, R., Craig, M.A., Dalla Rosa, A., Dam, L., Evans, M.H., Flores Cervantes, I., Fong, N., Gamez-Djokic, M., Glenz, A., Gordon-McKeon, S., Heaton, T.J., Hederos, K., Heene, M., Hofelich Mohr, A.J., Högden, F., Hui, K., Johannesson, M., Kalodimos, J., Kaszubowski, E., Kennedy, D.M., Lei, R., Lindsay, T.A., Liverani, S., Madan, C.R., Molden, D., Molleman, E., Morey, R.D., 2018. Many analysts, one data set: Making transparent how variations in analytic choices affect results. Advances in Methods and Practices in Psychological Science 1, 337–356.</w:t>
-      </w:r>
-      <w:r>
-        <w:t xml:space="preserve"> </w:t>
-      </w:r>
-      <w:hyperlink r:id="rId133">
-        <w:r>
-          <w:rPr>
-            <w:rStyle w:val="Hyperlink"/>
-          </w:rPr>
-          <w:t xml:space="preserve">https://doi.org/10.1177/2515245917747646</w:t>
-        </w:r>
-      </w:hyperlink>
-    </w:p>
-    <w:bookmarkEnd w:id="134"/>
-    <w:bookmarkStart w:id="136" w:name="ref-simonsohn2020"/>
-    <w:p>
-      <w:pPr>
-        <w:pStyle w:val="Bibliography"/>
-      </w:pPr>
-      <w:r>
-        <w:t xml:space="preserve">Simonsohn, U., Simmons, J.P., Nelson, L.D., 2020. Specification curve analysis. Nature Human Behaviour 4, 1208–1214.</w:t>
-      </w:r>
-      <w:r>
-        <w:t xml:space="preserve"> </w:t>
-      </w:r>
-      <w:hyperlink r:id="rId135">
-        <w:r>
-          <w:rPr>
-            <w:rStyle w:val="Hyperlink"/>
-          </w:rPr>
-          <w:t xml:space="preserve">https://doi.org/10.1038/s41562-020-0912-z</w:t>
-        </w:r>
-      </w:hyperlink>
-    </w:p>
-    <w:bookmarkEnd w:id="136"/>
-    <w:bookmarkStart w:id="138" w:name="ref-solon2015"/>
-    <w:p>
-      <w:pPr>
-        <w:pStyle w:val="Bibliography"/>
-      </w:pPr>
-      <w:r>
-        <w:t xml:space="preserve">Solon, G., Haider, S.J., Wooldridge, J.M., 2015. What are we weighting for? Journal of Human Resources 50, 301–316.</w:t>
-      </w:r>
-      <w:r>
-        <w:t xml:space="preserve"> </w:t>
-      </w:r>
-      <w:hyperlink r:id="rId137">
-        <w:r>
-          <w:rPr>
-            <w:rStyle w:val="Hyperlink"/>
-          </w:rPr>
-          <w:t xml:space="preserve">https://doi.org/10.3368/jhr.50.2.301</w:t>
-        </w:r>
-      </w:hyperlink>
-    </w:p>
-    <w:bookmarkEnd w:id="138"/>
-    <w:bookmarkStart w:id="140" w:name="ref-steegen2016"/>
-    <w:p>
-      <w:pPr>
-        <w:pStyle w:val="Bibliography"/>
-      </w:pPr>
-      <w:r>
-        <w:t xml:space="preserve">Steegen, S., Tuerlinckx, F., Gelman, A., Vanpaemel, W., 2016. Increasing transparency through a multiverse analysis. Perspectives on Psychological Science 11, 702–712.</w:t>
-      </w:r>
-      <w:r>
-        <w:t xml:space="preserve"> </w:t>
-      </w:r>
-      <w:hyperlink r:id="rId139">
-        <w:r>
-          <w:rPr>
-            <w:rStyle w:val="Hyperlink"/>
-          </w:rPr>
-          <w:t xml:space="preserve">https://doi.org/10.1177/1745691616658637</w:t>
-        </w:r>
-      </w:hyperlink>
-    </w:p>
-    <w:bookmarkEnd w:id="140"/>
-    <w:bookmarkStart w:id="142" w:name="ref-stodden2018"/>
-    <w:p>
-      <w:pPr>
-        <w:pStyle w:val="Bibliography"/>
-      </w:pPr>
-      <w:r>
-        <w:t xml:space="preserve">Stodden, V., Seiler, J., Ma, Z., 2018. An empirical analysis of journal policy effectiveness for computational reproducibility. Proceedings of the National Academy of Sciences 115, 2584–2589.</w:t>
-      </w:r>
-      <w:r>
-        <w:t xml:space="preserve"> </w:t>
-      </w:r>
-      <w:hyperlink r:id="rId141">
-        <w:r>
-          <w:rPr>
-            <w:rStyle w:val="Hyperlink"/>
-          </w:rPr>
-          <w:t xml:space="preserve">https://doi.org/10.1073/pnas.1708290115</w:t>
-        </w:r>
-      </w:hyperlink>
-    </w:p>
-    <w:bookmarkEnd w:id="142"/>
-    <w:bookmarkStart w:id="144" w:name="ref-su2021"/>
-    <w:p>
-      <w:pPr>
-        <w:pStyle w:val="Bibliography"/>
-      </w:pPr>
-      <w:r>
-        <w:t xml:space="preserve">Su, R., Xiao, J., McBride, E.C., Goulias, K.G., 2021. Understanding senior’s daily mobility patterns in california using human mobility motifs. Journal of Transport Geography 94, 103117.</w:t>
-      </w:r>
-      <w:r>
-        <w:t xml:space="preserve"> </w:t>
-      </w:r>
-      <w:hyperlink r:id="rId143">
-        <w:r>
-          <w:rPr>
-            <w:rStyle w:val="Hyperlink"/>
-          </w:rPr>
-          <w:t xml:space="preserve">https://doi.org/10.1016/j.jtrangeo.2021.103117</w:t>
-        </w:r>
-      </w:hyperlink>
-    </w:p>
-    <w:bookmarkEnd w:id="144"/>
-    <w:bookmarkStart w:id="146" w:name="ref-vabalas2019"/>
-    <w:p>
-      <w:pPr>
-        <w:pStyle w:val="Bibliography"/>
-      </w:pPr>
-      <w:r>
-        <w:t xml:space="preserve">Vabalas, A., Gowen, E., Poliakoff, E., Casson, A.J., 2019. Machine learning algorithm validation with a limited sample size. PLOS ONE 14, e0224365.</w:t>
-      </w:r>
-      <w:r>
-        <w:t xml:space="preserve"> </w:t>
-      </w:r>
-      <w:hyperlink r:id="rId145">
-        <w:r>
-          <w:rPr>
-            <w:rStyle w:val="Hyperlink"/>
-          </w:rPr>
-          <w:t xml:space="preserve">https://doi.org/10.1371/journal.pone.0224365</w:t>
-        </w:r>
-      </w:hyperlink>
-    </w:p>
-    <w:bookmarkEnd w:id="146"/>
-    <w:bookmarkStart w:id="148" w:name="ref-wang2024benchmark"/>
-    <w:p>
-      <w:pPr>
-        <w:pStyle w:val="Bibliography"/>
-      </w:pPr>
-      <w:r>
-        <w:t xml:space="preserve">Wang, S., Mo, B., Zheng, Y., Hess, S., Zhao, J., 2024. Comparing hundreds of machine learning and discrete choice models for travel demand modeling: An empirical benchmark. Transportation Research Part B: Methodological 190, 103061.</w:t>
-      </w:r>
-      <w:r>
-        <w:t xml:space="preserve"> </w:t>
-      </w:r>
-      <w:hyperlink r:id="rId147">
-        <w:r>
-          <w:rPr>
-            <w:rStyle w:val="Hyperlink"/>
-          </w:rPr>
-          <w:t xml:space="preserve">https://doi.org/10.1016/j.trb.2024.103061</w:t>
-        </w:r>
-      </w:hyperlink>
-    </w:p>
-    <w:bookmarkEnd w:id="148"/>
-    <w:bookmarkStart w:id="150" w:name="ref-wang2022nhts"/>
-    <w:p>
-      <w:pPr>
-        <w:pStyle w:val="Bibliography"/>
-      </w:pPr>
-      <w:r>
-        <w:t xml:space="preserve">Wang, X., Shaw, F.A., Mokhtarian, P.L., Watkins, K.E., 2022. ﻿Response willingness in consecutive travel surveys: An investigation based on the national household travel survey using a sample selection model. Transportation 50, 2339–2373.</w:t>
-      </w:r>
-      <w:r>
-        <w:t xml:space="preserve"> </w:t>
-      </w:r>
-      <w:hyperlink r:id="rId149">
-        <w:r>
-          <w:rPr>
-            <w:rStyle w:val="Hyperlink"/>
-          </w:rPr>
-          <w:t xml:space="preserve">https://doi.org/10.1007/s11116-022-10312-w</w:t>
-        </w:r>
-      </w:hyperlink>
-    </w:p>
-    <w:bookmarkEnd w:id="150"/>
-    <w:bookmarkStart w:id="152" w:name="ref-winship1994"/>
-    <w:p>
-      <w:pPr>
-        <w:pStyle w:val="Bibliography"/>
-      </w:pPr>
-      <w:r>
-        <w:t xml:space="preserve">Winship, C., Radbill, L., 1994. Sampling weights and regression analysis. Sociological Methods &amp; Research 23, 230–257.</w:t>
-      </w:r>
-      <w:r>
-        <w:t xml:space="preserve"> </w:t>
-      </w:r>
-      <w:hyperlink r:id="rId151">
-        <w:r>
-          <w:rPr>
-            <w:rStyle w:val="Hyperlink"/>
-          </w:rPr>
-          <w:t xml:space="preserve">https://doi.org/10.1177/0049124194023002004</w:t>
-        </w:r>
-      </w:hyperlink>
-    </w:p>
-    <w:bookmarkEnd w:id="152"/>
-    <w:bookmarkStart w:id="154" w:name="ref-wolter2007"/>
-    <w:p>
-      <w:pPr>
-        <w:pStyle w:val="Bibliography"/>
-      </w:pPr>
-      <w:r>
-        <w:t xml:space="preserve">Wolter, K.M., 2007. Introduction to variance estimation. Statistics for Social; Behavioral Sciences.</w:t>
-      </w:r>
-      <w:r>
-        <w:t xml:space="preserve"> </w:t>
-      </w:r>
-      <w:hyperlink r:id="rId153">
-        <w:r>
-          <w:rPr>
-            <w:rStyle w:val="Hyperlink"/>
-          </w:rPr>
-          <w:t xml:space="preserve">https://doi.org/10.1007/978-0-387-35099-8</w:t>
-        </w:r>
-      </w:hyperlink>
-    </w:p>
-    <w:bookmarkEnd w:id="154"/>
-    <w:bookmarkStart w:id="156" w:name="ref-wu2021"/>
-    <w:p>
-      <w:pPr>
-        <w:pStyle w:val="Bibliography"/>
-      </w:pPr>
-      <w:r>
-        <w:t xml:space="preserve">Wu, X., MacKenzie, D., 2021. Assessing the VMT effect of ridesourcing services in the US. Transportation Research Part D: Transport and Environment 94, 102816.</w:t>
-      </w:r>
-      <w:r>
-        <w:t xml:space="preserve"> </w:t>
-      </w:r>
-      <w:hyperlink r:id="rId155">
-        <w:r>
-          <w:rPr>
-            <w:rStyle w:val="Hyperlink"/>
-          </w:rPr>
-          <w:t xml:space="preserve">https://doi.org/10.1016/j.trd.2021.102816</w:t>
-        </w:r>
-      </w:hyperlink>
-    </w:p>
-    <w:bookmarkEnd w:id="156"/>
-    <w:bookmarkStart w:id="158" w:name="ref-xue2021"/>
-    <w:p>
-      <w:pPr>
-        <w:pStyle w:val="Bibliography"/>
-      </w:pPr>
-      <w:r>
-        <w:t xml:space="preserve">Xue, C., Wu, Q., Sun, M., Bai, P., Chen, Y., 2021. The interaction between e‐shopping and shopping trips: An analysis with 2017 NHTS. Complexity 2021, 8247158.</w:t>
-      </w:r>
-      <w:r>
-        <w:t xml:space="preserve"> </w:t>
-      </w:r>
-      <w:hyperlink r:id="rId157">
-        <w:r>
-          <w:rPr>
-            <w:rStyle w:val="Hyperlink"/>
-          </w:rPr>
-          <w:t xml:space="preserve">https://doi.org/10.1155/2021/8247158</w:t>
-        </w:r>
-      </w:hyperlink>
-    </w:p>
-    <w:bookmarkEnd w:id="158"/>
-    <w:bookmarkStart w:id="160" w:name="ref-yang2011"/>
-    <w:p>
-      <w:pPr>
-        <w:pStyle w:val="Bibliography"/>
-      </w:pPr>
-      <w:r>
-        <w:t xml:space="preserve">Yang, Y., Diez Roux, A.V., Bingham, C.R., 2011. Variability and seasonality of active transportation in USA: Evidence from the 2001 NHTS. International Journal of Behavioral Nutrition and Physical Activity 8, 96.</w:t>
-      </w:r>
-      <w:r>
-        <w:t xml:space="preserve"> </w:t>
-      </w:r>
-      <w:hyperlink r:id="rId159">
-        <w:r>
-          <w:rPr>
-            <w:rStyle w:val="Hyperlink"/>
-          </w:rPr>
-          <w:t xml:space="preserve">https://doi.org/10.1186/1479-5868-8-96</w:t>
-        </w:r>
-      </w:hyperlink>
-    </w:p>
-    <w:bookmarkEnd w:id="160"/>
-    <w:bookmarkStart w:id="162" w:name="ref-zeileis2008"/>
-    <w:p>
-      <w:pPr>
-        <w:pStyle w:val="Bibliography"/>
-      </w:pPr>
-      <w:r>
-        <w:t xml:space="preserve">Zeileis, A., Kleiber, C., Jackman, S., 2008. Regression models for count data in r. Journal of Statistical Software 27.</w:t>
-      </w:r>
-      <w:r>
-        <w:t xml:space="preserve"> </w:t>
-      </w:r>
-      <w:hyperlink r:id="rId161">
-        <w:r>
-          <w:rPr>
-            <w:rStyle w:val="Hyperlink"/>
-          </w:rPr>
-          <w:t xml:space="preserve">https://doi.org/10.18637/jss.v027.i08</w:t>
-        </w:r>
-      </w:hyperlink>
-    </w:p>
-    <w:bookmarkEnd w:id="162"/>
-    <w:bookmarkStart w:id="164" w:name="ref-zhang2018bike"/>
-    <w:p>
-      <w:pPr>
-        <w:pStyle w:val="Bibliography"/>
-      </w:pPr>
-      <w:r>
-        <w:t xml:space="preserve">Zhang, Y., Zhang, Y., 2018a. Associations between public transit usage and bikesharing behaviors in the united states. Sustainability 10, 1868.</w:t>
-      </w:r>
-      <w:r>
-        <w:t xml:space="preserve"> </w:t>
-      </w:r>
-      <w:hyperlink r:id="rId163">
-        <w:r>
-          <w:rPr>
-            <w:rStyle w:val="Hyperlink"/>
-          </w:rPr>
-          <w:t xml:space="preserve">https://doi.org/10.3390/su10061868</w:t>
-        </w:r>
-      </w:hyperlink>
-    </w:p>
-    <w:bookmarkEnd w:id="164"/>
-    <w:bookmarkStart w:id="166" w:name="ref-zhang2018veh"/>
-    <w:p>
-      <w:pPr>
-        <w:pStyle w:val="Bibliography"/>
-      </w:pPr>
-      <w:r>
-        <w:t xml:space="preserve">Zhang, Y., Zhang, Y., 2018b. Examining the relationship between household vehicle ownership and ridesharing behaviors in the united states. Sustainability 10, 2720.</w:t>
-      </w:r>
-      <w:r>
-        <w:t xml:space="preserve"> </w:t>
-      </w:r>
-      <w:hyperlink r:id="rId165">
-        <w:r>
-          <w:rPr>
-            <w:rStyle w:val="Hyperlink"/>
-          </w:rPr>
-          <w:t xml:space="preserve">https://doi.org/10.3390/su10082720</w:t>
-        </w:r>
-      </w:hyperlink>
-    </w:p>
-    <w:bookmarkEnd w:id="166"/>
-    <w:bookmarkStart w:id="168" w:name="ref-zhang2018ride"/>
-    <w:p>
-      <w:pPr>
-        <w:pStyle w:val="Bibliography"/>
-      </w:pPr>
-      <w:r>
-        <w:t xml:space="preserve">Zhang, Y., Zhang, Y., 2018c. Exploring the relationship between ridesharing and public transit use in the united states. International Journal of Environmental Research and Public Health 15, 1763.</w:t>
-      </w:r>
-      <w:r>
-        <w:t xml:space="preserve"> </w:t>
-      </w:r>
-      <w:hyperlink r:id="rId167">
-        <w:r>
-          <w:rPr>
-            <w:rStyle w:val="Hyperlink"/>
-          </w:rPr>
-          <w:t xml:space="preserve">https://doi.org/10.3390/ijerph15081763</w:t>
-        </w:r>
-      </w:hyperlink>
-    </w:p>
-    <w:bookmarkEnd w:id="168"/>
-    <w:bookmarkStart w:id="170" w:name="ref-zhou2014"/>
-    <w:p>
-      <w:pPr>
-        <w:pStyle w:val="Bibliography"/>
-      </w:pPr>
-      <w:r>
-        <w:t xml:space="preserve">Zhou, Y., Wang, X.(Cara)., 2014. Explore the relationship between online shopping and shopping trips: An analysis with the 2009 NHTS data. Transportation Research Part A: Policy and Practice 70, 1–9.</w:t>
-      </w:r>
-      <w:r>
-        <w:t xml:space="preserve"> </w:t>
-      </w:r>
-      <w:hyperlink r:id="rId169">
-        <w:r>
-          <w:rPr>
-            <w:rStyle w:val="Hyperlink"/>
-          </w:rPr>
-          <w:t xml:space="preserve">https://doi.org/10.1016/j.tra.2014.09.014</w:t>
-        </w:r>
-      </w:hyperlink>
-    </w:p>
-    <w:bookmarkEnd w:id="170"/>
-    <w:bookmarkEnd w:id="171"/>
-    <w:bookmarkEnd w:id="172"/>
-    <w:bookmarkStart w:id="178" w:name="supplementary-material"/>
-    <w:p>
-      <w:pPr>
-        <w:pStyle w:val="Heading2"/>
-      </w:pPr>
-      <w:r>
         <w:t xml:space="preserve">Supplementary material</w:t>
+      </w:r>
+    </w:p>
+    <w:p>
+      <w:pPr>
+        <w:pStyle w:val="FirstParagraph"/>
+      </w:pPr>
+      <w:r>
+        <w:rPr>
+          <w:b/>
+          <w:bCs/>
+        </w:rPr>
+        <w:t xml:space="preserve">Deviations from the analysis plan</w:t>
+      </w:r>
+      <w:r>
+        <w:t xml:space="preserve"> </w:t>
+      </w:r>
+      <w:r>
+        <w:t xml:space="preserve">(the full log is in</w:t>
+      </w:r>
+      <w:r>
+        <w:t xml:space="preserve"> </w:t>
+      </w:r>
+      <w:r>
+        <w:rPr>
+          <w:rStyle w:val="VerbatimChar"/>
+        </w:rPr>
+        <w:t xml:space="preserve">analysis_plan.md</w:t>
+      </w:r>
+      <w:r>
+        <w:t xml:space="preserve">): three studies were run before the plan was frozen; the grading tolerance had a floor of two units of the last printed digit; hypothesis three was evaluated against each study’s declared inference (the first draft pooled against the unweighted fit); hypothesis four was reformulated after the printed score proved reproducible by neither pipeline; the tuned run used two seeds; a decomposition of the standard-error ratio, an unweighted household-clustered fit and a check of Newton against exact replicate refits were added after an external review; the printed targets of two zero-inflated studies were dropped because they cannot be mapped onto coefficients.</w:t>
       </w:r>
     </w:p>
     <w:tbl>
@@ -8059,7 +7193,7 @@
       <w:tr>
         <w:tc>
           <w:tcPr/>
-          <w:bookmarkStart w:id="176" w:name="fig-holdout"/>
+          <w:bookmarkStart w:id="64" w:name="fig-holdout"/>
           <w:p>
             <w:pPr>
               <w:pStyle w:val="Compact"/>
@@ -8070,18 +7204,18 @@
                 <wp:inline>
                   <wp:extent cx="5334000" cy="2273968"/>
                   <wp:effectExtent b="0" l="0" r="0" t="0"/>
-                  <wp:docPr descr="" title="" id="174" name="Picture"/>
+                  <wp:docPr descr="" title="" id="62" name="Picture"/>
                   <a:graphic>
                     <a:graphicData uri="http://schemas.openxmlformats.org/drawingml/2006/picture">
                       <pic:pic>
                         <pic:nvPicPr>
-                          <pic:cNvPr descr="figures/fig_holdout.png" id="175" name="Picture"/>
+                          <pic:cNvPr descr="figures/fig_holdout.png" id="63" name="Picture"/>
                           <pic:cNvPicPr>
                             <a:picLocks noChangeArrowheads="1" noChangeAspect="1"/>
                           </pic:cNvPicPr>
                         </pic:nvPicPr>
                         <pic:blipFill>
-                          <a:blip r:embed="rId173"/>
+                          <a:blip r:embed="rId61"/>
                           <a:stretch>
                             <a:fillRect/>
                           </a:stretch>
@@ -8121,7 +7255,7 @@
               <w:t xml:space="preserve">Figure 8: Frequency histogram of the rare class (share of alternative-fuel vehicles, panel A, and of electric vehicles, panel B) in all rows, in the training households and in the held-out households of each of the three splits.</w:t>
             </w:r>
           </w:p>
-          <w:bookmarkEnd w:id="176"/>
+          <w:bookmarkEnd w:id="64"/>
         </w:tc>
       </w:tr>
     </w:tbl>
@@ -8146,7 +7280,7 @@
       <w:tr>
         <w:tc>
           <w:tcPr/>
-          <w:bookmarkStart w:id="177" w:name="tbl-selected"/>
+          <w:bookmarkStart w:id="65" w:name="tbl-selected"/>
           <w:p>
             <w:pPr>
               <w:jc w:val="center"/>
@@ -8771,11 +7905,1193 @@
               </w:tc>
             </w:tr>
           </w:tbl>
-          <w:bookmarkEnd w:id="177"/>
+          <w:bookmarkEnd w:id="65"/>
           <w:p/>
         </w:tc>
       </w:tr>
     </w:tbl>
+    <w:bookmarkEnd w:id="66"/>
+    <w:bookmarkStart w:id="178" w:name="references"/>
+    <w:p>
+      <w:pPr>
+        <w:pStyle w:val="Heading2"/>
+      </w:pPr>
+      <w:r>
+        <w:t xml:space="preserve">References</w:t>
+      </w:r>
+    </w:p>
+    <w:bookmarkStart w:id="177" w:name="refs"/>
+    <w:bookmarkStart w:id="68" w:name="ref-alberini2021"/>
+    <w:p>
+      <w:pPr>
+        <w:pStyle w:val="Bibliography"/>
+      </w:pPr>
+      <w:r>
+        <w:t xml:space="preserve">Alberini, A., Teja Burra, L., Cirillo, C., Shen, C., 2021. Counting vehicle miles traveled: What can we learn from the NHTS? Transportation Research Part D: Transport and Environment 98, 102984.</w:t>
+      </w:r>
+      <w:r>
+        <w:t xml:space="preserve"> </w:t>
+      </w:r>
+      <w:hyperlink r:id="rId67">
+        <w:r>
+          <w:rPr>
+            <w:rStyle w:val="Hyperlink"/>
+          </w:rPr>
+          <w:t xml:space="preserve">https://doi.org/10.1016/j.trd.2021.102984</w:t>
+        </w:r>
+      </w:hyperlink>
+    </w:p>
+    <w:bookmarkEnd w:id="68"/>
+    <w:bookmarkStart w:id="70" w:name="ref-barua2021"/>
+    <w:p>
+      <w:pPr>
+        <w:pStyle w:val="Bibliography"/>
+      </w:pPr>
+      <w:r>
+        <w:t xml:space="preserve">Barua, L., Zou, B., Zhou, Y., Liu, Y., 2021. Modeling household online shopping demand in the u.s.: A machine learning approach and comparative investigation between 2009 and 2017. Transportation 50, 437–476.</w:t>
+      </w:r>
+      <w:r>
+        <w:t xml:space="preserve"> </w:t>
+      </w:r>
+      <w:hyperlink r:id="rId69">
+        <w:r>
+          <w:rPr>
+            <w:rStyle w:val="Hyperlink"/>
+          </w:rPr>
+          <w:t xml:space="preserve">https://doi.org/10.1007/s11116-021-10250-z</w:t>
+        </w:r>
+      </w:hyperlink>
+    </w:p>
+    <w:bookmarkEnd w:id="70"/>
+    <w:bookmarkStart w:id="72" w:name="ref-birrell2019"/>
+    <w:p>
+      <w:pPr>
+        <w:pStyle w:val="Bibliography"/>
+      </w:pPr>
+      <w:r>
+        <w:t xml:space="preserve">Birrell, C.L., Steel, D.G., Batterham, M.J., Arya, A., 2019. How to use replicate weights in health survey analysis using the national nutrition and physical activity survey as an example. Public Health Nutrition 22, 3315–3326.</w:t>
+      </w:r>
+      <w:r>
+        <w:t xml:space="preserve"> </w:t>
+      </w:r>
+      <w:hyperlink r:id="rId71">
+        <w:r>
+          <w:rPr>
+            <w:rStyle w:val="Hyperlink"/>
+          </w:rPr>
+          <w:t xml:space="preserve">https://doi.org/10.1017/s1368980019001927</w:t>
+        </w:r>
+      </w:hyperlink>
+    </w:p>
+    <w:bookmarkEnd w:id="72"/>
+    <w:bookmarkStart w:id="74" w:name="ref-blagus2013"/>
+    <w:p>
+      <w:pPr>
+        <w:pStyle w:val="Bibliography"/>
+      </w:pPr>
+      <w:r>
+        <w:t xml:space="preserve">Blagus, R., Lusa, L., 2013. SMOTE for high-dimensional class-imbalanced data. BMC Bioinformatics 14, 106.</w:t>
+      </w:r>
+      <w:r>
+        <w:t xml:space="preserve"> </w:t>
+      </w:r>
+      <w:hyperlink r:id="rId73">
+        <w:r>
+          <w:rPr>
+            <w:rStyle w:val="Hyperlink"/>
+          </w:rPr>
+          <w:t xml:space="preserve">https://doi.org/10.1186/1471-2105-14-106</w:t>
+        </w:r>
+      </w:hyperlink>
+    </w:p>
+    <w:bookmarkEnd w:id="74"/>
+    <w:bookmarkStart w:id="76" w:name="ref-bollen2016"/>
+    <w:p>
+      <w:pPr>
+        <w:pStyle w:val="Bibliography"/>
+      </w:pPr>
+      <w:r>
+        <w:t xml:space="preserve">Bollen, K.A., Biemer, P.P., Karr, A.F., Tueller, S., Berzofsky, M.E., 2016. Are survey weights needed? A review of diagnostic tests in regression analysis. Annual Review of Statistics and Its Application 3, 375–392.</w:t>
+      </w:r>
+      <w:r>
+        <w:t xml:space="preserve"> </w:t>
+      </w:r>
+      <w:hyperlink r:id="rId75">
+        <w:r>
+          <w:rPr>
+            <w:rStyle w:val="Hyperlink"/>
+          </w:rPr>
+          <w:t xml:space="preserve">https://doi.org/10.1146/annurev-statistics-011516-012958</w:t>
+        </w:r>
+      </w:hyperlink>
+    </w:p>
+    <w:bookmarkEnd w:id="76"/>
+    <w:bookmarkStart w:id="78" w:name="ref-chawla2002"/>
+    <w:p>
+      <w:pPr>
+        <w:pStyle w:val="Bibliography"/>
+      </w:pPr>
+      <w:r>
+        <w:t xml:space="preserve">Chawla, N.V., Bowyer, K.W., Hall, L.O., Kegelmeyer, W.P., 2002. SMOTE: Synthetic minority over-sampling technique. Journal of Artificial Intelligence Research 16, 321–357.</w:t>
+      </w:r>
+      <w:r>
+        <w:t xml:space="preserve"> </w:t>
+      </w:r>
+      <w:hyperlink r:id="rId77">
+        <w:r>
+          <w:rPr>
+            <w:rStyle w:val="Hyperlink"/>
+          </w:rPr>
+          <w:t xml:space="preserve">https://doi.org/10.1613/jair.953</w:t>
+        </w:r>
+      </w:hyperlink>
+    </w:p>
+    <w:bookmarkEnd w:id="78"/>
+    <w:bookmarkStart w:id="80" w:name="ref-conway2018"/>
+    <w:p>
+      <w:pPr>
+        <w:pStyle w:val="Bibliography"/>
+      </w:pPr>
+      <w:r>
+        <w:t xml:space="preserve">Conway, M.W., Salon, D., King, D.A., 2018. Trends in taxi use and the advent of ridehailing, 1995–2017: Evidence from the US national household travel survey. Urban Science 2, 79.</w:t>
+      </w:r>
+      <w:r>
+        <w:t xml:space="preserve"> </w:t>
+      </w:r>
+      <w:hyperlink r:id="rId79">
+        <w:r>
+          <w:rPr>
+            <w:rStyle w:val="Hyperlink"/>
+          </w:rPr>
+          <w:t xml:space="preserve">https://doi.org/10.3390/urbansci2030079</w:t>
+        </w:r>
+      </w:hyperlink>
+    </w:p>
+    <w:bookmarkEnd w:id="80"/>
+    <w:bookmarkStart w:id="82" w:name="ref-deka2019"/>
+    <w:p>
+      <w:pPr>
+        <w:pStyle w:val="Bibliography"/>
+      </w:pPr>
+      <w:r>
+        <w:t xml:space="preserve">Deka, D., Fei, D., 2019. A comparison of the personal and neighborhood characteristics associated with ridesourcing, transit use, and driving with NHTS data. Journal of Transport Geography 76, 24–33.</w:t>
+      </w:r>
+      <w:r>
+        <w:t xml:space="preserve"> </w:t>
+      </w:r>
+      <w:hyperlink r:id="rId81">
+        <w:r>
+          <w:rPr>
+            <w:rStyle w:val="Hyperlink"/>
+          </w:rPr>
+          <w:t xml:space="preserve">https://doi.org/10.1016/j.jtrangeo.2019.03.001</w:t>
+        </w:r>
+      </w:hyperlink>
+    </w:p>
+    <w:bookmarkEnd w:id="82"/>
+    <w:bookmarkStart w:id="84" w:name="ref-demircioglu2024"/>
+    <w:p>
+      <w:pPr>
+        <w:pStyle w:val="Bibliography"/>
+      </w:pPr>
+      <w:r>
+        <w:t xml:space="preserve">Demircioğlu, A., 2024. Applying oversampling before cross-validation will lead to high bias in radiomics. Scientific Reports 14, 11563.</w:t>
+      </w:r>
+      <w:r>
+        <w:t xml:space="preserve"> </w:t>
+      </w:r>
+      <w:hyperlink r:id="rId83">
+        <w:r>
+          <w:rPr>
+            <w:rStyle w:val="Hyperlink"/>
+          </w:rPr>
+          <w:t xml:space="preserve">https://doi.org/10.1038/s41598-024-62585-z</w:t>
+        </w:r>
+      </w:hyperlink>
+    </w:p>
+    <w:bookmarkEnd w:id="84"/>
+    <w:bookmarkStart w:id="86" w:name="ref-fu2020"/>
+    <w:p>
+      <w:pPr>
+        <w:pStyle w:val="Bibliography"/>
+      </w:pPr>
+      <w:r>
+        <w:t xml:space="preserve">Fu, Z., Liu, W., Zhu, J., Yuan, Y., 2020. Trip chain simulation of electric vehicles based on NHTS data. 2020 12th IEEE PES Asia-Pacific Power and Energy Engineering Conference (APPEEC) 1–6.</w:t>
+      </w:r>
+      <w:r>
+        <w:t xml:space="preserve"> </w:t>
+      </w:r>
+      <w:hyperlink r:id="rId85">
+        <w:r>
+          <w:rPr>
+            <w:rStyle w:val="Hyperlink"/>
+          </w:rPr>
+          <w:t xml:space="preserve">https://doi.org/10.1109/appeec48164.2020.9220726</w:t>
+        </w:r>
+      </w:hyperlink>
+    </w:p>
+    <w:bookmarkEnd w:id="86"/>
+    <w:bookmarkStart w:id="88" w:name="ref-gard2023"/>
+    <w:p>
+      <w:pPr>
+        <w:pStyle w:val="Bibliography"/>
+      </w:pPr>
+      <w:r>
+        <w:t xml:space="preserve">Gard, A.M., Hyde, L.W., Heeringa, S.G., West, B.T., Mitchell, C., 2023. Why weight? Analytic approaches for large-scale population neuroscience data. Developmental Cognitive Neuroscience 59, 101196.</w:t>
+      </w:r>
+      <w:r>
+        <w:t xml:space="preserve"> </w:t>
+      </w:r>
+      <w:hyperlink r:id="rId87">
+        <w:r>
+          <w:rPr>
+            <w:rStyle w:val="Hyperlink"/>
+          </w:rPr>
+          <w:t xml:space="preserve">https://doi.org/10.1016/j.dcn.2023.101196</w:t>
+        </w:r>
+      </w:hyperlink>
+    </w:p>
+    <w:bookmarkEnd w:id="88"/>
+    <w:bookmarkStart w:id="90" w:name="ref-gelman2007"/>
+    <w:p>
+      <w:pPr>
+        <w:pStyle w:val="Bibliography"/>
+      </w:pPr>
+      <w:r>
+        <w:t xml:space="preserve">Gelman, A., 2007. Struggles with survey weighting and regression modeling. Statistical Science 22, 153–164.</w:t>
+      </w:r>
+      <w:r>
+        <w:t xml:space="preserve"> </w:t>
+      </w:r>
+      <w:hyperlink r:id="rId89">
+        <w:r>
+          <w:rPr>
+            <w:rStyle w:val="Hyperlink"/>
+          </w:rPr>
+          <w:t xml:space="preserve">https://doi.org/10.1214/088342306000000691</w:t>
+        </w:r>
+      </w:hyperlink>
+    </w:p>
+    <w:bookmarkEnd w:id="90"/>
+    <w:bookmarkStart w:id="92" w:name="ref-hagenauer2017"/>
+    <w:p>
+      <w:pPr>
+        <w:pStyle w:val="Bibliography"/>
+      </w:pPr>
+      <w:r>
+        <w:t xml:space="preserve">Hagenauer, J., Helbich, M., 2017. A comparative study of machine learning classifiers for modeling travel mode choice. Expert Systems with Applications 78, 273–282.</w:t>
+      </w:r>
+      <w:r>
+        <w:t xml:space="preserve"> </w:t>
+      </w:r>
+      <w:hyperlink r:id="rId91">
+        <w:r>
+          <w:rPr>
+            <w:rStyle w:val="Hyperlink"/>
+          </w:rPr>
+          <w:t xml:space="preserve">https://doi.org/10.1016/j.eswa.2017.01.057</w:t>
+        </w:r>
+      </w:hyperlink>
+    </w:p>
+    <w:bookmarkEnd w:id="92"/>
+    <w:bookmarkStart w:id="94" w:name="ref-hardwicke2021"/>
+    <w:p>
+      <w:pPr>
+        <w:pStyle w:val="Bibliography"/>
+      </w:pPr>
+      <w:r>
+        <w:t xml:space="preserve">Hardwicke, T.E., Bohn, M., MacDonald, K., Hembacher, E., Nuijten, M.B., Peloquin, B.N., deMayo, B.E., Long, B., Yoon, E.J., Frank, M.C.</w:t>
+      </w:r>
+      <w:r>
+        <w:t xml:space="preserve">, 2021. Analytic reproducibility in articles receiving open data badges at the journal psychological science : An observational study. Royal Society Open Science 8, 201494.</w:t>
+      </w:r>
+      <w:r>
+        <w:t xml:space="preserve"> </w:t>
+      </w:r>
+      <w:hyperlink r:id="rId93">
+        <w:r>
+          <w:rPr>
+            <w:rStyle w:val="Hyperlink"/>
+          </w:rPr>
+          <w:t xml:space="preserve">https://doi.org/10.1098/rsos.201494</w:t>
+        </w:r>
+      </w:hyperlink>
+    </w:p>
+    <w:bookmarkEnd w:id="94"/>
+    <w:bookmarkStart w:id="96" w:name="ref-horl2021"/>
+    <w:p>
+      <w:pPr>
+        <w:pStyle w:val="Bibliography"/>
+      </w:pPr>
+      <w:r>
+        <w:t xml:space="preserve">Hörl, S., Balac, M., 2021. Synthetic population and travel demand for paris and île-de-france based on open and publicly available data. Transportation Research Part C: Emerging Technologies 130, 103291.</w:t>
+      </w:r>
+      <w:r>
+        <w:t xml:space="preserve"> </w:t>
+      </w:r>
+      <w:hyperlink r:id="rId95">
+        <w:r>
+          <w:rPr>
+            <w:rStyle w:val="Hyperlink"/>
+          </w:rPr>
+          <w:t xml:space="preserve">https://doi.org/10.1016/j.trc.2021.103291</w:t>
+        </w:r>
+      </w:hyperlink>
+    </w:p>
+    <w:bookmarkEnd w:id="96"/>
+    <w:bookmarkStart w:id="98" w:name="ref-jia2019"/>
+    <w:p>
+      <w:pPr>
+        <w:pStyle w:val="Bibliography"/>
+      </w:pPr>
+      <w:r>
+        <w:t xml:space="preserve">Jia, J., 2019. Analysis of alternative fuel vehicle (AFV) adoption utilizing different machine learning methods: A case study of 2017 NHTS. IEEE Access 7, 112726–112735.</w:t>
+      </w:r>
+      <w:r>
+        <w:t xml:space="preserve"> </w:t>
+      </w:r>
+      <w:hyperlink r:id="rId97">
+        <w:r>
+          <w:rPr>
+            <w:rStyle w:val="Hyperlink"/>
+          </w:rPr>
+          <w:t xml:space="preserve">https://doi.org/10.1109/ACCESS.2019.2934780</w:t>
+        </w:r>
+      </w:hyperlink>
+    </w:p>
+    <w:bookmarkEnd w:id="98"/>
+    <w:bookmarkStart w:id="100" w:name="ref-jia2020"/>
+    <w:p>
+      <w:pPr>
+        <w:pStyle w:val="Bibliography"/>
+      </w:pPr>
+      <w:r>
+        <w:t xml:space="preserve">Jia, J., Shi, B., Che, F., Zhang, H., 2020. Predicting the regional adoption of electric vehicle (EV) with comprehensive models. IEEE Access 8, 147275–147285.</w:t>
+      </w:r>
+      <w:r>
+        <w:t xml:space="preserve"> </w:t>
+      </w:r>
+      <w:hyperlink r:id="rId99">
+        <w:r>
+          <w:rPr>
+            <w:rStyle w:val="Hyperlink"/>
+          </w:rPr>
+          <w:t xml:space="preserve">https://doi.org/10.1109/ACCESS.2020.3014851</w:t>
+        </w:r>
+      </w:hyperlink>
+    </w:p>
+    <w:bookmarkEnd w:id="100"/>
+    <w:bookmarkStart w:id="102" w:name="ref-jiao2020"/>
+    <w:p>
+      <w:pPr>
+        <w:pStyle w:val="Bibliography"/>
+      </w:pPr>
+      <w:r>
+        <w:t xml:space="preserve">Jiao, J., Bischak, C., Hyden, S., 2020. The impact of shared mobility on trip generation behavior in the US: Findings from the 2017 national household travel survey. Travel Behaviour and Society 19, 1–7.</w:t>
+      </w:r>
+      <w:r>
+        <w:t xml:space="preserve"> </w:t>
+      </w:r>
+      <w:hyperlink r:id="rId101">
+        <w:r>
+          <w:rPr>
+            <w:rStyle w:val="Hyperlink"/>
+          </w:rPr>
+          <w:t xml:space="preserve">https://doi.org/10.1016/j.tbs.2019.11.001</w:t>
+        </w:r>
+      </w:hyperlink>
+    </w:p>
+    <w:bookmarkEnd w:id="102"/>
+    <w:bookmarkStart w:id="104" w:name="ref-kapoor2024reforms"/>
+    <w:p>
+      <w:pPr>
+        <w:pStyle w:val="Bibliography"/>
+      </w:pPr>
+      <w:r>
+        <w:t xml:space="preserve">Kapoor, S., Cantrell, E.M., Peng, K., Pham, T.H., Bail, C.A., Gundersen, O.E., Hofman, J.M., Hullman, J., Lones, M.A., Malik, M.M., Nanayakkara, P., Poldrack, R.A., Raji, I.D., Roberts, M., Salganik, M.J., Serra-Garcia, M., Stewart, B.M., Vandewiele, G., Narayanan, A., 2024. REFORMS: Consensus-based recommendations for machine-learning-based science. Science Advances 10, eadk3452.</w:t>
+      </w:r>
+      <w:r>
+        <w:t xml:space="preserve"> </w:t>
+      </w:r>
+      <w:hyperlink r:id="rId103">
+        <w:r>
+          <w:rPr>
+            <w:rStyle w:val="Hyperlink"/>
+          </w:rPr>
+          <w:t xml:space="preserve">https://doi.org/10.1126/sciadv.adk3452</w:t>
+        </w:r>
+      </w:hyperlink>
+    </w:p>
+    <w:bookmarkEnd w:id="104"/>
+    <w:bookmarkStart w:id="106" w:name="ref-kapoor2023"/>
+    <w:p>
+      <w:pPr>
+        <w:pStyle w:val="Bibliography"/>
+      </w:pPr>
+      <w:r>
+        <w:t xml:space="preserve">Kapoor, S., Narayanan, A., 2023. Leakage and the reproducibility crisis in machine-learning-based science. Patterns 4, 100804.</w:t>
+      </w:r>
+      <w:r>
+        <w:t xml:space="preserve"> </w:t>
+      </w:r>
+      <w:hyperlink r:id="rId105">
+        <w:r>
+          <w:rPr>
+            <w:rStyle w:val="Hyperlink"/>
+          </w:rPr>
+          <w:t xml:space="preserve">https://doi.org/10.1016/j.patter.2023.100804</w:t>
+        </w:r>
+      </w:hyperlink>
+    </w:p>
+    <w:bookmarkEnd w:id="106"/>
+    <w:bookmarkStart w:id="108" w:name="ref-krizek2019"/>
+    <w:p>
+      <w:pPr>
+        <w:pStyle w:val="Bibliography"/>
+      </w:pPr>
+      <w:r>
+        <w:t xml:space="preserve">Krizek, K.J., McGuckin, N., 2019. Shedding NHTS light on the use of</w:t>
+      </w:r>
+      <w:r>
+        <w:t xml:space="preserve"> </w:t>
+      </w:r>
+      <w:r>
+        <w:t xml:space="preserve">“little vehicles”</w:t>
+      </w:r>
+      <w:r>
+        <w:t xml:space="preserve"> </w:t>
+      </w:r>
+      <w:r>
+        <w:t xml:space="preserve">in urban areas. Transport Findings.</w:t>
+      </w:r>
+      <w:r>
+        <w:t xml:space="preserve"> </w:t>
+      </w:r>
+      <w:hyperlink r:id="rId107">
+        <w:r>
+          <w:rPr>
+            <w:rStyle w:val="Hyperlink"/>
+          </w:rPr>
+          <w:t xml:space="preserve">https://doi.org/10.32866/10777</w:t>
+        </w:r>
+      </w:hyperlink>
+    </w:p>
+    <w:bookmarkEnd w:id="108"/>
+    <w:bookmarkStart w:id="110" w:name="ref-lambert1992"/>
+    <w:p>
+      <w:pPr>
+        <w:pStyle w:val="Bibliography"/>
+      </w:pPr>
+      <w:r>
+        <w:t xml:space="preserve">Lambert, D., 1992. Zero-inflated poisson regression, with an application to defects in manufacturing. Technometrics 34, 1.</w:t>
+      </w:r>
+      <w:r>
+        <w:t xml:space="preserve"> </w:t>
+      </w:r>
+      <w:hyperlink r:id="rId109">
+        <w:r>
+          <w:rPr>
+            <w:rStyle w:val="Hyperlink"/>
+          </w:rPr>
+          <w:t xml:space="preserve">https://doi.org/10.2307/1269547</w:t>
+        </w:r>
+      </w:hyperlink>
+    </w:p>
+    <w:bookmarkEnd w:id="110"/>
+    <w:bookmarkStart w:id="112" w:name="ref-lidbe2021"/>
+    <w:p>
+      <w:pPr>
+        <w:pStyle w:val="Bibliography"/>
+      </w:pPr>
+      <w:r>
+        <w:t xml:space="preserve">Lidbe, A., Adanu, E.K., Penmetsa, P., Jones, S., 2021. Changes in the travel patterns of older americans with medical conditions: A comparison of 2001 and 2017 NHTS data. Transportation Research Interdisciplinary Perspectives 11, 100463.</w:t>
+      </w:r>
+      <w:r>
+        <w:t xml:space="preserve"> </w:t>
+      </w:r>
+      <w:hyperlink r:id="rId111">
+        <w:r>
+          <w:rPr>
+            <w:rStyle w:val="Hyperlink"/>
+          </w:rPr>
+          <w:t xml:space="preserve">https://doi.org/10.1016/j.trip.2021.100463</w:t>
+        </w:r>
+      </w:hyperlink>
+    </w:p>
+    <w:bookmarkEnd w:id="112"/>
+    <w:bookmarkStart w:id="114" w:name="ref-lumley2004"/>
+    <w:p>
+      <w:pPr>
+        <w:pStyle w:val="Bibliography"/>
+      </w:pPr>
+      <w:r>
+        <w:t xml:space="preserve">Lumley, T., 2004. Analysis of complex survey samples. Journal of Statistical Software 9.</w:t>
+      </w:r>
+      <w:r>
+        <w:t xml:space="preserve"> </w:t>
+      </w:r>
+      <w:hyperlink r:id="rId113">
+        <w:r>
+          <w:rPr>
+            <w:rStyle w:val="Hyperlink"/>
+          </w:rPr>
+          <w:t xml:space="preserve">https://doi.org/10.18637/jss.v009.i08</w:t>
+        </w:r>
+      </w:hyperlink>
+    </w:p>
+    <w:bookmarkEnd w:id="114"/>
+    <w:bookmarkStart w:id="116" w:name="ref-martinbaos2023"/>
+    <w:p>
+      <w:pPr>
+        <w:pStyle w:val="Bibliography"/>
+      </w:pPr>
+      <w:r>
+        <w:t xml:space="preserve">Martín-Baos, J.Á., López-Gómez, J.A., Rodriguez-Benitez, L., Hillel, T., García-Ródenas, R., 2023. A prediction and behavioural analysis of machine learning methods for modelling travel mode choice. Transportation Research Part C: Emerging Technologies 156, 104318.</w:t>
+      </w:r>
+      <w:r>
+        <w:t xml:space="preserve"> </w:t>
+      </w:r>
+      <w:hyperlink r:id="rId115">
+        <w:r>
+          <w:rPr>
+            <w:rStyle w:val="Hyperlink"/>
+          </w:rPr>
+          <w:t xml:space="preserve">https://doi.org/10.1016/j.trc.2023.104318</w:t>
+        </w:r>
+      </w:hyperlink>
+    </w:p>
+    <w:bookmarkEnd w:id="116"/>
+    <w:bookmarkStart w:id="118" w:name="ref-naseralavi2025"/>
+    <w:p>
+      <w:pPr>
+        <w:pStyle w:val="Bibliography"/>
+      </w:pPr>
+      <w:r>
+        <w:t xml:space="preserve">Naseralavi, S., Soltanirad, M., Ranjbar, E., Lucero, M., Gorzin, F., Hakiminejad, Y., Azimi, S., Baghersad, M., Mazaheri, A., 2025. Machine learning modeling of household trip generation by state using NHTS data. Urban Science 9, 353.</w:t>
+      </w:r>
+      <w:r>
+        <w:t xml:space="preserve"> </w:t>
+      </w:r>
+      <w:hyperlink r:id="rId117">
+        <w:r>
+          <w:rPr>
+            <w:rStyle w:val="Hyperlink"/>
+          </w:rPr>
+          <w:t xml:space="preserve">https://doi.org/10.3390/urbansci9090353</w:t>
+        </w:r>
+      </w:hyperlink>
+    </w:p>
+    <w:bookmarkEnd w:id="118"/>
+    <w:bookmarkStart w:id="120" w:name="ref-peng2011"/>
+    <w:p>
+      <w:pPr>
+        <w:pStyle w:val="Bibliography"/>
+      </w:pPr>
+      <w:r>
+        <w:t xml:space="preserve">Peng, R.D., 2011. Reproducible research in computational science. Science 334, 1226–1227.</w:t>
+      </w:r>
+      <w:r>
+        <w:t xml:space="preserve"> </w:t>
+      </w:r>
+      <w:hyperlink r:id="rId119">
+        <w:r>
+          <w:rPr>
+            <w:rStyle w:val="Hyperlink"/>
+          </w:rPr>
+          <w:t xml:space="preserve">https://doi.org/10.1126/science.1213847</w:t>
+        </w:r>
+      </w:hyperlink>
+    </w:p>
+    <w:bookmarkEnd w:id="120"/>
+    <w:bookmarkStart w:id="122" w:name="ref-ploton2020"/>
+    <w:p>
+      <w:pPr>
+        <w:pStyle w:val="Bibliography"/>
+      </w:pPr>
+      <w:r>
+        <w:t xml:space="preserve">Ploton, P., Mortier, F., Réjou-Méchain, M., Barbier, N., Picard, N., Rossi, V., Dormann, C., Cornu, G., Viennois, G., Bayol, N., Lyapustin, A., Gourlet-Fleury, S., Pélissier, R., 2020. Spatial validation reveals poor predictive performance of large-scale ecological mapping models. Nature Communications 11, 4540.</w:t>
+      </w:r>
+      <w:r>
+        <w:t xml:space="preserve"> </w:t>
+      </w:r>
+      <w:hyperlink r:id="rId121">
+        <w:r>
+          <w:rPr>
+            <w:rStyle w:val="Hyperlink"/>
+          </w:rPr>
+          <w:t xml:space="preserve">https://doi.org/10.1038/s41467-020-18321-y</w:t>
+        </w:r>
+      </w:hyperlink>
+    </w:p>
+    <w:bookmarkEnd w:id="122"/>
+    <w:bookmarkStart w:id="124" w:name="ref-quinn2016"/>
+    <w:p>
+      <w:pPr>
+        <w:pStyle w:val="Bibliography"/>
+      </w:pPr>
+      <w:r>
+        <w:t xml:space="preserve">Quinn, T.D., Jakicic, J.M., Fertman, C.I., Barone Gibbs, B., 2016. Demographic factors, workplace factors and active transportation use in the USA: A secondary analysis of 2009 NHTS data. Journal of Epidemiology and Community Health 71, 480–486.</w:t>
+      </w:r>
+      <w:r>
+        <w:t xml:space="preserve"> </w:t>
+      </w:r>
+      <w:hyperlink r:id="rId123">
+        <w:r>
+          <w:rPr>
+            <w:rStyle w:val="Hyperlink"/>
+          </w:rPr>
+          <w:t xml:space="preserve">https://doi.org/10.1136/jech-2016-207820</w:t>
+        </w:r>
+      </w:hyperlink>
+    </w:p>
+    <w:bookmarkEnd w:id="124"/>
+    <w:bookmarkStart w:id="126" w:name="ref-roberts2017"/>
+    <w:p>
+      <w:pPr>
+        <w:pStyle w:val="Bibliography"/>
+      </w:pPr>
+      <w:r>
+        <w:t xml:space="preserve">Roberts, D.R., Bahn, V., Ciuti, S., Boyce, M.S., Elith, J., Guillera‐Arroita, G., Hauenstein, S., Lahoz‐Monfort, J.J., Schröder, B., Thuiller, W., Warton, D.I., Wintle, B.A., Hartig, F., Dormann, C.F., 2017. Cross‐validation strategies for data with temporal, spatial, hierarchical, or phylogenetic structure. Ecography 40, 913–929.</w:t>
+      </w:r>
+      <w:r>
+        <w:t xml:space="preserve"> </w:t>
+      </w:r>
+      <w:hyperlink r:id="rId125">
+        <w:r>
+          <w:rPr>
+            <w:rStyle w:val="Hyperlink"/>
+          </w:rPr>
+          <w:t xml:space="preserve">https://doi.org/10.1111/ecog.02881</w:t>
+        </w:r>
+      </w:hyperlink>
+    </w:p>
+    <w:bookmarkEnd w:id="126"/>
+    <w:bookmarkStart w:id="128" w:name="ref-rosenblatt2024"/>
+    <w:p>
+      <w:pPr>
+        <w:pStyle w:val="Bibliography"/>
+      </w:pPr>
+      <w:r>
+        <w:t xml:space="preserve">Rosenblatt, M., Tejavibulya, L., Jiang, R., Noble, S., Scheinost, D., 2024. Data leakage inflates prediction performance in connectome-based machine learning models. Nature Communications 15, 1829.</w:t>
+      </w:r>
+      <w:r>
+        <w:t xml:space="preserve"> </w:t>
+      </w:r>
+      <w:hyperlink r:id="rId127">
+        <w:r>
+          <w:rPr>
+            <w:rStyle w:val="Hyperlink"/>
+          </w:rPr>
+          <w:t xml:space="preserve">https://doi.org/10.1038/s41467-024-46150-w</w:t>
+        </w:r>
+      </w:hyperlink>
+    </w:p>
+    <w:bookmarkEnd w:id="128"/>
+    <w:bookmarkStart w:id="130" w:name="ref-rust1996"/>
+    <w:p>
+      <w:pPr>
+        <w:pStyle w:val="Bibliography"/>
+      </w:pPr>
+      <w:r>
+        <w:t xml:space="preserve">Rust, K., Rao, J., 1996. Variance estimation for complex surveys using replication techniques. Statistical Methods in Medical Research 5, 283–310.</w:t>
+      </w:r>
+      <w:r>
+        <w:t xml:space="preserve"> </w:t>
+      </w:r>
+      <w:hyperlink r:id="rId129">
+        <w:r>
+          <w:rPr>
+            <w:rStyle w:val="Hyperlink"/>
+          </w:rPr>
+          <w:t xml:space="preserve">https://doi.org/10.1177/096228029600500305</w:t>
+        </w:r>
+      </w:hyperlink>
+    </w:p>
+    <w:bookmarkEnd w:id="130"/>
+    <w:bookmarkStart w:id="132" w:name="ref-sabouri2020"/>
+    <w:p>
+      <w:pPr>
+        <w:pStyle w:val="Bibliography"/>
+      </w:pPr>
+      <w:r>
+        <w:t xml:space="preserve">Sabouri, S., Brewer, S., Ewing, R., 2020. Exploring the relationship between ride-sourcing services and vehicle ownership, using both inferential and machine learning approaches. Landscape and Urban Planning 198, 103797.</w:t>
+      </w:r>
+      <w:r>
+        <w:t xml:space="preserve"> </w:t>
+      </w:r>
+      <w:hyperlink r:id="rId131">
+        <w:r>
+          <w:rPr>
+            <w:rStyle w:val="Hyperlink"/>
+          </w:rPr>
+          <w:t xml:space="preserve">https://doi.org/10.1016/j.landurbplan.2020.103797</w:t>
+        </w:r>
+      </w:hyperlink>
+    </w:p>
+    <w:bookmarkEnd w:id="132"/>
+    <w:bookmarkStart w:id="134" w:name="ref-sadeghvaziri2020"/>
+    <w:p>
+      <w:pPr>
+        <w:pStyle w:val="Bibliography"/>
+      </w:pPr>
+      <w:r>
+        <w:t xml:space="preserve">Sadeghvaziri, E., Tawfik, A., 2020. Using the 2017 national household travel survey data to explore the elderly’s travel patterns. International Conference on Transportation and Development 2020 86–94.</w:t>
+      </w:r>
+      <w:r>
+        <w:t xml:space="preserve"> </w:t>
+      </w:r>
+      <w:hyperlink r:id="rId133">
+        <w:r>
+          <w:rPr>
+            <w:rStyle w:val="Hyperlink"/>
+          </w:rPr>
+          <w:t xml:space="preserve">https://doi.org/10.1061/9780784483169.008</w:t>
+        </w:r>
+      </w:hyperlink>
+    </w:p>
+    <w:bookmarkEnd w:id="134"/>
+    <w:bookmarkStart w:id="136" w:name="ref-schweinsberg2021"/>
+    <w:p>
+      <w:pPr>
+        <w:pStyle w:val="Bibliography"/>
+      </w:pPr>
+      <w:r>
+        <w:t xml:space="preserve">Schweinsberg, M., Feldman, M., Staub, N., Akker, O.R. van den, Aert, R.C.M. van, Assen, M.A.L.M. van, Liu, Y., Althoff, T., Heer, J., Kale, A., Mohamed, Z., Amireh, H., Venkatesh Prasad, V., Bernstein, A., Robinson, E., Snellman, K., Amy Sommer, S., Otner, S.M.G., Robinson, D., Madan, N., Silberzahn, R., Goldstein, P., Tierney, W., Murase, T., Mandl, B., Viganola, D., Strobl, C., Schaumans, C.B.C., Kelchtermans, S., Naseeb, C., Mason Garrison, S., Yarkoni, T., Richard Chan, C.S., Adie, P., Alaburda, P., Albers, C., Alspaugh, S., Alstott, J., Nelson, A.A., Ariño de la Rubia, E., 2021. Same data, different conclusions: Radical dispersion in empirical results when independent analysts operationalize and test the same hypothesis. Organizational Behavior and Human Decision Processes 165, 228–249.</w:t>
+      </w:r>
+      <w:r>
+        <w:t xml:space="preserve"> </w:t>
+      </w:r>
+      <w:hyperlink r:id="rId135">
+        <w:r>
+          <w:rPr>
+            <w:rStyle w:val="Hyperlink"/>
+          </w:rPr>
+          <w:t xml:space="preserve">https://doi.org/10.1016/j.obhdp.2021.02.003</w:t>
+        </w:r>
+      </w:hyperlink>
+    </w:p>
+    <w:bookmarkEnd w:id="136"/>
+    <w:bookmarkStart w:id="138" w:name="ref-shirgaokar2021"/>
+    <w:p>
+      <w:pPr>
+        <w:pStyle w:val="Bibliography"/>
+      </w:pPr>
+      <w:r>
+        <w:t xml:space="preserve">Shirgaokar, M., Nobler, E., 2021. Differences in daily trips between immigrants and US-born individuals: Implications for social integration. Transport Policy 105, 103–114.</w:t>
+      </w:r>
+      <w:r>
+        <w:t xml:space="preserve"> </w:t>
+      </w:r>
+      <w:hyperlink r:id="rId137">
+        <w:r>
+          <w:rPr>
+            <w:rStyle w:val="Hyperlink"/>
+          </w:rPr>
+          <w:t xml:space="preserve">https://doi.org/10.1016/j.tranpol.2021.03.008</w:t>
+        </w:r>
+      </w:hyperlink>
+    </w:p>
+    <w:bookmarkEnd w:id="138"/>
+    <w:bookmarkStart w:id="140" w:name="ref-silberzahn2018"/>
+    <w:p>
+      <w:pPr>
+        <w:pStyle w:val="Bibliography"/>
+      </w:pPr>
+      <w:r>
+        <w:t xml:space="preserve">Silberzahn, R., Uhlmann, E.L., Martin, D.P., Anselmi, P., Aust, F., Awtrey, E., Bahník, Š., Bai, F., Bannard, C., Bonnier, E., Carlsson, R., Cheung, F., Christensen, G., Clay, R., Craig, M.A., Dalla Rosa, A., Dam, L., Evans, M.H., Flores Cervantes, I., Fong, N., Gamez-Djokic, M., Glenz, A., Gordon-McKeon, S., Heaton, T.J., Hederos, K., Heene, M., Hofelich Mohr, A.J., Högden, F., Hui, K., Johannesson, M., Kalodimos, J., Kaszubowski, E., Kennedy, D.M., Lei, R., Lindsay, T.A., Liverani, S., Madan, C.R., Molden, D., Molleman, E., Morey, R.D., 2018. Many analysts, one data set: Making transparent how variations in analytic choices affect results. Advances in Methods and Practices in Psychological Science 1, 337–356.</w:t>
+      </w:r>
+      <w:r>
+        <w:t xml:space="preserve"> </w:t>
+      </w:r>
+      <w:hyperlink r:id="rId139">
+        <w:r>
+          <w:rPr>
+            <w:rStyle w:val="Hyperlink"/>
+          </w:rPr>
+          <w:t xml:space="preserve">https://doi.org/10.1177/2515245917747646</w:t>
+        </w:r>
+      </w:hyperlink>
+    </w:p>
+    <w:bookmarkEnd w:id="140"/>
+    <w:bookmarkStart w:id="142" w:name="ref-simonsohn2020"/>
+    <w:p>
+      <w:pPr>
+        <w:pStyle w:val="Bibliography"/>
+      </w:pPr>
+      <w:r>
+        <w:t xml:space="preserve">Simonsohn, U., Simmons, J.P., Nelson, L.D., 2020. Specification curve analysis. Nature Human Behaviour 4, 1208–1214.</w:t>
+      </w:r>
+      <w:r>
+        <w:t xml:space="preserve"> </w:t>
+      </w:r>
+      <w:hyperlink r:id="rId141">
+        <w:r>
+          <w:rPr>
+            <w:rStyle w:val="Hyperlink"/>
+          </w:rPr>
+          <w:t xml:space="preserve">https://doi.org/10.1038/s41562-020-0912-z</w:t>
+        </w:r>
+      </w:hyperlink>
+    </w:p>
+    <w:bookmarkEnd w:id="142"/>
+    <w:bookmarkStart w:id="144" w:name="ref-solon2015"/>
+    <w:p>
+      <w:pPr>
+        <w:pStyle w:val="Bibliography"/>
+      </w:pPr>
+      <w:r>
+        <w:t xml:space="preserve">Solon, G., Haider, S.J., Wooldridge, J.M., 2015. What are we weighting for? Journal of Human Resources 50, 301–316.</w:t>
+      </w:r>
+      <w:r>
+        <w:t xml:space="preserve"> </w:t>
+      </w:r>
+      <w:hyperlink r:id="rId143">
+        <w:r>
+          <w:rPr>
+            <w:rStyle w:val="Hyperlink"/>
+          </w:rPr>
+          <w:t xml:space="preserve">https://doi.org/10.3368/jhr.50.2.301</w:t>
+        </w:r>
+      </w:hyperlink>
+    </w:p>
+    <w:bookmarkEnd w:id="144"/>
+    <w:bookmarkStart w:id="146" w:name="ref-steegen2016"/>
+    <w:p>
+      <w:pPr>
+        <w:pStyle w:val="Bibliography"/>
+      </w:pPr>
+      <w:r>
+        <w:t xml:space="preserve">Steegen, S., Tuerlinckx, F., Gelman, A., Vanpaemel, W., 2016. Increasing transparency through a multiverse analysis. Perspectives on Psychological Science 11, 702–712.</w:t>
+      </w:r>
+      <w:r>
+        <w:t xml:space="preserve"> </w:t>
+      </w:r>
+      <w:hyperlink r:id="rId145">
+        <w:r>
+          <w:rPr>
+            <w:rStyle w:val="Hyperlink"/>
+          </w:rPr>
+          <w:t xml:space="preserve">https://doi.org/10.1177/1745691616658637</w:t>
+        </w:r>
+      </w:hyperlink>
+    </w:p>
+    <w:bookmarkEnd w:id="146"/>
+    <w:bookmarkStart w:id="148" w:name="ref-stodden2018"/>
+    <w:p>
+      <w:pPr>
+        <w:pStyle w:val="Bibliography"/>
+      </w:pPr>
+      <w:r>
+        <w:t xml:space="preserve">Stodden, V., Seiler, J., Ma, Z., 2018. An empirical analysis of journal policy effectiveness for computational reproducibility. Proceedings of the National Academy of Sciences 115, 2584–2589.</w:t>
+      </w:r>
+      <w:r>
+        <w:t xml:space="preserve"> </w:t>
+      </w:r>
+      <w:hyperlink r:id="rId147">
+        <w:r>
+          <w:rPr>
+            <w:rStyle w:val="Hyperlink"/>
+          </w:rPr>
+          <w:t xml:space="preserve">https://doi.org/10.1073/pnas.1708290115</w:t>
+        </w:r>
+      </w:hyperlink>
+    </w:p>
+    <w:bookmarkEnd w:id="148"/>
+    <w:bookmarkStart w:id="150" w:name="ref-su2021"/>
+    <w:p>
+      <w:pPr>
+        <w:pStyle w:val="Bibliography"/>
+      </w:pPr>
+      <w:r>
+        <w:t xml:space="preserve">Su, R., Xiao, J., McBride, E.C., Goulias, K.G., 2021. Understanding senior’s daily mobility patterns in california using human mobility motifs. Journal of Transport Geography 94, 103117.</w:t>
+      </w:r>
+      <w:r>
+        <w:t xml:space="preserve"> </w:t>
+      </w:r>
+      <w:hyperlink r:id="rId149">
+        <w:r>
+          <w:rPr>
+            <w:rStyle w:val="Hyperlink"/>
+          </w:rPr>
+          <w:t xml:space="preserve">https://doi.org/10.1016/j.jtrangeo.2021.103117</w:t>
+        </w:r>
+      </w:hyperlink>
+    </w:p>
+    <w:bookmarkEnd w:id="150"/>
+    <w:bookmarkStart w:id="152" w:name="ref-vabalas2019"/>
+    <w:p>
+      <w:pPr>
+        <w:pStyle w:val="Bibliography"/>
+      </w:pPr>
+      <w:r>
+        <w:t xml:space="preserve">Vabalas, A., Gowen, E., Poliakoff, E., Casson, A.J., 2019. Machine learning algorithm validation with a limited sample size. PLOS ONE 14, e0224365.</w:t>
+      </w:r>
+      <w:r>
+        <w:t xml:space="preserve"> </w:t>
+      </w:r>
+      <w:hyperlink r:id="rId151">
+        <w:r>
+          <w:rPr>
+            <w:rStyle w:val="Hyperlink"/>
+          </w:rPr>
+          <w:t xml:space="preserve">https://doi.org/10.1371/journal.pone.0224365</w:t>
+        </w:r>
+      </w:hyperlink>
+    </w:p>
+    <w:bookmarkEnd w:id="152"/>
+    <w:bookmarkStart w:id="154" w:name="ref-wang2024benchmark"/>
+    <w:p>
+      <w:pPr>
+        <w:pStyle w:val="Bibliography"/>
+      </w:pPr>
+      <w:r>
+        <w:t xml:space="preserve">Wang, S., Mo, B., Zheng, Y., Hess, S., Zhao, J., 2024. Comparing hundreds of machine learning and discrete choice models for travel demand modeling: An empirical benchmark. Transportation Research Part B: Methodological 190, 103061.</w:t>
+      </w:r>
+      <w:r>
+        <w:t xml:space="preserve"> </w:t>
+      </w:r>
+      <w:hyperlink r:id="rId153">
+        <w:r>
+          <w:rPr>
+            <w:rStyle w:val="Hyperlink"/>
+          </w:rPr>
+          <w:t xml:space="preserve">https://doi.org/10.1016/j.trb.2024.103061</w:t>
+        </w:r>
+      </w:hyperlink>
+    </w:p>
+    <w:bookmarkEnd w:id="154"/>
+    <w:bookmarkStart w:id="156" w:name="ref-wang2022nhts"/>
+    <w:p>
+      <w:pPr>
+        <w:pStyle w:val="Bibliography"/>
+      </w:pPr>
+      <w:r>
+        <w:t xml:space="preserve">Wang, X., Shaw, F.A., Mokhtarian, P.L., Watkins, K.E., 2022. ﻿Response willingness in consecutive travel surveys: An investigation based on the national household travel survey using a sample selection model. Transportation 50, 2339–2373.</w:t>
+      </w:r>
+      <w:r>
+        <w:t xml:space="preserve"> </w:t>
+      </w:r>
+      <w:hyperlink r:id="rId155">
+        <w:r>
+          <w:rPr>
+            <w:rStyle w:val="Hyperlink"/>
+          </w:rPr>
+          <w:t xml:space="preserve">https://doi.org/10.1007/s11116-022-10312-w</w:t>
+        </w:r>
+      </w:hyperlink>
+    </w:p>
+    <w:bookmarkEnd w:id="156"/>
+    <w:bookmarkStart w:id="158" w:name="ref-winship1994"/>
+    <w:p>
+      <w:pPr>
+        <w:pStyle w:val="Bibliography"/>
+      </w:pPr>
+      <w:r>
+        <w:t xml:space="preserve">Winship, C., Radbill, L., 1994. Sampling weights and regression analysis. Sociological Methods &amp; Research 23, 230–257.</w:t>
+      </w:r>
+      <w:r>
+        <w:t xml:space="preserve"> </w:t>
+      </w:r>
+      <w:hyperlink r:id="rId157">
+        <w:r>
+          <w:rPr>
+            <w:rStyle w:val="Hyperlink"/>
+          </w:rPr>
+          <w:t xml:space="preserve">https://doi.org/10.1177/0049124194023002004</w:t>
+        </w:r>
+      </w:hyperlink>
+    </w:p>
+    <w:bookmarkEnd w:id="158"/>
+    <w:bookmarkStart w:id="160" w:name="ref-wolter2007"/>
+    <w:p>
+      <w:pPr>
+        <w:pStyle w:val="Bibliography"/>
+      </w:pPr>
+      <w:r>
+        <w:t xml:space="preserve">Wolter, K.M., 2007. Introduction to variance estimation. Statistics for Social; Behavioral Sciences.</w:t>
+      </w:r>
+      <w:r>
+        <w:t xml:space="preserve"> </w:t>
+      </w:r>
+      <w:hyperlink r:id="rId159">
+        <w:r>
+          <w:rPr>
+            <w:rStyle w:val="Hyperlink"/>
+          </w:rPr>
+          <w:t xml:space="preserve">https://doi.org/10.1007/978-0-387-35099-8</w:t>
+        </w:r>
+      </w:hyperlink>
+    </w:p>
+    <w:bookmarkEnd w:id="160"/>
+    <w:bookmarkStart w:id="162" w:name="ref-wu2021"/>
+    <w:p>
+      <w:pPr>
+        <w:pStyle w:val="Bibliography"/>
+      </w:pPr>
+      <w:r>
+        <w:t xml:space="preserve">Wu, X., MacKenzie, D., 2021. Assessing the VMT effect of ridesourcing services in the US. Transportation Research Part D: Transport and Environment 94, 102816.</w:t>
+      </w:r>
+      <w:r>
+        <w:t xml:space="preserve"> </w:t>
+      </w:r>
+      <w:hyperlink r:id="rId161">
+        <w:r>
+          <w:rPr>
+            <w:rStyle w:val="Hyperlink"/>
+          </w:rPr>
+          <w:t xml:space="preserve">https://doi.org/10.1016/j.trd.2021.102816</w:t>
+        </w:r>
+      </w:hyperlink>
+    </w:p>
+    <w:bookmarkEnd w:id="162"/>
+    <w:bookmarkStart w:id="164" w:name="ref-xue2021"/>
+    <w:p>
+      <w:pPr>
+        <w:pStyle w:val="Bibliography"/>
+      </w:pPr>
+      <w:r>
+        <w:t xml:space="preserve">Xue, C., Wu, Q., Sun, M., Bai, P., Chen, Y., 2021. The interaction between e‐shopping and shopping trips: An analysis with 2017 NHTS. Complexity 2021, 8247158.</w:t>
+      </w:r>
+      <w:r>
+        <w:t xml:space="preserve"> </w:t>
+      </w:r>
+      <w:hyperlink r:id="rId163">
+        <w:r>
+          <w:rPr>
+            <w:rStyle w:val="Hyperlink"/>
+          </w:rPr>
+          <w:t xml:space="preserve">https://doi.org/10.1155/2021/8247158</w:t>
+        </w:r>
+      </w:hyperlink>
+    </w:p>
+    <w:bookmarkEnd w:id="164"/>
+    <w:bookmarkStart w:id="166" w:name="ref-yang2011"/>
+    <w:p>
+      <w:pPr>
+        <w:pStyle w:val="Bibliography"/>
+      </w:pPr>
+      <w:r>
+        <w:t xml:space="preserve">Yang, Y., Diez Roux, A.V., Bingham, C.R., 2011. Variability and seasonality of active transportation in USA: Evidence from the 2001 NHTS. International Journal of Behavioral Nutrition and Physical Activity 8, 96.</w:t>
+      </w:r>
+      <w:r>
+        <w:t xml:space="preserve"> </w:t>
+      </w:r>
+      <w:hyperlink r:id="rId165">
+        <w:r>
+          <w:rPr>
+            <w:rStyle w:val="Hyperlink"/>
+          </w:rPr>
+          <w:t xml:space="preserve">https://doi.org/10.1186/1479-5868-8-96</w:t>
+        </w:r>
+      </w:hyperlink>
+    </w:p>
+    <w:bookmarkEnd w:id="166"/>
+    <w:bookmarkStart w:id="168" w:name="ref-zeileis2008"/>
+    <w:p>
+      <w:pPr>
+        <w:pStyle w:val="Bibliography"/>
+      </w:pPr>
+      <w:r>
+        <w:t xml:space="preserve">Zeileis, A., Kleiber, C., Jackman, S., 2008. Regression models for count data in r. Journal of Statistical Software 27.</w:t>
+      </w:r>
+      <w:r>
+        <w:t xml:space="preserve"> </w:t>
+      </w:r>
+      <w:hyperlink r:id="rId167">
+        <w:r>
+          <w:rPr>
+            <w:rStyle w:val="Hyperlink"/>
+          </w:rPr>
+          <w:t xml:space="preserve">https://doi.org/10.18637/jss.v027.i08</w:t>
+        </w:r>
+      </w:hyperlink>
+    </w:p>
+    <w:bookmarkEnd w:id="168"/>
+    <w:bookmarkStart w:id="170" w:name="ref-zhang2018bike"/>
+    <w:p>
+      <w:pPr>
+        <w:pStyle w:val="Bibliography"/>
+      </w:pPr>
+      <w:r>
+        <w:t xml:space="preserve">Zhang, Y., Zhang, Y., 2018a. Associations between public transit usage and bikesharing behaviors in the united states. Sustainability 10, 1868.</w:t>
+      </w:r>
+      <w:r>
+        <w:t xml:space="preserve"> </w:t>
+      </w:r>
+      <w:hyperlink r:id="rId169">
+        <w:r>
+          <w:rPr>
+            <w:rStyle w:val="Hyperlink"/>
+          </w:rPr>
+          <w:t xml:space="preserve">https://doi.org/10.3390/su10061868</w:t>
+        </w:r>
+      </w:hyperlink>
+    </w:p>
+    <w:bookmarkEnd w:id="170"/>
+    <w:bookmarkStart w:id="172" w:name="ref-zhang2018veh"/>
+    <w:p>
+      <w:pPr>
+        <w:pStyle w:val="Bibliography"/>
+      </w:pPr>
+      <w:r>
+        <w:t xml:space="preserve">Zhang, Y., Zhang, Y., 2018b. Examining the relationship between household vehicle ownership and ridesharing behaviors in the united states. Sustainability 10, 2720.</w:t>
+      </w:r>
+      <w:r>
+        <w:t xml:space="preserve"> </w:t>
+      </w:r>
+      <w:hyperlink r:id="rId171">
+        <w:r>
+          <w:rPr>
+            <w:rStyle w:val="Hyperlink"/>
+          </w:rPr>
+          <w:t xml:space="preserve">https://doi.org/10.3390/su10082720</w:t>
+        </w:r>
+      </w:hyperlink>
+    </w:p>
+    <w:bookmarkEnd w:id="172"/>
+    <w:bookmarkStart w:id="174" w:name="ref-zhang2018ride"/>
+    <w:p>
+      <w:pPr>
+        <w:pStyle w:val="Bibliography"/>
+      </w:pPr>
+      <w:r>
+        <w:t xml:space="preserve">Zhang, Y., Zhang, Y., 2018c. Exploring the relationship between ridesharing and public transit use in the united states. International Journal of Environmental Research and Public Health 15, 1763.</w:t>
+      </w:r>
+      <w:r>
+        <w:t xml:space="preserve"> </w:t>
+      </w:r>
+      <w:hyperlink r:id="rId173">
+        <w:r>
+          <w:rPr>
+            <w:rStyle w:val="Hyperlink"/>
+          </w:rPr>
+          <w:t xml:space="preserve">https://doi.org/10.3390/ijerph15081763</w:t>
+        </w:r>
+      </w:hyperlink>
+    </w:p>
+    <w:bookmarkEnd w:id="174"/>
+    <w:bookmarkStart w:id="176" w:name="ref-zhou2014"/>
+    <w:p>
+      <w:pPr>
+        <w:pStyle w:val="Bibliography"/>
+      </w:pPr>
+      <w:r>
+        <w:t xml:space="preserve">Zhou, Y., Wang, X.(Cara)., 2014. Explore the relationship between online shopping and shopping trips: An analysis with the 2009 NHTS data. Transportation Research Part A: Policy and Practice 70, 1–9.</w:t>
+      </w:r>
+      <w:r>
+        <w:t xml:space="preserve"> </w:t>
+      </w:r>
+      <w:hyperlink r:id="rId175">
+        <w:r>
+          <w:rPr>
+            <w:rStyle w:val="Hyperlink"/>
+          </w:rPr>
+          <w:t xml:space="preserve">https://doi.org/10.1016/j.tra.2014.09.014</w:t>
+        </w:r>
+      </w:hyperlink>
+    </w:p>
+    <w:bookmarkEnd w:id="176"/>
+    <w:bookmarkEnd w:id="177"/>
     <w:bookmarkEnd w:id="178"/>
     <w:sectPr>
       <w:footnotePr>

</xml_diff>

<commit_message>
paper 02: second author, Related work section (EN+FA), 49 newly verified references, author-block fix
Revision from the LeapSpace-based draft (improve.md): only verified and fitting references ported (90 in refs.bib, SKIP set documented),
numbers stay injected, CRediT/AI-tool/competing-interests/funding left as AUTHOR-TODO. Typst template partial stacks the two-author block.

Co-Authored-By: Claude Sonnet 5.5 <noreply@anthropic.com>
</commit_message>
<xml_diff>
--- a/papers/02-nhts-ladder/manuscript/final/Paper02_NHTS_design_aware_ladder_EN.docx
+++ b/papers/02-nhts-ladder/manuscript/final/Paper02_NHTS_design_aware_ladder_EN.docx
@@ -16,6 +16,14 @@
       </w:pPr>
       <w:r>
         <w:t xml:space="preserve">Seyed Saber Naseralavi</w:t>
+      </w:r>
+    </w:p>
+    <w:p>
+      <w:pPr>
+        <w:pStyle w:val="Author"/>
+      </w:pPr>
+      <w:r>
+        <w:t xml:space="preserve">Akram Mazaheri</w:t>
       </w:r>
     </w:p>
     <w:bookmarkStart w:id="9" w:name="abstract"/>
@@ -236,7 +244,7 @@
         <w:t xml:space="preserve">(Hörl and Balac, 2021)</w:t>
       </w:r>
       <w:r>
-        <w:t xml:space="preserve">. We found no study that takes a body of published NHTS analyses, rebuilds their samples and tables, refits their models, and asks whether their conclusions survive the survey’s own design and a leakage-free validation. This is a gap in a double sense: the size of the effect of ignoring the design in transport regressions is unknown, and the extent to which published prediction scores depend on the validation pipeline is unknown.</w:t>
+        <w:t xml:space="preserve">. In searches of OpenAlex and Crossref, a duplication test and a ScienceDirect LeapSpace review (all described in the supplementary material) we found no study that takes a body of published NHTS analyses, rebuilds their samples and tables, refits their models, and asks whether their conclusions survive the survey’s own design and a leakage-free validation. The related work that follows gives the evidence behind this statement. This is a gap in a double sense: the size of the effect of ignoring the design in transport regressions is unknown, and the extent to which published prediction scores depend on the validation pipeline is unknown.</w:t>
       </w:r>
     </w:p>
     <w:p>
@@ -248,16 +256,315 @@
       </w:r>
     </w:p>
     <w:bookmarkEnd w:id="10"/>
-    <w:bookmarkStart w:id="24" w:name="materials-and-methods"/>
+    <w:bookmarkStart w:id="14" w:name="related-work"/>
     <w:p>
       <w:pPr>
         <w:pStyle w:val="Heading2"/>
       </w:pPr>
       <w:r>
+        <w:t xml:space="preserve">Related work</w:t>
+      </w:r>
+    </w:p>
+    <w:bookmarkStart w:id="11" w:name="Xf059d2c8451fe5db1aec7228380768f499eb45e"/>
+    <w:p>
+      <w:pPr>
+        <w:pStyle w:val="Heading3"/>
+      </w:pPr>
+      <w:r>
+        <w:t xml:space="preserve">Survey design, weights and variance in NHTS research</w:t>
+      </w:r>
+    </w:p>
+    <w:p>
+      <w:pPr>
+        <w:pStyle w:val="FirstParagraph"/>
+      </w:pPr>
+      <w:r>
+        <w:t xml:space="preserve">The NHTS is one of a family of national travel surveys whose designs differ between countries and change between waves</w:t>
+      </w:r>
+      <w:r>
+        <w:t xml:space="preserve"> </w:t>
+      </w:r>
+      <w:r>
+        <w:t xml:space="preserve">(McGuckin, 2021; Porschen and Kuhnimhof, 2026; Svaboe et al., 2024)</w:t>
+      </w:r>
+      <w:r>
+        <w:t xml:space="preserve">. Within the NHTS series the 2001 wave drew households from a telephone frame and the 2017 wave from an address-based frame; the public files of the 2001, 2009 and 2017 waves carry replicate weights, whereas those of the 2022 wave give strata and clusters for linearisation. Persons, vehicles and trips are tables nested in households, so that any analysis of a person or a trip is an analysis of clustered records with unequal weights.</w:t>
+      </w:r>
+    </w:p>
+    <w:p>
+      <w:pPr>
+        <w:pStyle w:val="BodyText"/>
+      </w:pPr>
+      <w:r>
+        <w:t xml:space="preserve">National descriptive portraits of urban, rural, older-adult and rear-seat travel routinely apply the final weights</w:t>
+      </w:r>
+      <w:r>
+        <w:t xml:space="preserve"> </w:t>
+      </w:r>
+      <w:r>
+        <w:t xml:space="preserve">(Collia et al., 2003; Krumm, 2012; Pucher and Renne, 2005; Trowbridge and Kent, 2009; Wang and Renne, 2023)</w:t>
+      </w:r>
+      <w:r>
+        <w:t xml:space="preserve">. Weights improve representation but do not cure missing coverage: work on how well household travel surveys capture vulnerable travellers, people with disabilities, respondents who report no travel at all, and groups that follow-up surveys lose shows that the people and trips that the weights must stand in for are the hardest to observe</w:t>
+      </w:r>
+      <w:r>
+        <w:t xml:space="preserve"> </w:t>
+      </w:r>
+      <w:r>
+        <w:t xml:space="preserve">(Christensen et al., 2025; Esekhaigbe et al., 2026; Shaw et al., 2021; Wang et al., 2022; Zhang and Maruyama, 2026)</w:t>
+      </w:r>
+      <w:r>
+        <w:t xml:space="preserve">. Weighting is therefore necessary for a national statement and not sufficient for a correct one.</w:t>
+      </w:r>
+    </w:p>
+    <w:p>
+      <w:pPr>
+        <w:pStyle w:val="BodyText"/>
+      </w:pPr>
+      <w:r>
+        <w:t xml:space="preserve">When the analysis moves from description to regression or choice modelling, the treatment of the design is less visible. Survey-weighted choice models of ride-sourcing</w:t>
+      </w:r>
+      <w:r>
+        <w:t xml:space="preserve"> </w:t>
+      </w:r>
+      <w:r>
+        <w:t xml:space="preserve">(Zou and Cirillo, 2021)</w:t>
+      </w:r>
+      <w:r>
+        <w:t xml:space="preserve"> </w:t>
+      </w:r>
+      <w:r>
+        <w:t xml:space="preserve">are an exception; regressions of bicycling, immigrant travel, older-adult travel and online shopping on the NHTS</w:t>
+      </w:r>
+      <w:r>
+        <w:t xml:space="preserve"> </w:t>
+      </w:r>
+      <w:r>
+        <w:t xml:space="preserve">(Barajas, 2021; Kim and Ulfarsson, 2021; Porter et al., 2020; Tribby and Tharp, 2019; Tumula et al., 2026; Yang, 2025)</w:t>
+      </w:r>
+      <w:r>
+        <w:t xml:space="preserve"> </w:t>
+      </w:r>
+      <w:r>
+        <w:t xml:space="preserve">are common, and of the eight regression studies of our own register that we could re-estimate only one used the replicate weights for its variance (</w:t>
+      </w:r>
+      <w:hyperlink w:anchor="tbl-census">
+        <w:r>
+          <w:rPr>
+            <w:rStyle w:val="Hyperlink"/>
+          </w:rPr>
+          <w:t xml:space="preserve">Table 4</w:t>
+        </w:r>
+      </w:hyperlink>
+      <w:r>
+        <w:t xml:space="preserve">). A search of abstracts (OpenAlex, and a ScienceDirect LeapSpace review run in October 2026) found the weight named far more often than the variance estimator. Abstracts are a poor guide to what an analysis did, so we do not count them; this is the reason for rebuilding the analyses. Design-aware work is concentrated in small-area estimation, where the design is the object of the paper</w:t>
+      </w:r>
+      <w:r>
+        <w:t xml:space="preserve"> </w:t>
+      </w:r>
+      <w:r>
+        <w:t xml:space="preserve">(Vaish et al., 2010)</w:t>
+      </w:r>
+      <w:r>
+        <w:t xml:space="preserve">, and in the few weighted choice models.</w:t>
+      </w:r>
+    </w:p>
+    <w:p>
+      <w:pPr>
+        <w:pStyle w:val="BodyText"/>
+      </w:pPr>
+      <w:r>
+        <w:t xml:space="preserve">The statistical background is old. The variance of an estimate under a complex design is obtained by Taylor linearisation</w:t>
+      </w:r>
+      <w:r>
+        <w:t xml:space="preserve"> </w:t>
+      </w:r>
+      <w:r>
+        <w:t xml:space="preserve">(Woodruff, 1971)</w:t>
+      </w:r>
+      <w:r>
+        <w:t xml:space="preserve"> </w:t>
+      </w:r>
+      <w:r>
+        <w:t xml:space="preserve">or by replication</w:t>
+      </w:r>
+      <w:r>
+        <w:t xml:space="preserve"> </w:t>
+      </w:r>
+      <w:r>
+        <w:t xml:space="preserve">(Rust and Rao, 1996; Wolter, 2007)</w:t>
+      </w:r>
+      <w:r>
+        <w:t xml:space="preserve">, the efficiency of the options and the cost of ignoring the design have been studied for decades</w:t>
+      </w:r>
+      <w:r>
+        <w:t xml:space="preserve"> </w:t>
+      </w:r>
+      <w:r>
+        <w:t xml:space="preserve">(Cohen et al., 1986; Johnson and Elliott, 1998; Korn and Graubard, 1999)</w:t>
+      </w:r>
+      <w:r>
+        <w:t xml:space="preserve">, and software for it exists in R</w:t>
+      </w:r>
+      <w:r>
+        <w:t xml:space="preserve"> </w:t>
+      </w:r>
+      <w:r>
+        <w:t xml:space="preserve">(Lumley, 2004)</w:t>
+      </w:r>
+      <w:r>
+        <w:t xml:space="preserve"> </w:t>
+      </w:r>
+      <w:r>
+        <w:t xml:space="preserve">and in commercial packages, whose differences and misuse are also documented</w:t>
+      </w:r>
+      <w:r>
+        <w:t xml:space="preserve"> </w:t>
+      </w:r>
+      <w:r>
+        <w:t xml:space="preserve">(Bergtold et al., 2017; Brogan, 2005;</w:t>
+      </w:r>
+      <w:r>
+        <w:t xml:space="preserve"> </w:t>
+      </w:r>
+      <w:r>
+        <w:t xml:space="preserve">de Sousa and da Silva</w:t>
+      </w:r>
+      <w:r>
+        <w:t xml:space="preserve">, 2000; Richardson et al., 2019)</w:t>
+      </w:r>
+      <w:r>
+        <w:t xml:space="preserve">. To our knowledge the Python scientific stack has no ready implementation of replicate-weight variance for count models, which is why the engine used in this paper is released in pynhts.</w:t>
+      </w:r>
+    </w:p>
+    <w:bookmarkEnd w:id="11"/>
+    <w:bookmarkStart w:id="12" w:name="Xfc041099c50d04356e6c63eb2b646f63b4ae595"/>
+    <w:p>
+      <w:pPr>
+        <w:pStyle w:val="Heading3"/>
+      </w:pPr>
+      <w:r>
+        <w:t xml:space="preserve">Reproducibility, analytic flexibility and validation leakage</w:t>
+      </w:r>
+    </w:p>
+    <w:p>
+      <w:pPr>
+        <w:pStyle w:val="FirstParagraph"/>
+      </w:pPr>
+      <w:r>
+        <w:t xml:space="preserve">Beyond the survey, the wider computational sciences have documented how often published results cannot be regenerated from the published description</w:t>
+      </w:r>
+      <w:r>
+        <w:t xml:space="preserve"> </w:t>
+      </w:r>
+      <w:r>
+        <w:t xml:space="preserve">(</w:t>
+      </w:r>
+      <w:r>
+        <w:t xml:space="preserve">Hardwicke et al.</w:t>
+      </w:r>
+      <w:r>
+        <w:t xml:space="preserve">, 2021; Peng, 2011; Stodden et al., 2018)</w:t>
+      </w:r>
+      <w:r>
+        <w:t xml:space="preserve">, and how the conclusions of independent analysts of one data set depend on defensible analytic choices</w:t>
+      </w:r>
+      <w:r>
+        <w:t xml:space="preserve"> </w:t>
+      </w:r>
+      <w:r>
+        <w:t xml:space="preserve">(Schweinsberg et al., 2021; Silberzahn et al., 2018; Simonsohn et al., 2020; Steegen et al., 2016)</w:t>
+      </w:r>
+      <w:r>
+        <w:t xml:space="preserve">. Travel research is exposed to the same dispersion: a comparison between national surveys, or between survey modes, rests on processing decisions that are seldom reported</w:t>
+      </w:r>
+      <w:r>
+        <w:t xml:space="preserve"> </w:t>
+      </w:r>
+      <w:r>
+        <w:t xml:space="preserve">(Nishikawa and Tawfik, 2022; Svaboe et al., 2024; Verreault and Morency, 2016)</w:t>
+      </w:r>
+      <w:r>
+        <w:t xml:space="preserve">.</w:t>
+      </w:r>
+    </w:p>
+    <w:p>
+      <w:pPr>
+        <w:pStyle w:val="BodyText"/>
+      </w:pPr>
+      <w:r>
+        <w:t xml:space="preserve">Prediction models add a layer of their own. Benchmarks of machine learning against discrete-choice models, and machine-learning trip models fitted to the NHTS, report that flexible models can match or beat classical ones</w:t>
+      </w:r>
+      <w:r>
+        <w:t xml:space="preserve"> </w:t>
+      </w:r>
+      <w:r>
+        <w:t xml:space="preserve">(Hagenauer and Helbich, 2017; Martín-Baos et al., 2023; Qawasmeh et al., 2024; Wang et al., 2024)</w:t>
+      </w:r>
+      <w:r>
+        <w:t xml:space="preserve">, while audits in other fields trace many over-optimistic scores to leakage between training and test data</w:t>
+      </w:r>
+      <w:r>
+        <w:t xml:space="preserve"> </w:t>
+      </w:r>
+      <w:r>
+        <w:t xml:space="preserve">(Kapoor et al., 2024; Kapoor and Narayanan, 2023; Rosenblatt et al., 2024)</w:t>
+      </w:r>
+      <w:r>
+        <w:t xml:space="preserve">. Two leaks are known in detail: oversampling a rare class before the split</w:t>
+      </w:r>
+      <w:r>
+        <w:t xml:space="preserve"> </w:t>
+      </w:r>
+      <w:r>
+        <w:t xml:space="preserve">(Blagus and Lusa, 2013; Chawla et al., 2002; Demircioğlu, 2024)</w:t>
+      </w:r>
+      <w:r>
+        <w:t xml:space="preserve"> </w:t>
+      </w:r>
+      <w:r>
+        <w:t xml:space="preserve">and a random split of rows that share a group</w:t>
+      </w:r>
+      <w:r>
+        <w:t xml:space="preserve"> </w:t>
+      </w:r>
+      <w:r>
+        <w:t xml:space="preserve">(Ploton et al., 2020; Roberts et al., 2017; Vabalas et al., 2019)</w:t>
+      </w:r>
+      <w:r>
+        <w:t xml:space="preserve">. Both are plausible in household travel data, in which a rare outcome such as electric vehicle ownership is common material for oversampling and household members are rows with almost the same inputs.</w:t>
+      </w:r>
+    </w:p>
+    <w:bookmarkEnd w:id="12"/>
+    <w:bookmarkStart w:id="13" w:name="gap-and-contribution"/>
+    <w:p>
+      <w:pPr>
+        <w:pStyle w:val="Heading3"/>
+      </w:pPr>
+      <w:r>
+        <w:t xml:space="preserve">Gap and contribution</w:t>
+      </w:r>
+    </w:p>
+    <w:p>
+      <w:pPr>
+        <w:pStyle w:val="FirstParagraph"/>
+      </w:pPr>
+      <w:r>
+        <w:t xml:space="preserve">Three questions are therefore open for the NHTS. How large is the effect of ignoring weights and design on published regressions? Which layer of the design produces it: the unequal weights, the clustering in households, or the replicate formula? And how much do published prediction scores depend on the validation pipeline? We found no study that answers them by rebuilding a body of published NHTS analyses. The contribution of this paper is a graded method for doing so, a decomposition of the standard-error difference into its layers, a leakage-free re-scoring of classifiers, and the tools for all three.</w:t>
+      </w:r>
+    </w:p>
+    <w:bookmarkEnd w:id="13"/>
+    <w:bookmarkEnd w:id="14"/>
+    <w:bookmarkStart w:id="28" w:name="materials-and-methods"/>
+    <w:p>
+      <w:pPr>
+        <w:pStyle w:val="Heading2"/>
+      </w:pPr>
+      <w:r>
         <w:t xml:space="preserve">Materials and methods</w:t>
       </w:r>
     </w:p>
-    <w:bookmarkStart w:id="12" w:name="the-case-study-set-and-the-data"/>
+    <w:bookmarkStart w:id="16" w:name="the-case-study-set-and-the-data"/>
     <w:p>
       <w:pPr>
         <w:pStyle w:val="Heading3"/>
@@ -294,7 +601,7 @@
         <w:t xml:space="preserve"> </w:t>
       </w:r>
       <w:r>
-        <w:t xml:space="preserve">and were collected by the authors while building the pynhts package, so they are a convenience set and not a systematic sample of the literature; we draw no conclusion about the share of all NHTS papers that behave like them. One study is by the author, who is also the package developer; it is included in the register but was not re-estimated here, and its models are reserved for a separate paper. Public-use NHTS files of 2001, 2009 and 2017 were obtained from the survey’s website through pynhts, which verifies each file against its codebook. All 22 studies use the 2001, 2009 or 2017 wave.</w:t>
+        <w:t xml:space="preserve">and were collected by the authors while building the pynhts package, so they are a convenience set and not a systematic sample of the literature; we draw no conclusion about the share of all NHTS papers that behave like them. One study was written by the two of us with colleagues, and the first author is also the developer of the package; it is included in the register but was not re-estimated here, so as to avoid grading our own work, and its models are reserved for a separate paper. Public-use NHTS files of 2001, 2009 and 2017 were obtained from the survey’s website through pynhts, which verifies each file against its codebook. All 22 studies use the 2001, 2009 or 2017 wave.</w:t>
       </w:r>
     </w:p>
     <w:tbl>
@@ -310,7 +617,7 @@
       <w:tr>
         <w:tc>
           <w:tcPr/>
-          <w:bookmarkStart w:id="11" w:name="tbl-studies"/>
+          <w:bookmarkStart w:id="15" w:name="tbl-studies"/>
           <w:p>
             <w:pPr>
               <w:jc w:val="center"/>
@@ -2483,13 +2790,13 @@
               </w:tc>
             </w:tr>
           </w:tbl>
-          <w:bookmarkEnd w:id="11"/>
+          <w:bookmarkEnd w:id="15"/>
           <w:p/>
         </w:tc>
       </w:tr>
     </w:tbl>
-    <w:bookmarkEnd w:id="12"/>
-    <w:bookmarkStart w:id="17" w:name="the-reproducibility-ladder"/>
+    <w:bookmarkEnd w:id="16"/>
+    <w:bookmarkStart w:id="21" w:name="the-reproducibility-ladder"/>
     <w:p>
       <w:pPr>
         <w:pStyle w:val="Heading3"/>
@@ -2582,7 +2889,7 @@
       <w:tr>
         <w:tc>
           <w:tcPr/>
-          <w:bookmarkStart w:id="16" w:name="fig-flow"/>
+          <w:bookmarkStart w:id="20" w:name="fig-flow"/>
           <w:p>
             <w:pPr>
               <w:pStyle w:val="Compact"/>
@@ -2593,18 +2900,18 @@
                 <wp:inline>
                   <wp:extent cx="5334000" cy="6652346"/>
                   <wp:effectExtent b="0" l="0" r="0" t="0"/>
-                  <wp:docPr descr="" title="" id="14" name="Picture"/>
+                  <wp:docPr descr="" title="" id="18" name="Picture"/>
                   <a:graphic>
                     <a:graphicData uri="http://schemas.openxmlformats.org/drawingml/2006/picture">
                       <pic:pic>
                         <pic:nvPicPr>
-                          <pic:cNvPr descr="figures/fig_flow_en.png" id="15" name="Picture"/>
+                          <pic:cNvPr descr="figures/fig_flow_en.png" id="19" name="Picture"/>
                           <pic:cNvPicPr>
                             <a:picLocks noChangeArrowheads="1" noChangeAspect="1"/>
                           </pic:cNvPicPr>
                         </pic:nvPicPr>
                         <pic:blipFill>
-                          <a:blip r:embed="rId13"/>
+                          <a:blip r:embed="rId17"/>
                           <a:stretch>
                             <a:fillRect/>
                           </a:stretch>
@@ -2644,12 +2951,12 @@
               <w:t xml:space="preserve">Figure 1: Method of the paper. Rungs L0 to L3 are applied to each published study; the box V rescoring a classifier applies to machine-learning studies. Diamonds are decisions; dashed boxes record what is carried forward.</w:t>
             </w:r>
           </w:p>
-          <w:bookmarkEnd w:id="16"/>
+          <w:bookmarkEnd w:id="20"/>
         </w:tc>
       </w:tr>
     </w:tbl>
-    <w:bookmarkEnd w:id="17"/>
-    <w:bookmarkStart w:id="18" w:name="four-ways-to-fit-the-same-model"/>
+    <w:bookmarkEnd w:id="21"/>
+    <w:bookmarkStart w:id="22" w:name="four-ways-to-fit-the-same-model"/>
     <w:p>
       <w:pPr>
         <w:pStyle w:val="Heading3"/>
@@ -3036,8 +3343,8 @@
         <w:t xml:space="preserve">. As independent checks, the logistic, Poisson and linear fits on adults of the 2017 person file were compared with the survey package in R (a replicate-weight design with the same factor): coefficients agreed to one part in one hundred thousand and standard errors to 0.2 per cent; the Taylor-series variance of the 2022 wave was checked against the same package in the same way. On the weekend negative binomial model of one study, 98 exact refits gave standard errors within 0.2 per cent of the Newton ones. The regime in which a study’s printed numbers were reproduced is reported as its declared estimator.</w:t>
       </w:r>
     </w:p>
-    <w:bookmarkEnd w:id="18"/>
-    <w:bookmarkStart w:id="19" w:name="models-of-the-case-studies"/>
+    <w:bookmarkEnd w:id="22"/>
+    <w:bookmarkStart w:id="23" w:name="models-of-the-case-studies"/>
     <w:p>
       <w:pPr>
         <w:pStyle w:val="Heading3"/>
@@ -3054,8 +3361,8 @@
         <w:t xml:space="preserve">Eight published regression studies were refitted: logistic regression of walking and cycling (two studies); ordinary least squares with fixed effects for vehicle make, state and density (one); negative binomial regression of daily trips (two); and zero-inflated negative binomial regression of monthly shared-mobility use (three). A structural equation model with two latent propensities, a propensity-score matching of ride-hailing user groups, a gradient-boosting regression of household online shopping and five classifiers of alternative-fuel and electric vehicle adoption complete the set. Where a printed coefficient table exists, each printed coefficient is a target of L2; where only a headline is printed (the public-transit effect in two ZINB studies, the elasticity in the OLS study), that headline is the target, and where it was derived from a percentage in the abstract this is stated in the supplement.</w:t>
       </w:r>
     </w:p>
-    <w:bookmarkEnd w:id="19"/>
-    <w:bookmarkStart w:id="22" w:name="X0a8db6fe9d878fe0e5282774f945f959d2d9afc"/>
+    <w:bookmarkEnd w:id="23"/>
+    <w:bookmarkStart w:id="26" w:name="X0a8db6fe9d878fe0e5282774f945f959d2d9afc"/>
     <w:p>
       <w:pPr>
         <w:pStyle w:val="Heading3"/>
@@ -3099,7 +3406,7 @@
       <w:tr>
         <w:tc>
           <w:tcPr/>
-          <w:bookmarkStart w:id="20" w:name="tbl-search"/>
+          <w:bookmarkStart w:id="24" w:name="tbl-search"/>
           <w:p>
             <w:pPr>
               <w:jc w:val="center"/>
@@ -3375,7 +3682,7 @@
               </w:tc>
             </w:tr>
           </w:tbl>
-          <w:bookmarkEnd w:id="20"/>
+          <w:bookmarkEnd w:id="24"/>
           <w:p/>
         </w:tc>
       </w:tr>
@@ -3516,7 +3823,7 @@
       <w:tr>
         <w:tc>
           <w:tcPr/>
-          <w:bookmarkStart w:id="21" w:name="tbl-holdout"/>
+          <w:bookmarkStart w:id="25" w:name="tbl-holdout"/>
           <w:p>
             <w:pPr>
               <w:jc w:val="center"/>
@@ -3762,13 +4069,13 @@
               </w:tc>
             </w:tr>
           </w:tbl>
-          <w:bookmarkEnd w:id="21"/>
+          <w:bookmarkEnd w:id="25"/>
           <w:p/>
         </w:tc>
       </w:tr>
     </w:tbl>
-    <w:bookmarkEnd w:id="22"/>
-    <w:bookmarkStart w:id="23" w:name="software-and-reproducibility"/>
+    <w:bookmarkEnd w:id="26"/>
+    <w:bookmarkStart w:id="27" w:name="software-and-reproducibility"/>
     <w:p>
       <w:pPr>
         <w:pStyle w:val="Heading3"/>
@@ -3812,9 +4119,9 @@
         <w:t xml:space="preserve">), with unit tests, a real-data test against R and documentation. The analysis plan, with the hypotheses and thresholds, was written before the models of the second half of the studies were run and is dated.</w:t>
       </w:r>
     </w:p>
-    <w:bookmarkEnd w:id="23"/>
-    <w:bookmarkEnd w:id="24"/>
-    <w:bookmarkStart w:id="57" w:name="results"/>
+    <w:bookmarkEnd w:id="27"/>
+    <w:bookmarkEnd w:id="28"/>
+    <w:bookmarkStart w:id="61" w:name="results"/>
     <w:p>
       <w:pPr>
         <w:pStyle w:val="Heading2"/>
@@ -3823,7 +4130,7 @@
         <w:t xml:space="preserve">Results</w:t>
       </w:r>
     </w:p>
-    <w:bookmarkStart w:id="29" w:name="what-could-be-rebuilt"/>
+    <w:bookmarkStart w:id="33" w:name="what-could-be-rebuilt"/>
     <w:p>
       <w:pPr>
         <w:pStyle w:val="Heading3"/>
@@ -3881,7 +4188,7 @@
       <w:tr>
         <w:tc>
           <w:tcPr/>
-          <w:bookmarkStart w:id="28" w:name="fig-ladder"/>
+          <w:bookmarkStart w:id="32" w:name="fig-ladder"/>
           <w:p>
             <w:pPr>
               <w:pStyle w:val="Compact"/>
@@ -3892,18 +4199,18 @@
                 <wp:inline>
                   <wp:extent cx="5334000" cy="4952999"/>
                   <wp:effectExtent b="0" l="0" r="0" t="0"/>
-                  <wp:docPr descr="" title="" id="26" name="Picture"/>
+                  <wp:docPr descr="" title="" id="30" name="Picture"/>
                   <a:graphic>
                     <a:graphicData uri="http://schemas.openxmlformats.org/drawingml/2006/picture">
                       <pic:pic>
                         <pic:nvPicPr>
-                          <pic:cNvPr descr="figures/fig_ladder.png" id="27" name="Picture"/>
+                          <pic:cNvPr descr="figures/fig_ladder.png" id="31" name="Picture"/>
                           <pic:cNvPicPr>
                             <a:picLocks noChangeArrowheads="1" noChangeAspect="1"/>
                           </pic:cNvPicPr>
                         </pic:nvPicPr>
                         <pic:blipFill>
-                          <a:blip r:embed="rId25"/>
+                          <a:blip r:embed="rId29"/>
                           <a:stretch>
                             <a:fillRect/>
                           </a:stretch>
@@ -3943,12 +4250,12 @@
               <w:t xml:space="preserve">Figure 2: The ladder for the 22 studies. Each row is a study, each column a rung; colours give the grade. The L3 column shows which models were re-estimated, not a grade.</w:t>
             </w:r>
           </w:p>
-          <w:bookmarkEnd w:id="28"/>
+          <w:bookmarkEnd w:id="32"/>
         </w:tc>
       </w:tr>
     </w:tbl>
-    <w:bookmarkEnd w:id="29"/>
-    <w:bookmarkStart w:id="34" w:name="X1e3e4d648db17e723338ea0f87372866b50b204"/>
+    <w:bookmarkEnd w:id="33"/>
+    <w:bookmarkStart w:id="38" w:name="X1e3e4d648db17e723338ea0f87372866b50b204"/>
     <w:p>
       <w:pPr>
         <w:pStyle w:val="Heading3"/>
@@ -3997,7 +4304,7 @@
       <w:tr>
         <w:tc>
           <w:tcPr/>
-          <w:bookmarkStart w:id="33" w:name="fig-weights"/>
+          <w:bookmarkStart w:id="37" w:name="fig-weights"/>
           <w:p>
             <w:pPr>
               <w:pStyle w:val="Compact"/>
@@ -4008,18 +4315,18 @@
                 <wp:inline>
                   <wp:extent cx="5334000" cy="4445000"/>
                   <wp:effectExtent b="0" l="0" r="0" t="0"/>
-                  <wp:docPr descr="" title="" id="31" name="Picture"/>
+                  <wp:docPr descr="" title="" id="35" name="Picture"/>
                   <a:graphic>
                     <a:graphicData uri="http://schemas.openxmlformats.org/drawingml/2006/picture">
                       <pic:pic>
                         <pic:nvPicPr>
-                          <pic:cNvPr descr="figures/fig_weights.png" id="32" name="Picture"/>
+                          <pic:cNvPr descr="figures/fig_weights.png" id="36" name="Picture"/>
                           <pic:cNvPicPr>
                             <a:picLocks noChangeArrowheads="1" noChangeAspect="1"/>
                           </pic:cNvPicPr>
                         </pic:nvPicPr>
                         <pic:blipFill>
-                          <a:blip r:embed="rId30"/>
+                          <a:blip r:embed="rId34"/>
                           <a:stretch>
                             <a:fillRect/>
                           </a:stretch>
@@ -4059,12 +4366,12 @@
               <w:t xml:space="preserve">Figure 3: Odds ratios of cycling to work in the study of Quinn and colleagues: printed, our unweighted fit and our weighted fit with replicate-weight variance. The shaded rows (reference letter H) are the education effects discussed in the text.</w:t>
             </w:r>
           </w:p>
-          <w:bookmarkEnd w:id="33"/>
+          <w:bookmarkEnd w:id="37"/>
         </w:tc>
       </w:tr>
     </w:tbl>
-    <w:bookmarkEnd w:id="34"/>
-    <w:bookmarkStart w:id="44" w:name="standard-errors-and-significance"/>
+    <w:bookmarkEnd w:id="38"/>
+    <w:bookmarkStart w:id="48" w:name="standard-errors-and-significance"/>
     <w:p>
       <w:pPr>
         <w:pStyle w:val="Heading3"/>
@@ -4144,7 +4451,7 @@
       <w:tr>
         <w:tc>
           <w:tcPr/>
-          <w:bookmarkStart w:id="38" w:name="fig-se"/>
+          <w:bookmarkStart w:id="42" w:name="fig-se"/>
           <w:p>
             <w:pPr>
               <w:pStyle w:val="Compact"/>
@@ -4155,18 +4462,18 @@
                 <wp:inline>
                   <wp:extent cx="5334000" cy="2424866"/>
                   <wp:effectExtent b="0" l="0" r="0" t="0"/>
-                  <wp:docPr descr="" title="" id="36" name="Picture"/>
+                  <wp:docPr descr="" title="" id="40" name="Picture"/>
                   <a:graphic>
                     <a:graphicData uri="http://schemas.openxmlformats.org/drawingml/2006/picture">
                       <pic:pic>
                         <pic:nvPicPr>
-                          <pic:cNvPr descr="figures/fig_se.png" id="37" name="Picture"/>
+                          <pic:cNvPr descr="figures/fig_se.png" id="41" name="Picture"/>
                           <pic:cNvPicPr>
                             <a:picLocks noChangeArrowheads="1" noChangeAspect="1"/>
                           </pic:cNvPicPr>
                         </pic:nvPicPr>
                         <pic:blipFill>
-                          <a:blip r:embed="rId35"/>
+                          <a:blip r:embed="rId39"/>
                           <a:stretch>
                             <a:fillRect/>
                           </a:stretch>
@@ -4206,7 +4513,7 @@
               <w:t xml:space="preserve">Figure 4: Where the standard-error difference comes from and what it changes. Panel A: ratios of standard errors over all re-estimated coefficients, by source (orange: median). Panel B: share of coefficients, significant under each study’s declared inference, that lose significance under the design-aware fit, by study.</w:t>
             </w:r>
           </w:p>
-          <w:bookmarkEnd w:id="38"/>
+          <w:bookmarkEnd w:id="42"/>
         </w:tc>
       </w:tr>
     </w:tbl>
@@ -4231,7 +4538,7 @@
       <w:tr>
         <w:tc>
           <w:tcPr/>
-          <w:bookmarkStart w:id="39" w:name="tbl-census"/>
+          <w:bookmarkStart w:id="43" w:name="tbl-census"/>
           <w:p>
             <w:pPr>
               <w:jc w:val="center"/>
@@ -5220,7 +5527,7 @@
               </w:tc>
             </w:tr>
           </w:tbl>
-          <w:bookmarkEnd w:id="39"/>
+          <w:bookmarkEnd w:id="43"/>
           <w:p/>
         </w:tc>
       </w:tr>
@@ -5257,7 +5564,7 @@
       <w:tr>
         <w:tc>
           <w:tcPr/>
-          <w:bookmarkStart w:id="43" w:name="fig-case"/>
+          <w:bookmarkStart w:id="47" w:name="fig-case"/>
           <w:p>
             <w:pPr>
               <w:pStyle w:val="Compact"/>
@@ -5268,18 +5575,18 @@
                 <wp:inline>
                   <wp:extent cx="5334000" cy="2204471"/>
                   <wp:effectExtent b="0" l="0" r="0" t="0"/>
-                  <wp:docPr descr="" title="" id="41" name="Picture"/>
+                  <wp:docPr descr="" title="" id="45" name="Picture"/>
                   <a:graphic>
                     <a:graphicData uri="http://schemas.openxmlformats.org/drawingml/2006/picture">
                       <pic:pic>
                         <pic:nvPicPr>
-                          <pic:cNvPr descr="figures/fig_case.png" id="42" name="Picture"/>
+                          <pic:cNvPr descr="figures/fig_case.png" id="46" name="Picture"/>
                           <pic:cNvPicPr>
                             <a:picLocks noChangeArrowheads="1" noChangeAspect="1"/>
                           </pic:cNvPicPr>
                         </pic:nvPicPr>
                         <pic:blipFill>
-                          <a:blip r:embed="rId40"/>
+                          <a:blip r:embed="rId44"/>
                           <a:stretch>
                             <a:fillRect/>
                           </a:stretch>
@@ -5319,12 +5626,12 @@
               <w:t xml:space="preserve">Figure 5: Shared-mobility terms of the weekday (panel A) and weekend (panel B) trip models of Jiao and colleagues, with ninety-five per cent intervals from the unweighted and the design-aware fit. Reference letter R marks the ridesharing row discussed in the text.</w:t>
             </w:r>
           </w:p>
-          <w:bookmarkEnd w:id="43"/>
+          <w:bookmarkEnd w:id="47"/>
         </w:tc>
       </w:tr>
     </w:tbl>
-    <w:bookmarkEnd w:id="44"/>
-    <w:bookmarkStart w:id="45" w:name="which-layer-of-the-design-matters"/>
+    <w:bookmarkEnd w:id="48"/>
+    <w:bookmarkStart w:id="49" w:name="which-layer-of-the-design-matters"/>
     <w:p>
       <w:pPr>
         <w:pStyle w:val="Heading3"/>
@@ -5358,8 +5665,8 @@
         <w:t xml:space="preserve">(panel A) says that the weights drive the difference and that, on average, the household clustering and the replicate formula add little. This is not a licence to skip the replicate formula. Per study, the median ratio of the replicate-weight to the household-clustered standard error ranged from 0.75 to 1.15, and for individual coefficients from 0.70 to 1.44 (fifth to ninety-fifth percentile); of the 182 coefficients significant under the weighted household-clustered fit, 16 (9 per cent) lost significance under the replicate variance, including the ride-hailing coefficient above. Where replicate weights exist they should be used; the household-clustered weighted fit is a reasonable fallback for the 2022 wave, where the design is expressed through strata and clusters, but it is an approximation that fails in some of exactly the cases that matter.</w:t>
       </w:r>
     </w:p>
-    <w:bookmarkEnd w:id="45"/>
-    <w:bookmarkStart w:id="46" w:name="X9773b3b0e82f28eae14e46ff1fa89417bf9792b"/>
+    <w:bookmarkEnd w:id="49"/>
+    <w:bookmarkStart w:id="50" w:name="X9773b3b0e82f28eae14e46ff1fa89417bf9792b"/>
     <w:p>
       <w:pPr>
         <w:pStyle w:val="Heading3"/>
@@ -5376,8 +5683,8 @@
         <w:t xml:space="preserve">The structural equation model of online shopping and shopping trips, which prints standardised coefficients, was fitted with the same variables except two that come from other sources, on 106,136 persons against the printed 85,663. Its two cross-effects were −0.08 and 0.17 in our weighted fit against 0.12 and 0.21 printed, with design standard errors of about 0.02. One cross-effect has the opposite sign and the other a different size, and the sign convention of the latent variables cannot repair both; we grade the model as not reproduced. For the propensity-score matching study of ride-hailing and vehicle miles, a greedy nearest-neighbour matching in the same strata gave 2,664 matched triples of persons with household vehicle access against about five thousand printed. Matched mean daily miles differed from the printed means (for frequent users 29.8 against 24.8 miles) and only one of the three vehicle contrasts was close to its printed value (non-users to occasional users −0.067 against −0.065); we grade the study as not reproduced. A design-aware comparison of matched samples is not straightforward, because weighting the two arms separately breaks the pairing and the replicate variance treats the matched sample as fixed; we report only that none of the three vehicle contrasts has a t statistic above two when the arms are weighted (0.95, 0.00 and 1.62), without comparing it with the paired statistic of the paper (2.45 for the first contrast).</w:t>
       </w:r>
     </w:p>
-    <w:bookmarkEnd w:id="46"/>
-    <w:bookmarkStart w:id="56" w:name="machine-learning-models"/>
+    <w:bookmarkEnd w:id="50"/>
+    <w:bookmarkStart w:id="60" w:name="machine-learning-models"/>
     <w:p>
       <w:pPr>
         <w:pStyle w:val="Heading3"/>
@@ -5437,7 +5744,7 @@
       <w:tr>
         <w:tc>
           <w:tcPr/>
-          <w:bookmarkStart w:id="47" w:name="tbl-auc"/>
+          <w:bookmarkStart w:id="51" w:name="tbl-auc"/>
           <w:p>
             <w:pPr>
               <w:jc w:val="center"/>
@@ -6638,7 +6945,7 @@
               </w:tc>
             </w:tr>
           </w:tbl>
-          <w:bookmarkEnd w:id="47"/>
+          <w:bookmarkEnd w:id="51"/>
           <w:p/>
         </w:tc>
       </w:tr>
@@ -6664,7 +6971,7 @@
       <w:tr>
         <w:tc>
           <w:tcPr/>
-          <w:bookmarkStart w:id="51" w:name="fig-leak"/>
+          <w:bookmarkStart w:id="55" w:name="fig-leak"/>
           <w:p>
             <w:pPr>
               <w:pStyle w:val="Compact"/>
@@ -6675,18 +6982,18 @@
                 <wp:inline>
                   <wp:extent cx="5334000" cy="2576038"/>
                   <wp:effectExtent b="0" l="0" r="0" t="0"/>
-                  <wp:docPr descr="" title="" id="49" name="Picture"/>
+                  <wp:docPr descr="" title="" id="53" name="Picture"/>
                   <a:graphic>
                     <a:graphicData uri="http://schemas.openxmlformats.org/drawingml/2006/picture">
                       <pic:pic>
                         <pic:nvPicPr>
-                          <pic:cNvPr descr="figures/fig_leak.png" id="50" name="Picture"/>
+                          <pic:cNvPr descr="figures/fig_leak.png" id="54" name="Picture"/>
                           <pic:cNvPicPr>
                             <a:picLocks noChangeArrowheads="1" noChangeAspect="1"/>
                           </pic:cNvPicPr>
                         </pic:nvPicPr>
                         <pic:blipFill>
-                          <a:blip r:embed="rId48"/>
+                          <a:blip r:embed="rId52"/>
                           <a:stretch>
                             <a:fillRect/>
                           </a:stretch>
@@ -6726,7 +7033,7 @@
               <w:t xml:space="preserve">Figure 6: Area under the ROC curve of five classifiers under four pipelines, for alternative-fuel vehicles (panel A) and electric vehicles (panel B). Filled circles: default settings of the first experiment; open triangles: all models tuned alike. Reference letter L marks the printed random-forest score of the study.</w:t>
             </w:r>
           </w:p>
-          <w:bookmarkEnd w:id="51"/>
+          <w:bookmarkEnd w:id="55"/>
         </w:tc>
       </w:tr>
     </w:tbl>
@@ -6762,7 +7069,7 @@
       <w:tr>
         <w:tc>
           <w:tcPr/>
-          <w:bookmarkStart w:id="55" w:name="fig-r2"/>
+          <w:bookmarkStart w:id="59" w:name="fig-r2"/>
           <w:p>
             <w:pPr>
               <w:pStyle w:val="Compact"/>
@@ -6773,18 +7080,18 @@
                 <wp:inline>
                   <wp:extent cx="5334000" cy="2494230"/>
                   <wp:effectExtent b="0" l="0" r="0" t="0"/>
-                  <wp:docPr descr="" title="" id="53" name="Picture"/>
+                  <wp:docPr descr="" title="" id="57" name="Picture"/>
                   <a:graphic>
                     <a:graphicData uri="http://schemas.openxmlformats.org/drawingml/2006/picture">
                       <pic:pic>
                         <pic:nvPicPr>
-                          <pic:cNvPr descr="figures/fig_r2.png" id="54" name="Picture"/>
+                          <pic:cNvPr descr="figures/fig_r2.png" id="58" name="Picture"/>
                           <pic:cNvPicPr>
                             <a:picLocks noChangeArrowheads="1" noChangeAspect="1"/>
                           </pic:cNvPicPr>
                         </pic:nvPicPr>
                         <pic:blipFill>
-                          <a:blip r:embed="rId52"/>
+                          <a:blip r:embed="rId56"/>
                           <a:stretch>
                             <a:fillRect/>
                           </a:stretch>
@@ -6824,13 +7131,13 @@
               <w:t xml:space="preserve">Figure 7: Held-out R-squared of four regression models for household online purchases in 2009 (panel A) and 2017 (panel B): printed values and our values for random and for whole-state hold-out.</w:t>
             </w:r>
           </w:p>
-          <w:bookmarkEnd w:id="55"/>
+          <w:bookmarkEnd w:id="59"/>
         </w:tc>
       </w:tr>
     </w:tbl>
-    <w:bookmarkEnd w:id="56"/>
-    <w:bookmarkEnd w:id="57"/>
-    <w:bookmarkStart w:id="58" w:name="discussion"/>
+    <w:bookmarkEnd w:id="60"/>
+    <w:bookmarkEnd w:id="61"/>
+    <w:bookmarkStart w:id="62" w:name="discussion"/>
     <w:p>
       <w:pPr>
         <w:pStyle w:val="Heading2"/>
@@ -6992,7 +7299,16 @@
         <w:t xml:space="preserve"> </w:t>
       </w:r>
       <w:r>
-        <w:t xml:space="preserve">The case-study set is a convenience set of 22 studies, and 13 of them were refitted; the share of fragile conclusions among all NHTS papers is therefore not estimated. The pooled census mixes studies of different size; the declared-inference version restricts the comparison to what each study did. Two zero-inflated studies could not be graded because their printed headline cannot be mapped onto a coefficient; they contribute design effects only. Our fits reproduce some printed values only approximately because the published samples cannot be rebuilt exactly. The matching study used a greedy matching, not the optimal matching of the original. The machine-learning experiments use five classifiers with ten tuning trials each, a modest search that makes the comparison fair but not exhaustive, and score person rows with the household weight. We did not test whether the weights are informative about the outcomes, which would be the formal basis for choosing between the weighted and the unweighted estimand. The 2022 wave, which has no replicate weights, would use linearisation; it is implemented and checked against R but not exercised on the case studies. Finally, we describe conclusions as design-sensitive; we do not say they are wrong.</w:t>
+        <w:t xml:space="preserve">The case-study set is a convenience set of 22 studies, and 13 of them were refitted; the share of fragile conclusions among all NHTS papers is therefore not estimated. The pooled census mixes studies of different size; the declared-inference version restricts the comparison to what each study did. Two zero-inflated studies could not be graded because their printed headline cannot be mapped onto a coefficient; they contribute design effects only. Our fits reproduce some printed values only approximately because the published samples cannot be rebuilt exactly. The matching study used a greedy matching, not the optimal matching of the original. The machine-learning experiments use five classifiers with ten tuning trials each, a modest search that makes the comparison fair but not exhaustive, and score person rows with the household weight. We did not test whether the weights are informative about the outcomes, which would be the formal basis for choosing between the weighted and the unweighted estimand</w:t>
+      </w:r>
+      <w:r>
+        <w:t xml:space="preserve"> </w:t>
+      </w:r>
+      <w:r>
+        <w:t xml:space="preserve">(Bollen et al., 2016)</w:t>
+      </w:r>
+      <w:r>
+        <w:t xml:space="preserve">. The statements on how the wider literature reports weights and variance rest on our register and on abstract-level searches, not on a systematic review of full texts. The 2022 wave, which has no replicate weights, would use linearisation; it is implemented and checked against R but not exercised on the case studies. Finally, we describe conclusions as design-sensitive; we do not say they are wrong.</w:t>
       </w:r>
     </w:p>
     <w:p>
@@ -7010,11 +7326,53 @@
         <w:t xml:space="preserve"> </w:t>
       </w:r>
       <w:r>
-        <w:t xml:space="preserve">For authors: state whether weights were used and why, and for which population the coefficients are meant; report standard errors from the survey design or, when only strata and clusters are available, with household-clustered errors; and give the sample-flow table with the number of records removed by each rule. For prediction models: split by household before anything else, oversample only the training rows, report a weighted score, and tune every model alike. For reviewers: a significance star from an unweighted NHTS regression is a statement about respondents, and an area under the curve from a random split of oversampled rows should trigger a question.</w:t>
-      </w:r>
-    </w:p>
-    <w:bookmarkEnd w:id="58"/>
-    <w:bookmarkStart w:id="59" w:name="conclusions"/>
+        <w:t xml:space="preserve">For authors: name the weight variable (</w:t>
+      </w:r>
+      <w:r>
+        <w:rPr>
+          <w:rStyle w:val="VerbatimChar"/>
+        </w:rPr>
+        <w:t xml:space="preserve">WTPERFIN</w:t>
+      </w:r>
+      <w:r>
+        <w:t xml:space="preserve"> </w:t>
+      </w:r>
+      <w:r>
+        <w:t xml:space="preserve">for persons,</w:t>
+      </w:r>
+      <w:r>
+        <w:t xml:space="preserve"> </w:t>
+      </w:r>
+      <w:r>
+        <w:rPr>
+          <w:rStyle w:val="VerbatimChar"/>
+        </w:rPr>
+        <w:t xml:space="preserve">WTHHFIN</w:t>
+      </w:r>
+      <w:r>
+        <w:t xml:space="preserve"> </w:t>
+      </w:r>
+      <w:r>
+        <w:t xml:space="preserve">for households,</w:t>
+      </w:r>
+      <w:r>
+        <w:t xml:space="preserve"> </w:t>
+      </w:r>
+      <w:r>
+        <w:rPr>
+          <w:rStyle w:val="VerbatimChar"/>
+        </w:rPr>
+        <w:t xml:space="preserve">WTTRDFIN</w:t>
+      </w:r>
+      <w:r>
+        <w:t xml:space="preserve"> </w:t>
+      </w:r>
+      <w:r>
+        <w:t xml:space="preserve">for trips), say whether weights were used and why, and for which population the coefficients are meant; report standard errors from the survey design (the replicate weights, or strata and clusters for the 2022 wave) or, when neither is used, with household-clustered errors and a statement that they are an approximation; analyse a subgroup as a domain of the full sample and not by dropping the other rows; and give the sample-flow table with the number of records removed by each rule. For prediction models: split by household before anything else, oversample only the training rows, report a weighted score, and tune every model alike. For reviewers: a significance star from an unweighted NHTS regression is a statement about respondents, and an area under the curve from a random split of oversampled rows should trigger a question.</w:t>
+      </w:r>
+    </w:p>
+    <w:bookmarkEnd w:id="62"/>
+    <w:bookmarkStart w:id="63" w:name="conclusions"/>
     <w:p>
       <w:pPr>
         <w:pStyle w:val="Heading2"/>
@@ -7058,8 +7416,8 @@
         <w:t xml:space="preserve">, so that other researchers can run the same check on their own analyses.</w:t>
       </w:r>
     </w:p>
-    <w:bookmarkEnd w:id="59"/>
-    <w:bookmarkStart w:id="60" w:name="declarations"/>
+    <w:bookmarkEnd w:id="63"/>
+    <w:bookmarkStart w:id="64" w:name="declarations"/>
     <w:p>
       <w:pPr>
         <w:pStyle w:val="Heading2"/>
@@ -7083,7 +7441,25 @@
         <w:t xml:space="preserve"> </w:t>
       </w:r>
       <w:r>
-        <w:t xml:space="preserve">During the preparation of this work the author used Claude (Anthropic) as an assistant for study planning, writing and running analysis code, literature screening, and drafting and editing the text. After using this tool, the author reviewed, verified and edited the material (code, results, references and text) and takes full responsibility for the content of the publication. Numbers in the text are injected by code from the result files, and the references were checked against bibliographic databases.</w:t>
+        <w:t xml:space="preserve">During the preparation of this work the authors used Claude (Anthropic) as an assistant for study planning, writing and running analysis code, literature screening, and drafting and editing the text, and ScienceDirect LeapSpace (Elsevier) to search the literature and to draft a revision of the introduction and the related work. After using these tools, the authors reviewed, verified and edited the material (code, results, references and text) and take full responsibility for the content of the publication. Numbers in the text are injected by code from the result files, and every reference was resolved in Crossref and checked for retraction. [[AUTHOR-TODO: confirm the complete list of AI tools used; the draft revision supplied for this version also names Gemini.]]</w:t>
+      </w:r>
+    </w:p>
+    <w:p>
+      <w:pPr>
+        <w:pStyle w:val="BodyText"/>
+      </w:pPr>
+      <w:r>
+        <w:rPr>
+          <w:b/>
+          <w:bCs/>
+        </w:rPr>
+        <w:t xml:space="preserve">CRediT authorship contribution statement.</w:t>
+      </w:r>
+      <w:r>
+        <w:t xml:space="preserve"> </w:t>
+      </w:r>
+      <w:r>
+        <w:t xml:space="preserve">[[AUTHOR-TODO: the authors state their own CRediT roles; none has been given yet.]]</w:t>
       </w:r>
     </w:p>
     <w:p>
@@ -7101,7 +7477,7 @@
         <w:t xml:space="preserve"> </w:t>
       </w:r>
       <w:r>
-        <w:t xml:space="preserve">The author developed the pynhts package whose modules are described here and is the author of one of the case-study papers; that paper was included in the register and not re-estimated. [[AUTHOR-TODO: confirm the standard competing-interests sentence and any co-authors.]]</w:t>
+        <w:t xml:space="preserve">The first author developed the pynhts package whose modules are described here, and both authors co-authored one of the case-study papers; that paper was included in the register and not re-estimated. [[AUTHOR-TODO: confirm the standard sentence that the authors have no other competing interests.]]</w:t>
       </w:r>
     </w:p>
     <w:p>
@@ -7140,8 +7516,8 @@
         <w:t xml:space="preserve">The NHTS public-use files are available from the survey’s website. The code, result tables and the package are in the open repository of pynhts (https://github.com/sabernaseralavi-60/pynhts), archived with a persistent identifier on Zenodo.</w:t>
       </w:r>
     </w:p>
-    <w:bookmarkEnd w:id="60"/>
-    <w:bookmarkStart w:id="66" w:name="supplementary-material"/>
+    <w:bookmarkEnd w:id="64"/>
+    <w:bookmarkStart w:id="70" w:name="supplementary-material"/>
     <w:p>
       <w:pPr>
         <w:pStyle w:val="Heading2"/>
@@ -7178,6 +7554,57 @@
       </w:r>
       <w:r>
         <w:t xml:space="preserve">): three studies were run before the plan was frozen; the grading tolerance had a floor of two units of the last printed digit; hypothesis three was evaluated against each study’s declared inference (the first draft pooled against the unweighted fit); hypothesis four was reformulated after the printed score proved reproducible by neither pipeline; the tuned run used two seeds; a decomposition of the standard-error ratio, an unweighted household-clustered fit and a check of Newton against exact replicate refits were added after an external review; the printed targets of two zero-inflated studies were dropped because they cannot be mapped onto coefficients.</w:t>
+      </w:r>
+    </w:p>
+    <w:p>
+      <w:pPr>
+        <w:pStyle w:val="BodyText"/>
+      </w:pPr>
+      <w:r>
+        <w:rPr>
+          <w:b/>
+          <w:bCs/>
+        </w:rPr>
+        <w:t xml:space="preserve">Literature search.</w:t>
+      </w:r>
+      <w:r>
+        <w:t xml:space="preserve"> </w:t>
+      </w:r>
+      <w:r>
+        <w:t xml:space="preserve">The related work rests on three searches in October 2026: keyword and citation searches of OpenAlex and Crossref on survey weights, replicate variance, reproducibility and leakage (query log in the repository,</w:t>
+      </w:r>
+      <w:r>
+        <w:t xml:space="preserve"> </w:t>
+      </w:r>
+      <w:r>
+        <w:rPr>
+          <w:rStyle w:val="VerbatimChar"/>
+        </w:rPr>
+        <w:t xml:space="preserve">lit/search_log.md</w:t>
+      </w:r>
+      <w:r>
+        <w:t xml:space="preserve">); a duplication test of the paper’s question against twelve neighbouring papers, which found none that re-estimates published NHTS regressions or classifiers under the survey design; and a ScienceDirect LeapSpace review of how NHTS studies handle design, weights and variance. Every reference cited was resolved in Crossref with its metadata and checked against OpenAlex for retraction (</w:t>
+      </w:r>
+      <w:r>
+        <w:rPr>
+          <w:rStyle w:val="VerbatimChar"/>
+        </w:rPr>
+        <w:t xml:space="preserve">lit/verify_refs.py</w:t>
+      </w:r>
+      <w:r>
+        <w:t xml:space="preserve">,</w:t>
+      </w:r>
+      <w:r>
+        <w:t xml:space="preserve"> </w:t>
+      </w:r>
+      <w:r>
+        <w:rPr>
+          <w:rStyle w:val="VerbatimChar"/>
+        </w:rPr>
+        <w:t xml:space="preserve">lit/verified.csv</w:t>
+      </w:r>
+      <w:r>
+        <w:t xml:space="preserve">); references that could not be resolved, and candidates whose subject did not support the sentence they were proposed for, were left out. This is not a formal systematic review.</w:t>
       </w:r>
     </w:p>
     <w:tbl>
@@ -7193,7 +7620,7 @@
       <w:tr>
         <w:tc>
           <w:tcPr/>
-          <w:bookmarkStart w:id="64" w:name="fig-holdout"/>
+          <w:bookmarkStart w:id="68" w:name="fig-holdout"/>
           <w:p>
             <w:pPr>
               <w:pStyle w:val="Compact"/>
@@ -7204,18 +7631,18 @@
                 <wp:inline>
                   <wp:extent cx="5334000" cy="2273968"/>
                   <wp:effectExtent b="0" l="0" r="0" t="0"/>
-                  <wp:docPr descr="" title="" id="62" name="Picture"/>
+                  <wp:docPr descr="" title="" id="66" name="Picture"/>
                   <a:graphic>
                     <a:graphicData uri="http://schemas.openxmlformats.org/drawingml/2006/picture">
                       <pic:pic>
                         <pic:nvPicPr>
-                          <pic:cNvPr descr="figures/fig_holdout.png" id="63" name="Picture"/>
+                          <pic:cNvPr descr="figures/fig_holdout.png" id="67" name="Picture"/>
                           <pic:cNvPicPr>
                             <a:picLocks noChangeArrowheads="1" noChangeAspect="1"/>
                           </pic:cNvPicPr>
                         </pic:nvPicPr>
                         <pic:blipFill>
-                          <a:blip r:embed="rId61"/>
+                          <a:blip r:embed="rId65"/>
                           <a:stretch>
                             <a:fillRect/>
                           </a:stretch>
@@ -7255,7 +7682,7 @@
               <w:t xml:space="preserve">Figure 8: Frequency histogram of the rare class (share of alternative-fuel vehicles, panel A, and of electric vehicles, panel B) in all rows, in the training households and in the held-out households of each of the three splits.</w:t>
             </w:r>
           </w:p>
-          <w:bookmarkEnd w:id="64"/>
+          <w:bookmarkEnd w:id="68"/>
         </w:tc>
       </w:tr>
     </w:tbl>
@@ -7280,7 +7707,7 @@
       <w:tr>
         <w:tc>
           <w:tcPr/>
-          <w:bookmarkStart w:id="65" w:name="tbl-selected"/>
+          <w:bookmarkStart w:id="69" w:name="tbl-selected"/>
           <w:p>
             <w:pPr>
               <w:jc w:val="center"/>
@@ -7905,13 +8332,13 @@
               </w:tc>
             </w:tr>
           </w:tbl>
-          <w:bookmarkEnd w:id="65"/>
+          <w:bookmarkEnd w:id="69"/>
           <w:p/>
         </w:tc>
       </w:tr>
     </w:tbl>
-    <w:bookmarkEnd w:id="66"/>
-    <w:bookmarkStart w:id="178" w:name="references"/>
+    <w:bookmarkEnd w:id="70"/>
+    <w:bookmarkStart w:id="244" w:name="references"/>
     <w:p>
       <w:pPr>
         <w:pStyle w:val="Heading2"/>
@@ -7920,8 +8347,8 @@
         <w:t xml:space="preserve">References</w:t>
       </w:r>
     </w:p>
-    <w:bookmarkStart w:id="177" w:name="refs"/>
-    <w:bookmarkStart w:id="68" w:name="ref-alberini2021"/>
+    <w:bookmarkStart w:id="243" w:name="refs"/>
+    <w:bookmarkStart w:id="72" w:name="ref-alberini2021"/>
     <w:p>
       <w:pPr>
         <w:pStyle w:val="Bibliography"/>
@@ -7932,7 +8359,7 @@
       <w:r>
         <w:t xml:space="preserve"> </w:t>
       </w:r>
-      <w:hyperlink r:id="rId67">
+      <w:hyperlink r:id="rId71">
         <w:r>
           <w:rPr>
             <w:rStyle w:val="Hyperlink"/>
@@ -7941,19 +8368,40 @@
         </w:r>
       </w:hyperlink>
     </w:p>
-    <w:bookmarkEnd w:id="68"/>
-    <w:bookmarkStart w:id="70" w:name="ref-barua2021"/>
+    <w:bookmarkEnd w:id="72"/>
+    <w:bookmarkStart w:id="74" w:name="ref-barajas2021"/>
     <w:p>
       <w:pPr>
         <w:pStyle w:val="Bibliography"/>
       </w:pPr>
       <w:r>
+        <w:t xml:space="preserve">Barajas, J.M., 2021. The effects of driver licensing laws on immigrant travel. Transport Policy 105, 22–34.</w:t>
+      </w:r>
+      <w:r>
+        <w:t xml:space="preserve"> </w:t>
+      </w:r>
+      <w:hyperlink r:id="rId73">
+        <w:r>
+          <w:rPr>
+            <w:rStyle w:val="Hyperlink"/>
+          </w:rPr>
+          <w:t xml:space="preserve">https://doi.org/10.1016/j.tranpol.2021.02.010</w:t>
+        </w:r>
+      </w:hyperlink>
+    </w:p>
+    <w:bookmarkEnd w:id="74"/>
+    <w:bookmarkStart w:id="76" w:name="ref-barua2021"/>
+    <w:p>
+      <w:pPr>
+        <w:pStyle w:val="Bibliography"/>
+      </w:pPr>
+      <w:r>
         <w:t xml:space="preserve">Barua, L., Zou, B., Zhou, Y., Liu, Y., 2021. Modeling household online shopping demand in the u.s.: A machine learning approach and comparative investigation between 2009 and 2017. Transportation 50, 437–476.</w:t>
       </w:r>
       <w:r>
         <w:t xml:space="preserve"> </w:t>
       </w:r>
-      <w:hyperlink r:id="rId69">
+      <w:hyperlink r:id="rId75">
         <w:r>
           <w:rPr>
             <w:rStyle w:val="Hyperlink"/>
@@ -7962,19 +8410,40 @@
         </w:r>
       </w:hyperlink>
     </w:p>
-    <w:bookmarkEnd w:id="70"/>
-    <w:bookmarkStart w:id="72" w:name="ref-birrell2019"/>
+    <w:bookmarkEnd w:id="76"/>
+    <w:bookmarkStart w:id="78" w:name="ref-bergtold2018"/>
     <w:p>
       <w:pPr>
         <w:pStyle w:val="Bibliography"/>
       </w:pPr>
       <w:r>
+        <w:t xml:space="preserve">Bergtold, J.S., Pokharel, K.P., Featherstone, A.M., Mo, L., 2017. On the examination of the reliability of statistical software for estimating regression models with discrete dependent variables. Computational Statistics 33, 757–786.</w:t>
+      </w:r>
+      <w:r>
+        <w:t xml:space="preserve"> </w:t>
+      </w:r>
+      <w:hyperlink r:id="rId77">
+        <w:r>
+          <w:rPr>
+            <w:rStyle w:val="Hyperlink"/>
+          </w:rPr>
+          <w:t xml:space="preserve">https://doi.org/10.1007/s00180-017-0776-5</w:t>
+        </w:r>
+      </w:hyperlink>
+    </w:p>
+    <w:bookmarkEnd w:id="78"/>
+    <w:bookmarkStart w:id="80" w:name="ref-birrell2019"/>
+    <w:p>
+      <w:pPr>
+        <w:pStyle w:val="Bibliography"/>
+      </w:pPr>
+      <w:r>
         <w:t xml:space="preserve">Birrell, C.L., Steel, D.G., Batterham, M.J., Arya, A., 2019. How to use replicate weights in health survey analysis using the national nutrition and physical activity survey as an example. Public Health Nutrition 22, 3315–3326.</w:t>
       </w:r>
       <w:r>
         <w:t xml:space="preserve"> </w:t>
       </w:r>
-      <w:hyperlink r:id="rId71">
+      <w:hyperlink r:id="rId79">
         <w:r>
           <w:rPr>
             <w:rStyle w:val="Hyperlink"/>
@@ -7983,8 +8452,8 @@
         </w:r>
       </w:hyperlink>
     </w:p>
-    <w:bookmarkEnd w:id="72"/>
-    <w:bookmarkStart w:id="74" w:name="ref-blagus2013"/>
+    <w:bookmarkEnd w:id="80"/>
+    <w:bookmarkStart w:id="82" w:name="ref-blagus2013"/>
     <w:p>
       <w:pPr>
         <w:pStyle w:val="Bibliography"/>
@@ -7995,7 +8464,7 @@
       <w:r>
         <w:t xml:space="preserve"> </w:t>
       </w:r>
-      <w:hyperlink r:id="rId73">
+      <w:hyperlink r:id="rId81">
         <w:r>
           <w:rPr>
             <w:rStyle w:val="Hyperlink"/>
@@ -8004,8 +8473,8 @@
         </w:r>
       </w:hyperlink>
     </w:p>
-    <w:bookmarkEnd w:id="74"/>
-    <w:bookmarkStart w:id="76" w:name="ref-bollen2016"/>
+    <w:bookmarkEnd w:id="82"/>
+    <w:bookmarkStart w:id="84" w:name="ref-bollen2016"/>
     <w:p>
       <w:pPr>
         <w:pStyle w:val="Bibliography"/>
@@ -8016,7 +8485,7 @@
       <w:r>
         <w:t xml:space="preserve"> </w:t>
       </w:r>
-      <w:hyperlink r:id="rId75">
+      <w:hyperlink r:id="rId83">
         <w:r>
           <w:rPr>
             <w:rStyle w:val="Hyperlink"/>
@@ -8025,19 +8494,40 @@
         </w:r>
       </w:hyperlink>
     </w:p>
-    <w:bookmarkEnd w:id="76"/>
-    <w:bookmarkStart w:id="78" w:name="ref-chawla2002"/>
+    <w:bookmarkEnd w:id="84"/>
+    <w:bookmarkStart w:id="86" w:name="ref-brogan2006"/>
     <w:p>
       <w:pPr>
         <w:pStyle w:val="Bibliography"/>
       </w:pPr>
       <w:r>
+        <w:t xml:space="preserve">Brogan, D., 2005. Software for sample survey data, misuse of standard packages. Encyclopedia of Biostatistics.</w:t>
+      </w:r>
+      <w:r>
+        <w:t xml:space="preserve"> </w:t>
+      </w:r>
+      <w:hyperlink r:id="rId85">
+        <w:r>
+          <w:rPr>
+            <w:rStyle w:val="Hyperlink"/>
+          </w:rPr>
+          <w:t xml:space="preserve">https://doi.org/10.1002/0470011815.b2a16072</w:t>
+        </w:r>
+      </w:hyperlink>
+    </w:p>
+    <w:bookmarkEnd w:id="86"/>
+    <w:bookmarkStart w:id="88" w:name="ref-chawla2002"/>
+    <w:p>
+      <w:pPr>
+        <w:pStyle w:val="Bibliography"/>
+      </w:pPr>
+      <w:r>
         <w:t xml:space="preserve">Chawla, N.V., Bowyer, K.W., Hall, L.O., Kegelmeyer, W.P., 2002. SMOTE: Synthetic minority over-sampling technique. Journal of Artificial Intelligence Research 16, 321–357.</w:t>
       </w:r>
       <w:r>
         <w:t xml:space="preserve"> </w:t>
       </w:r>
-      <w:hyperlink r:id="rId77">
+      <w:hyperlink r:id="rId87">
         <w:r>
           <w:rPr>
             <w:rStyle w:val="Hyperlink"/>
@@ -8046,19 +8536,82 @@
         </w:r>
       </w:hyperlink>
     </w:p>
-    <w:bookmarkEnd w:id="78"/>
-    <w:bookmarkStart w:id="80" w:name="ref-conway2018"/>
+    <w:bookmarkEnd w:id="88"/>
+    <w:bookmarkStart w:id="90" w:name="ref-christensen2025"/>
     <w:p>
       <w:pPr>
         <w:pStyle w:val="Bibliography"/>
       </w:pPr>
       <w:r>
+        <w:t xml:space="preserve">Christensen, K.M., Chamberlain, B., Park, K., Abrishami, M., Sheen, J.C., Larsen, T., 2025. Surveying people with disabilities: Insights on methods and challenges. Transportation Research Interdisciplinary Perspectives 34, 101702.</w:t>
+      </w:r>
+      <w:r>
+        <w:t xml:space="preserve"> </w:t>
+      </w:r>
+      <w:hyperlink r:id="rId89">
+        <w:r>
+          <w:rPr>
+            <w:rStyle w:val="Hyperlink"/>
+          </w:rPr>
+          <w:t xml:space="preserve">https://doi.org/10.1016/j.trip.2025.101702</w:t>
+        </w:r>
+      </w:hyperlink>
+    </w:p>
+    <w:bookmarkEnd w:id="90"/>
+    <w:bookmarkStart w:id="92" w:name="ref-cohen1986"/>
+    <w:p>
+      <w:pPr>
+        <w:pStyle w:val="Bibliography"/>
+      </w:pPr>
+      <w:r>
+        <w:t xml:space="preserve">Cohen, S.B., Burt, V.L., Jones, G.K., 1986. Efficiencies in variance estimation for complex survey data. The American Statistician 40, 157–164.</w:t>
+      </w:r>
+      <w:r>
+        <w:t xml:space="preserve"> </w:t>
+      </w:r>
+      <w:hyperlink r:id="rId91">
+        <w:r>
+          <w:rPr>
+            <w:rStyle w:val="Hyperlink"/>
+          </w:rPr>
+          <w:t xml:space="preserve">https://doi.org/10.1080/00031305.1986.10475383</w:t>
+        </w:r>
+      </w:hyperlink>
+    </w:p>
+    <w:bookmarkEnd w:id="92"/>
+    <w:bookmarkStart w:id="94" w:name="ref-collia2003"/>
+    <w:p>
+      <w:pPr>
+        <w:pStyle w:val="Bibliography"/>
+      </w:pPr>
+      <w:r>
+        <w:t xml:space="preserve">Collia, D.V., Sharp, J., Giesbrecht, L., 2003. The 2001 national household travel survey: A look into the travel patterns of older americans. Journal of Safety Research 34, 461–470.</w:t>
+      </w:r>
+      <w:r>
+        <w:t xml:space="preserve"> </w:t>
+      </w:r>
+      <w:hyperlink r:id="rId93">
+        <w:r>
+          <w:rPr>
+            <w:rStyle w:val="Hyperlink"/>
+          </w:rPr>
+          <w:t xml:space="preserve">https://doi.org/10.1016/j.jsr.2003.10.001</w:t>
+        </w:r>
+      </w:hyperlink>
+    </w:p>
+    <w:bookmarkEnd w:id="94"/>
+    <w:bookmarkStart w:id="96" w:name="ref-conway2018"/>
+    <w:p>
+      <w:pPr>
+        <w:pStyle w:val="Bibliography"/>
+      </w:pPr>
+      <w:r>
         <w:t xml:space="preserve">Conway, M.W., Salon, D., King, D.A., 2018. Trends in taxi use and the advent of ridehailing, 1995–2017: Evidence from the US national household travel survey. Urban Science 2, 79.</w:t>
       </w:r>
       <w:r>
         <w:t xml:space="preserve"> </w:t>
       </w:r>
-      <w:hyperlink r:id="rId79">
+      <w:hyperlink r:id="rId95">
         <w:r>
           <w:rPr>
             <w:rStyle w:val="Hyperlink"/>
@@ -8067,19 +8620,43 @@
         </w:r>
       </w:hyperlink>
     </w:p>
-    <w:bookmarkEnd w:id="80"/>
-    <w:bookmarkStart w:id="82" w:name="ref-deka2019"/>
+    <w:bookmarkEnd w:id="96"/>
+    <w:bookmarkStart w:id="98" w:name="ref-desousa2000"/>
     <w:p>
       <w:pPr>
         <w:pStyle w:val="Bibliography"/>
       </w:pPr>
       <w:r>
+        <w:t xml:space="preserve">de Sousa, M.H., da Silva, N.N.</w:t>
+      </w:r>
+      <w:r>
+        <w:t xml:space="preserve">, 2000. Comparação de softwares para análise de dados de levantamentos complexos. Revista de Saúde Pública 34, 646–653.</w:t>
+      </w:r>
+      <w:r>
+        <w:t xml:space="preserve"> </w:t>
+      </w:r>
+      <w:hyperlink r:id="rId97">
+        <w:r>
+          <w:rPr>
+            <w:rStyle w:val="Hyperlink"/>
+          </w:rPr>
+          <w:t xml:space="preserve">https://doi.org/10.1590/s0034-89102000000600013</w:t>
+        </w:r>
+      </w:hyperlink>
+    </w:p>
+    <w:bookmarkEnd w:id="98"/>
+    <w:bookmarkStart w:id="100" w:name="ref-deka2019"/>
+    <w:p>
+      <w:pPr>
+        <w:pStyle w:val="Bibliography"/>
+      </w:pPr>
+      <w:r>
         <w:t xml:space="preserve">Deka, D., Fei, D., 2019. A comparison of the personal and neighborhood characteristics associated with ridesourcing, transit use, and driving with NHTS data. Journal of Transport Geography 76, 24–33.</w:t>
       </w:r>
       <w:r>
         <w:t xml:space="preserve"> </w:t>
       </w:r>
-      <w:hyperlink r:id="rId81">
+      <w:hyperlink r:id="rId99">
         <w:r>
           <w:rPr>
             <w:rStyle w:val="Hyperlink"/>
@@ -8088,8 +8665,8 @@
         </w:r>
       </w:hyperlink>
     </w:p>
-    <w:bookmarkEnd w:id="82"/>
-    <w:bookmarkStart w:id="84" w:name="ref-demircioglu2024"/>
+    <w:bookmarkEnd w:id="100"/>
+    <w:bookmarkStart w:id="102" w:name="ref-demircioglu2024"/>
     <w:p>
       <w:pPr>
         <w:pStyle w:val="Bibliography"/>
@@ -8100,7 +8677,7 @@
       <w:r>
         <w:t xml:space="preserve"> </w:t>
       </w:r>
-      <w:hyperlink r:id="rId83">
+      <w:hyperlink r:id="rId101">
         <w:r>
           <w:rPr>
             <w:rStyle w:val="Hyperlink"/>
@@ -8109,19 +8686,40 @@
         </w:r>
       </w:hyperlink>
     </w:p>
-    <w:bookmarkEnd w:id="84"/>
-    <w:bookmarkStart w:id="86" w:name="ref-fu2020"/>
+    <w:bookmarkEnd w:id="102"/>
+    <w:bookmarkStart w:id="104" w:name="ref-esekhaigbe2026"/>
     <w:p>
       <w:pPr>
         <w:pStyle w:val="Bibliography"/>
       </w:pPr>
       <w:r>
+        <w:t xml:space="preserve">Esekhaigbe, E., Bills, T.S., Broaddus, A., 2026. Group representation of vulnerable travelers in household travel surveys: An assessment of 43 u.s. surveys. Transportation.</w:t>
+      </w:r>
+      <w:r>
+        <w:t xml:space="preserve"> </w:t>
+      </w:r>
+      <w:hyperlink r:id="rId103">
+        <w:r>
+          <w:rPr>
+            <w:rStyle w:val="Hyperlink"/>
+          </w:rPr>
+          <w:t xml:space="preserve">https://doi.org/10.1007/s11116-026-10795-x</w:t>
+        </w:r>
+      </w:hyperlink>
+    </w:p>
+    <w:bookmarkEnd w:id="104"/>
+    <w:bookmarkStart w:id="106" w:name="ref-fu2020"/>
+    <w:p>
+      <w:pPr>
+        <w:pStyle w:val="Bibliography"/>
+      </w:pPr>
+      <w:r>
         <w:t xml:space="preserve">Fu, Z., Liu, W., Zhu, J., Yuan, Y., 2020. Trip chain simulation of electric vehicles based on NHTS data. 2020 12th IEEE PES Asia-Pacific Power and Energy Engineering Conference (APPEEC) 1–6.</w:t>
       </w:r>
       <w:r>
         <w:t xml:space="preserve"> </w:t>
       </w:r>
-      <w:hyperlink r:id="rId85">
+      <w:hyperlink r:id="rId105">
         <w:r>
           <w:rPr>
             <w:rStyle w:val="Hyperlink"/>
@@ -8130,8 +8728,8 @@
         </w:r>
       </w:hyperlink>
     </w:p>
-    <w:bookmarkEnd w:id="86"/>
-    <w:bookmarkStart w:id="88" w:name="ref-gard2023"/>
+    <w:bookmarkEnd w:id="106"/>
+    <w:bookmarkStart w:id="108" w:name="ref-gard2023"/>
     <w:p>
       <w:pPr>
         <w:pStyle w:val="Bibliography"/>
@@ -8142,7 +8740,7 @@
       <w:r>
         <w:t xml:space="preserve"> </w:t>
       </w:r>
-      <w:hyperlink r:id="rId87">
+      <w:hyperlink r:id="rId107">
         <w:r>
           <w:rPr>
             <w:rStyle w:val="Hyperlink"/>
@@ -8151,8 +8749,8 @@
         </w:r>
       </w:hyperlink>
     </w:p>
-    <w:bookmarkEnd w:id="88"/>
-    <w:bookmarkStart w:id="90" w:name="ref-gelman2007"/>
+    <w:bookmarkEnd w:id="108"/>
+    <w:bookmarkStart w:id="110" w:name="ref-gelman2007"/>
     <w:p>
       <w:pPr>
         <w:pStyle w:val="Bibliography"/>
@@ -8163,7 +8761,7 @@
       <w:r>
         <w:t xml:space="preserve"> </w:t>
       </w:r>
-      <w:hyperlink r:id="rId89">
+      <w:hyperlink r:id="rId109">
         <w:r>
           <w:rPr>
             <w:rStyle w:val="Hyperlink"/>
@@ -8172,8 +8770,8 @@
         </w:r>
       </w:hyperlink>
     </w:p>
-    <w:bookmarkEnd w:id="90"/>
-    <w:bookmarkStart w:id="92" w:name="ref-hagenauer2017"/>
+    <w:bookmarkEnd w:id="110"/>
+    <w:bookmarkStart w:id="112" w:name="ref-hagenauer2017"/>
     <w:p>
       <w:pPr>
         <w:pStyle w:val="Bibliography"/>
@@ -8184,7 +8782,7 @@
       <w:r>
         <w:t xml:space="preserve"> </w:t>
       </w:r>
-      <w:hyperlink r:id="rId91">
+      <w:hyperlink r:id="rId111">
         <w:r>
           <w:rPr>
             <w:rStyle w:val="Hyperlink"/>
@@ -8193,8 +8791,8 @@
         </w:r>
       </w:hyperlink>
     </w:p>
-    <w:bookmarkEnd w:id="92"/>
-    <w:bookmarkStart w:id="94" w:name="ref-hardwicke2021"/>
+    <w:bookmarkEnd w:id="112"/>
+    <w:bookmarkStart w:id="114" w:name="ref-hardwicke2021"/>
     <w:p>
       <w:pPr>
         <w:pStyle w:val="Bibliography"/>
@@ -8208,7 +8806,7 @@
       <w:r>
         <w:t xml:space="preserve"> </w:t>
       </w:r>
-      <w:hyperlink r:id="rId93">
+      <w:hyperlink r:id="rId113">
         <w:r>
           <w:rPr>
             <w:rStyle w:val="Hyperlink"/>
@@ -8217,8 +8815,8 @@
         </w:r>
       </w:hyperlink>
     </w:p>
-    <w:bookmarkEnd w:id="94"/>
-    <w:bookmarkStart w:id="96" w:name="ref-horl2021"/>
+    <w:bookmarkEnd w:id="114"/>
+    <w:bookmarkStart w:id="116" w:name="ref-horl2021"/>
     <w:p>
       <w:pPr>
         <w:pStyle w:val="Bibliography"/>
@@ -8229,7 +8827,7 @@
       <w:r>
         <w:t xml:space="preserve"> </w:t>
       </w:r>
-      <w:hyperlink r:id="rId95">
+      <w:hyperlink r:id="rId115">
         <w:r>
           <w:rPr>
             <w:rStyle w:val="Hyperlink"/>
@@ -8238,8 +8836,8 @@
         </w:r>
       </w:hyperlink>
     </w:p>
-    <w:bookmarkEnd w:id="96"/>
-    <w:bookmarkStart w:id="98" w:name="ref-jia2019"/>
+    <w:bookmarkEnd w:id="116"/>
+    <w:bookmarkStart w:id="118" w:name="ref-jia2019"/>
     <w:p>
       <w:pPr>
         <w:pStyle w:val="Bibliography"/>
@@ -8250,7 +8848,7 @@
       <w:r>
         <w:t xml:space="preserve"> </w:t>
       </w:r>
-      <w:hyperlink r:id="rId97">
+      <w:hyperlink r:id="rId117">
         <w:r>
           <w:rPr>
             <w:rStyle w:val="Hyperlink"/>
@@ -8259,8 +8857,8 @@
         </w:r>
       </w:hyperlink>
     </w:p>
-    <w:bookmarkEnd w:id="98"/>
-    <w:bookmarkStart w:id="100" w:name="ref-jia2020"/>
+    <w:bookmarkEnd w:id="118"/>
+    <w:bookmarkStart w:id="120" w:name="ref-jia2020"/>
     <w:p>
       <w:pPr>
         <w:pStyle w:val="Bibliography"/>
@@ -8271,7 +8869,7 @@
       <w:r>
         <w:t xml:space="preserve"> </w:t>
       </w:r>
-      <w:hyperlink r:id="rId99">
+      <w:hyperlink r:id="rId119">
         <w:r>
           <w:rPr>
             <w:rStyle w:val="Hyperlink"/>
@@ -8280,8 +8878,8 @@
         </w:r>
       </w:hyperlink>
     </w:p>
-    <w:bookmarkEnd w:id="100"/>
-    <w:bookmarkStart w:id="102" w:name="ref-jiao2020"/>
+    <w:bookmarkEnd w:id="120"/>
+    <w:bookmarkStart w:id="122" w:name="ref-jiao2020"/>
     <w:p>
       <w:pPr>
         <w:pStyle w:val="Bibliography"/>
@@ -8292,7 +8890,7 @@
       <w:r>
         <w:t xml:space="preserve"> </w:t>
       </w:r>
-      <w:hyperlink r:id="rId101">
+      <w:hyperlink r:id="rId121">
         <w:r>
           <w:rPr>
             <w:rStyle w:val="Hyperlink"/>
@@ -8301,19 +8899,40 @@
         </w:r>
       </w:hyperlink>
     </w:p>
-    <w:bookmarkEnd w:id="102"/>
-    <w:bookmarkStart w:id="104" w:name="ref-kapoor2024reforms"/>
+    <w:bookmarkEnd w:id="122"/>
+    <w:bookmarkStart w:id="124" w:name="ref-johnson1998"/>
     <w:p>
       <w:pPr>
         <w:pStyle w:val="Bibliography"/>
       </w:pPr>
       <w:r>
+        <w:t xml:space="preserve">Johnson, D.R., Elliott, L.A., 1998. Sampling design effects: Do they affect the analyses of data from the national survey of families and households? Journal of Marriage and the Family 60, 993.</w:t>
+      </w:r>
+      <w:r>
+        <w:t xml:space="preserve"> </w:t>
+      </w:r>
+      <w:hyperlink r:id="rId123">
+        <w:r>
+          <w:rPr>
+            <w:rStyle w:val="Hyperlink"/>
+          </w:rPr>
+          <w:t xml:space="preserve">https://doi.org/10.2307/353640</w:t>
+        </w:r>
+      </w:hyperlink>
+    </w:p>
+    <w:bookmarkEnd w:id="124"/>
+    <w:bookmarkStart w:id="126" w:name="ref-kapoor2024reforms"/>
+    <w:p>
+      <w:pPr>
+        <w:pStyle w:val="Bibliography"/>
+      </w:pPr>
+      <w:r>
         <w:t xml:space="preserve">Kapoor, S., Cantrell, E.M., Peng, K., Pham, T.H., Bail, C.A., Gundersen, O.E., Hofman, J.M., Hullman, J., Lones, M.A., Malik, M.M., Nanayakkara, P., Poldrack, R.A., Raji, I.D., Roberts, M., Salganik, M.J., Serra-Garcia, M., Stewart, B.M., Vandewiele, G., Narayanan, A., 2024. REFORMS: Consensus-based recommendations for machine-learning-based science. Science Advances 10, eadk3452.</w:t>
       </w:r>
       <w:r>
         <w:t xml:space="preserve"> </w:t>
       </w:r>
-      <w:hyperlink r:id="rId103">
+      <w:hyperlink r:id="rId125">
         <w:r>
           <w:rPr>
             <w:rStyle w:val="Hyperlink"/>
@@ -8322,8 +8941,8 @@
         </w:r>
       </w:hyperlink>
     </w:p>
-    <w:bookmarkEnd w:id="104"/>
-    <w:bookmarkStart w:id="106" w:name="ref-kapoor2023"/>
+    <w:bookmarkEnd w:id="126"/>
+    <w:bookmarkStart w:id="128" w:name="ref-kapoor2023"/>
     <w:p>
       <w:pPr>
         <w:pStyle w:val="Bibliography"/>
@@ -8334,7 +8953,7 @@
       <w:r>
         <w:t xml:space="preserve"> </w:t>
       </w:r>
-      <w:hyperlink r:id="rId105">
+      <w:hyperlink r:id="rId127">
         <w:r>
           <w:rPr>
             <w:rStyle w:val="Hyperlink"/>
@@ -8343,13 +8962,55 @@
         </w:r>
       </w:hyperlink>
     </w:p>
-    <w:bookmarkEnd w:id="106"/>
-    <w:bookmarkStart w:id="108" w:name="ref-krizek2019"/>
+    <w:bookmarkEnd w:id="128"/>
+    <w:bookmarkStart w:id="130" w:name="ref-kim2021"/>
     <w:p>
       <w:pPr>
         <w:pStyle w:val="Bibliography"/>
       </w:pPr>
       <w:r>
+        <w:t xml:space="preserve">Kim, S., Ulfarsson, G.F., 2021. Staying home or going places: Mobility factors of older minority women’s daily trip making in the united states. Journal of Transport &amp; Health 21, 101031.</w:t>
+      </w:r>
+      <w:r>
+        <w:t xml:space="preserve"> </w:t>
+      </w:r>
+      <w:hyperlink r:id="rId129">
+        <w:r>
+          <w:rPr>
+            <w:rStyle w:val="Hyperlink"/>
+          </w:rPr>
+          <w:t xml:space="preserve">https://doi.org/10.1016/j.jth.2021.101031</w:t>
+        </w:r>
+      </w:hyperlink>
+    </w:p>
+    <w:bookmarkEnd w:id="130"/>
+    <w:bookmarkStart w:id="132" w:name="ref-korn1999"/>
+    <w:p>
+      <w:pPr>
+        <w:pStyle w:val="Bibliography"/>
+      </w:pPr>
+      <w:r>
+        <w:t xml:space="preserve">Korn, E.L., Graubard, B.I., 1999. Analysis of health surveys. Wiley.</w:t>
+      </w:r>
+      <w:r>
+        <w:t xml:space="preserve"> </w:t>
+      </w:r>
+      <w:hyperlink r:id="rId131">
+        <w:r>
+          <w:rPr>
+            <w:rStyle w:val="Hyperlink"/>
+          </w:rPr>
+          <w:t xml:space="preserve">https://doi.org/10.1002/9781118032619</w:t>
+        </w:r>
+      </w:hyperlink>
+    </w:p>
+    <w:bookmarkEnd w:id="132"/>
+    <w:bookmarkStart w:id="134" w:name="ref-krizek2019"/>
+    <w:p>
+      <w:pPr>
+        <w:pStyle w:val="Bibliography"/>
+      </w:pPr>
+      <w:r>
         <w:t xml:space="preserve">Krizek, K.J., McGuckin, N., 2019. Shedding NHTS light on the use of</w:t>
       </w:r>
       <w:r>
@@ -8367,7 +9028,7 @@
       <w:r>
         <w:t xml:space="preserve"> </w:t>
       </w:r>
-      <w:hyperlink r:id="rId107">
+      <w:hyperlink r:id="rId133">
         <w:r>
           <w:rPr>
             <w:rStyle w:val="Hyperlink"/>
@@ -8376,19 +9037,40 @@
         </w:r>
       </w:hyperlink>
     </w:p>
-    <w:bookmarkEnd w:id="108"/>
-    <w:bookmarkStart w:id="110" w:name="ref-lambert1992"/>
+    <w:bookmarkEnd w:id="134"/>
+    <w:bookmarkStart w:id="136" w:name="ref-krumm2012"/>
     <w:p>
       <w:pPr>
         <w:pStyle w:val="Bibliography"/>
       </w:pPr>
       <w:r>
+        <w:t xml:space="preserve">Krumm, J., 2012. How people use their vehicles: Statistics from the 2009 national household travel survey. SAE Technical Paper Series 1, 2012-01-0489.</w:t>
+      </w:r>
+      <w:r>
+        <w:t xml:space="preserve"> </w:t>
+      </w:r>
+      <w:hyperlink r:id="rId135">
+        <w:r>
+          <w:rPr>
+            <w:rStyle w:val="Hyperlink"/>
+          </w:rPr>
+          <w:t xml:space="preserve">https://doi.org/10.4271/2012-01-0489</w:t>
+        </w:r>
+      </w:hyperlink>
+    </w:p>
+    <w:bookmarkEnd w:id="136"/>
+    <w:bookmarkStart w:id="138" w:name="ref-lambert1992"/>
+    <w:p>
+      <w:pPr>
+        <w:pStyle w:val="Bibliography"/>
+      </w:pPr>
+      <w:r>
         <w:t xml:space="preserve">Lambert, D., 1992. Zero-inflated poisson regression, with an application to defects in manufacturing. Technometrics 34, 1.</w:t>
       </w:r>
       <w:r>
         <w:t xml:space="preserve"> </w:t>
       </w:r>
-      <w:hyperlink r:id="rId109">
+      <w:hyperlink r:id="rId137">
         <w:r>
           <w:rPr>
             <w:rStyle w:val="Hyperlink"/>
@@ -8397,8 +9079,8 @@
         </w:r>
       </w:hyperlink>
     </w:p>
-    <w:bookmarkEnd w:id="110"/>
-    <w:bookmarkStart w:id="112" w:name="ref-lidbe2021"/>
+    <w:bookmarkEnd w:id="138"/>
+    <w:bookmarkStart w:id="140" w:name="ref-lidbe2021"/>
     <w:p>
       <w:pPr>
         <w:pStyle w:val="Bibliography"/>
@@ -8409,7 +9091,7 @@
       <w:r>
         <w:t xml:space="preserve"> </w:t>
       </w:r>
-      <w:hyperlink r:id="rId111">
+      <w:hyperlink r:id="rId139">
         <w:r>
           <w:rPr>
             <w:rStyle w:val="Hyperlink"/>
@@ -8418,8 +9100,8 @@
         </w:r>
       </w:hyperlink>
     </w:p>
-    <w:bookmarkEnd w:id="112"/>
-    <w:bookmarkStart w:id="114" w:name="ref-lumley2004"/>
+    <w:bookmarkEnd w:id="140"/>
+    <w:bookmarkStart w:id="142" w:name="ref-lumley2004"/>
     <w:p>
       <w:pPr>
         <w:pStyle w:val="Bibliography"/>
@@ -8430,7 +9112,7 @@
       <w:r>
         <w:t xml:space="preserve"> </w:t>
       </w:r>
-      <w:hyperlink r:id="rId113">
+      <w:hyperlink r:id="rId141">
         <w:r>
           <w:rPr>
             <w:rStyle w:val="Hyperlink"/>
@@ -8439,8 +9121,8 @@
         </w:r>
       </w:hyperlink>
     </w:p>
-    <w:bookmarkEnd w:id="114"/>
-    <w:bookmarkStart w:id="116" w:name="ref-martinbaos2023"/>
+    <w:bookmarkEnd w:id="142"/>
+    <w:bookmarkStart w:id="144" w:name="ref-martinbaos2023"/>
     <w:p>
       <w:pPr>
         <w:pStyle w:val="Bibliography"/>
@@ -8451,7 +9133,7 @@
       <w:r>
         <w:t xml:space="preserve"> </w:t>
       </w:r>
-      <w:hyperlink r:id="rId115">
+      <w:hyperlink r:id="rId143">
         <w:r>
           <w:rPr>
             <w:rStyle w:val="Hyperlink"/>
@@ -8460,19 +9142,40 @@
         </w:r>
       </w:hyperlink>
     </w:p>
-    <w:bookmarkEnd w:id="116"/>
-    <w:bookmarkStart w:id="118" w:name="ref-naseralavi2025"/>
+    <w:bookmarkEnd w:id="144"/>
+    <w:bookmarkStart w:id="146" w:name="ref-mcguckin2021"/>
     <w:p>
       <w:pPr>
         <w:pStyle w:val="Bibliography"/>
       </w:pPr>
       <w:r>
+        <w:t xml:space="preserve">McGuckin, N., 2021. The national household travel survey data series (NPTS/NHTS). International Encyclopedia of Transportation 493–495.</w:t>
+      </w:r>
+      <w:r>
+        <w:t xml:space="preserve"> </w:t>
+      </w:r>
+      <w:hyperlink r:id="rId145">
+        <w:r>
+          <w:rPr>
+            <w:rStyle w:val="Hyperlink"/>
+          </w:rPr>
+          <w:t xml:space="preserve">https://doi.org/10.1016/B978-0-08-102671-7.10372-0</w:t>
+        </w:r>
+      </w:hyperlink>
+    </w:p>
+    <w:bookmarkEnd w:id="146"/>
+    <w:bookmarkStart w:id="148" w:name="ref-naseralavi2025"/>
+    <w:p>
+      <w:pPr>
+        <w:pStyle w:val="Bibliography"/>
+      </w:pPr>
+      <w:r>
         <w:t xml:space="preserve">Naseralavi, S., Soltanirad, M., Ranjbar, E., Lucero, M., Gorzin, F., Hakiminejad, Y., Azimi, S., Baghersad, M., Mazaheri, A., 2025. Machine learning modeling of household trip generation by state using NHTS data. Urban Science 9, 353.</w:t>
       </w:r>
       <w:r>
         <w:t xml:space="preserve"> </w:t>
       </w:r>
-      <w:hyperlink r:id="rId117">
+      <w:hyperlink r:id="rId147">
         <w:r>
           <w:rPr>
             <w:rStyle w:val="Hyperlink"/>
@@ -8481,19 +9184,40 @@
         </w:r>
       </w:hyperlink>
     </w:p>
-    <w:bookmarkEnd w:id="118"/>
-    <w:bookmarkStart w:id="120" w:name="ref-peng2011"/>
+    <w:bookmarkEnd w:id="148"/>
+    <w:bookmarkStart w:id="150" w:name="ref-nishikawa2022"/>
     <w:p>
       <w:pPr>
         <w:pStyle w:val="Bibliography"/>
       </w:pPr>
       <w:r>
+        <w:t xml:space="preserve">Nishikawa, A., Tawfik, A.M., 2022. An exploratory comparison of international travel behavior differences: Travel activity, travel time, and travel distance in great britain, new zealand, and the united states. International Conference on Transportation and Development 2022 122–132.</w:t>
+      </w:r>
+      <w:r>
+        <w:t xml:space="preserve"> </w:t>
+      </w:r>
+      <w:hyperlink r:id="rId149">
+        <w:r>
+          <w:rPr>
+            <w:rStyle w:val="Hyperlink"/>
+          </w:rPr>
+          <w:t xml:space="preserve">https://doi.org/10.1061/9780784484340.011</w:t>
+        </w:r>
+      </w:hyperlink>
+    </w:p>
+    <w:bookmarkEnd w:id="150"/>
+    <w:bookmarkStart w:id="152" w:name="ref-peng2011"/>
+    <w:p>
+      <w:pPr>
+        <w:pStyle w:val="Bibliography"/>
+      </w:pPr>
+      <w:r>
         <w:t xml:space="preserve">Peng, R.D., 2011. Reproducible research in computational science. Science 334, 1226–1227.</w:t>
       </w:r>
       <w:r>
         <w:t xml:space="preserve"> </w:t>
       </w:r>
-      <w:hyperlink r:id="rId119">
+      <w:hyperlink r:id="rId151">
         <w:r>
           <w:rPr>
             <w:rStyle w:val="Hyperlink"/>
@@ -8502,8 +9226,8 @@
         </w:r>
       </w:hyperlink>
     </w:p>
-    <w:bookmarkEnd w:id="120"/>
-    <w:bookmarkStart w:id="122" w:name="ref-ploton2020"/>
+    <w:bookmarkEnd w:id="152"/>
+    <w:bookmarkStart w:id="154" w:name="ref-ploton2020"/>
     <w:p>
       <w:pPr>
         <w:pStyle w:val="Bibliography"/>
@@ -8514,7 +9238,7 @@
       <w:r>
         <w:t xml:space="preserve"> </w:t>
       </w:r>
-      <w:hyperlink r:id="rId121">
+      <w:hyperlink r:id="rId153">
         <w:r>
           <w:rPr>
             <w:rStyle w:val="Hyperlink"/>
@@ -8523,19 +9247,103 @@
         </w:r>
       </w:hyperlink>
     </w:p>
-    <w:bookmarkEnd w:id="122"/>
-    <w:bookmarkStart w:id="124" w:name="ref-quinn2016"/>
+    <w:bookmarkEnd w:id="154"/>
+    <w:bookmarkStart w:id="156" w:name="ref-porschen2026"/>
     <w:p>
       <w:pPr>
         <w:pStyle w:val="Bibliography"/>
       </w:pPr>
       <w:r>
+        <w:t xml:space="preserve">Porschen, M., Kuhnimhof, T., 2026. The state of national travel surveys: Design characteristics, impact of the pandemic and the move to new technologies. Transportation Research Procedia 97, 99–109.</w:t>
+      </w:r>
+      <w:r>
+        <w:t xml:space="preserve"> </w:t>
+      </w:r>
+      <w:hyperlink r:id="rId155">
+        <w:r>
+          <w:rPr>
+            <w:rStyle w:val="Hyperlink"/>
+          </w:rPr>
+          <w:t xml:space="preserve">https://doi.org/10.1016/j.trpro.2026.04.147</w:t>
+        </w:r>
+      </w:hyperlink>
+    </w:p>
+    <w:bookmarkEnd w:id="156"/>
+    <w:bookmarkStart w:id="158" w:name="ref-porter2020"/>
+    <w:p>
+      <w:pPr>
+        <w:pStyle w:val="Bibliography"/>
+      </w:pPr>
+      <w:r>
+        <w:t xml:space="preserve">Porter, A.K., Kontou, E., McDonald, N.C., Evenson, K.R., 2020. Perceived barriers to commuter and exercise bicycling in u.s. Adults: The 2017 national household travel survey. Journal of Transport &amp; Health 16, 100820.</w:t>
+      </w:r>
+      <w:r>
+        <w:t xml:space="preserve"> </w:t>
+      </w:r>
+      <w:hyperlink r:id="rId157">
+        <w:r>
+          <w:rPr>
+            <w:rStyle w:val="Hyperlink"/>
+          </w:rPr>
+          <w:t xml:space="preserve">https://doi.org/10.1016/j.jth.2020.100820</w:t>
+        </w:r>
+      </w:hyperlink>
+    </w:p>
+    <w:bookmarkEnd w:id="158"/>
+    <w:bookmarkStart w:id="160" w:name="ref-pucher2005"/>
+    <w:p>
+      <w:pPr>
+        <w:pStyle w:val="Bibliography"/>
+      </w:pPr>
+      <w:r>
+        <w:t xml:space="preserve">Pucher, J., Renne, J.L., 2005. Rural mobility and mode choice: Evidence from the 2001 national household travel survey. Transportation 32, 165–186.</w:t>
+      </w:r>
+      <w:r>
+        <w:t xml:space="preserve"> </w:t>
+      </w:r>
+      <w:hyperlink r:id="rId159">
+        <w:r>
+          <w:rPr>
+            <w:rStyle w:val="Hyperlink"/>
+          </w:rPr>
+          <w:t xml:space="preserve">https://doi.org/10.1007/s11116-004-5508-3</w:t>
+        </w:r>
+      </w:hyperlink>
+    </w:p>
+    <w:bookmarkEnd w:id="160"/>
+    <w:bookmarkStart w:id="162" w:name="ref-qawasmeh2024"/>
+    <w:p>
+      <w:pPr>
+        <w:pStyle w:val="Bibliography"/>
+      </w:pPr>
+      <w:r>
+        <w:t xml:space="preserve">Qawasmeh, B., Qawasmeh, S., Al Tawil, A., Qawasmeh, D., 2024. Estimation of trip-based generation models and calibration of mode choice models for the american travel behavior. The Open Transportation Journal 18, e26671212348473.</w:t>
+      </w:r>
+      <w:r>
+        <w:t xml:space="preserve"> </w:t>
+      </w:r>
+      <w:hyperlink r:id="rId161">
+        <w:r>
+          <w:rPr>
+            <w:rStyle w:val="Hyperlink"/>
+          </w:rPr>
+          <w:t xml:space="preserve">https://doi.org/10.2174/0126671212348473241010122638</w:t>
+        </w:r>
+      </w:hyperlink>
+    </w:p>
+    <w:bookmarkEnd w:id="162"/>
+    <w:bookmarkStart w:id="164" w:name="ref-quinn2016"/>
+    <w:p>
+      <w:pPr>
+        <w:pStyle w:val="Bibliography"/>
+      </w:pPr>
+      <w:r>
         <w:t xml:space="preserve">Quinn, T.D., Jakicic, J.M., Fertman, C.I., Barone Gibbs, B., 2016. Demographic factors, workplace factors and active transportation use in the USA: A secondary analysis of 2009 NHTS data. Journal of Epidemiology and Community Health 71, 480–486.</w:t>
       </w:r>
       <w:r>
         <w:t xml:space="preserve"> </w:t>
       </w:r>
-      <w:hyperlink r:id="rId123">
+      <w:hyperlink r:id="rId163">
         <w:r>
           <w:rPr>
             <w:rStyle w:val="Hyperlink"/>
@@ -8544,19 +9352,40 @@
         </w:r>
       </w:hyperlink>
     </w:p>
-    <w:bookmarkEnd w:id="124"/>
-    <w:bookmarkStart w:id="126" w:name="ref-roberts2017"/>
+    <w:bookmarkEnd w:id="164"/>
+    <w:bookmarkStart w:id="166" w:name="ref-richardson2019"/>
     <w:p>
       <w:pPr>
         <w:pStyle w:val="Bibliography"/>
       </w:pPr>
       <w:r>
+        <w:t xml:space="preserve">Richardson, S., Lin, T., Li, Y., Niu, X., Xu, M., Stander, V., Tu, X.M., 2019. Guidance for use of weights: An analysis of different types of weights and their implications when using SAS PROCs. General Psychiatry 32, e100038.</w:t>
+      </w:r>
+      <w:r>
+        <w:t xml:space="preserve"> </w:t>
+      </w:r>
+      <w:hyperlink r:id="rId165">
+        <w:r>
+          <w:rPr>
+            <w:rStyle w:val="Hyperlink"/>
+          </w:rPr>
+          <w:t xml:space="preserve">https://doi.org/10.1136/gpsych-2018-100038</w:t>
+        </w:r>
+      </w:hyperlink>
+    </w:p>
+    <w:bookmarkEnd w:id="166"/>
+    <w:bookmarkStart w:id="168" w:name="ref-roberts2017"/>
+    <w:p>
+      <w:pPr>
+        <w:pStyle w:val="Bibliography"/>
+      </w:pPr>
+      <w:r>
         <w:t xml:space="preserve">Roberts, D.R., Bahn, V., Ciuti, S., Boyce, M.S., Elith, J., Guillera‐Arroita, G., Hauenstein, S., Lahoz‐Monfort, J.J., Schröder, B., Thuiller, W., Warton, D.I., Wintle, B.A., Hartig, F., Dormann, C.F., 2017. Cross‐validation strategies for data with temporal, spatial, hierarchical, or phylogenetic structure. Ecography 40, 913–929.</w:t>
       </w:r>
       <w:r>
         <w:t xml:space="preserve"> </w:t>
       </w:r>
-      <w:hyperlink r:id="rId125">
+      <w:hyperlink r:id="rId167">
         <w:r>
           <w:rPr>
             <w:rStyle w:val="Hyperlink"/>
@@ -8565,8 +9394,8 @@
         </w:r>
       </w:hyperlink>
     </w:p>
-    <w:bookmarkEnd w:id="126"/>
-    <w:bookmarkStart w:id="128" w:name="ref-rosenblatt2024"/>
+    <w:bookmarkEnd w:id="168"/>
+    <w:bookmarkStart w:id="170" w:name="ref-rosenblatt2024"/>
     <w:p>
       <w:pPr>
         <w:pStyle w:val="Bibliography"/>
@@ -8577,7 +9406,7 @@
       <w:r>
         <w:t xml:space="preserve"> </w:t>
       </w:r>
-      <w:hyperlink r:id="rId127">
+      <w:hyperlink r:id="rId169">
         <w:r>
           <w:rPr>
             <w:rStyle w:val="Hyperlink"/>
@@ -8586,8 +9415,8 @@
         </w:r>
       </w:hyperlink>
     </w:p>
-    <w:bookmarkEnd w:id="128"/>
-    <w:bookmarkStart w:id="130" w:name="ref-rust1996"/>
+    <w:bookmarkEnd w:id="170"/>
+    <w:bookmarkStart w:id="172" w:name="ref-rust1996"/>
     <w:p>
       <w:pPr>
         <w:pStyle w:val="Bibliography"/>
@@ -8598,7 +9427,7 @@
       <w:r>
         <w:t xml:space="preserve"> </w:t>
       </w:r>
-      <w:hyperlink r:id="rId129">
+      <w:hyperlink r:id="rId171">
         <w:r>
           <w:rPr>
             <w:rStyle w:val="Hyperlink"/>
@@ -8607,8 +9436,8 @@
         </w:r>
       </w:hyperlink>
     </w:p>
-    <w:bookmarkEnd w:id="130"/>
-    <w:bookmarkStart w:id="132" w:name="ref-sabouri2020"/>
+    <w:bookmarkEnd w:id="172"/>
+    <w:bookmarkStart w:id="174" w:name="ref-sabouri2020"/>
     <w:p>
       <w:pPr>
         <w:pStyle w:val="Bibliography"/>
@@ -8619,7 +9448,7 @@
       <w:r>
         <w:t xml:space="preserve"> </w:t>
       </w:r>
-      <w:hyperlink r:id="rId131">
+      <w:hyperlink r:id="rId173">
         <w:r>
           <w:rPr>
             <w:rStyle w:val="Hyperlink"/>
@@ -8628,8 +9457,8 @@
         </w:r>
       </w:hyperlink>
     </w:p>
-    <w:bookmarkEnd w:id="132"/>
-    <w:bookmarkStart w:id="134" w:name="ref-sadeghvaziri2020"/>
+    <w:bookmarkEnd w:id="174"/>
+    <w:bookmarkStart w:id="176" w:name="ref-sadeghvaziri2020"/>
     <w:p>
       <w:pPr>
         <w:pStyle w:val="Bibliography"/>
@@ -8640,7 +9469,7 @@
       <w:r>
         <w:t xml:space="preserve"> </w:t>
       </w:r>
-      <w:hyperlink r:id="rId133">
+      <w:hyperlink r:id="rId175">
         <w:r>
           <w:rPr>
             <w:rStyle w:val="Hyperlink"/>
@@ -8649,8 +9478,8 @@
         </w:r>
       </w:hyperlink>
     </w:p>
-    <w:bookmarkEnd w:id="134"/>
-    <w:bookmarkStart w:id="136" w:name="ref-schweinsberg2021"/>
+    <w:bookmarkEnd w:id="176"/>
+    <w:bookmarkStart w:id="178" w:name="ref-schweinsberg2021"/>
     <w:p>
       <w:pPr>
         <w:pStyle w:val="Bibliography"/>
@@ -8661,7 +9490,7 @@
       <w:r>
         <w:t xml:space="preserve"> </w:t>
       </w:r>
-      <w:hyperlink r:id="rId135">
+      <w:hyperlink r:id="rId177">
         <w:r>
           <w:rPr>
             <w:rStyle w:val="Hyperlink"/>
@@ -8670,19 +9499,40 @@
         </w:r>
       </w:hyperlink>
     </w:p>
-    <w:bookmarkEnd w:id="136"/>
-    <w:bookmarkStart w:id="138" w:name="ref-shirgaokar2021"/>
+    <w:bookmarkEnd w:id="178"/>
+    <w:bookmarkStart w:id="180" w:name="ref-shaw2021"/>
     <w:p>
       <w:pPr>
         <w:pStyle w:val="Bibliography"/>
       </w:pPr>
       <w:r>
+        <w:t xml:space="preserve">Shaw, F.A., Wang, X., Mokhtarian, P.L., Watkins, K.E., 2021. Supplementing transportation data sources with targeted marketing data: Applications, integration, and internal validation. Transportation Research Part A: Policy and Practice 149, 150–169.</w:t>
+      </w:r>
+      <w:r>
+        <w:t xml:space="preserve"> </w:t>
+      </w:r>
+      <w:hyperlink r:id="rId179">
+        <w:r>
+          <w:rPr>
+            <w:rStyle w:val="Hyperlink"/>
+          </w:rPr>
+          <w:t xml:space="preserve">https://doi.org/10.1016/j.tra.2021.04.021</w:t>
+        </w:r>
+      </w:hyperlink>
+    </w:p>
+    <w:bookmarkEnd w:id="180"/>
+    <w:bookmarkStart w:id="182" w:name="ref-shirgaokar2021"/>
+    <w:p>
+      <w:pPr>
+        <w:pStyle w:val="Bibliography"/>
+      </w:pPr>
+      <w:r>
         <w:t xml:space="preserve">Shirgaokar, M., Nobler, E., 2021. Differences in daily trips between immigrants and US-born individuals: Implications for social integration. Transport Policy 105, 103–114.</w:t>
       </w:r>
       <w:r>
         <w:t xml:space="preserve"> </w:t>
       </w:r>
-      <w:hyperlink r:id="rId137">
+      <w:hyperlink r:id="rId181">
         <w:r>
           <w:rPr>
             <w:rStyle w:val="Hyperlink"/>
@@ -8691,8 +9541,8 @@
         </w:r>
       </w:hyperlink>
     </w:p>
-    <w:bookmarkEnd w:id="138"/>
-    <w:bookmarkStart w:id="140" w:name="ref-silberzahn2018"/>
+    <w:bookmarkEnd w:id="182"/>
+    <w:bookmarkStart w:id="184" w:name="ref-silberzahn2018"/>
     <w:p>
       <w:pPr>
         <w:pStyle w:val="Bibliography"/>
@@ -8703,7 +9553,7 @@
       <w:r>
         <w:t xml:space="preserve"> </w:t>
       </w:r>
-      <w:hyperlink r:id="rId139">
+      <w:hyperlink r:id="rId183">
         <w:r>
           <w:rPr>
             <w:rStyle w:val="Hyperlink"/>
@@ -8712,8 +9562,8 @@
         </w:r>
       </w:hyperlink>
     </w:p>
-    <w:bookmarkEnd w:id="140"/>
-    <w:bookmarkStart w:id="142" w:name="ref-simonsohn2020"/>
+    <w:bookmarkEnd w:id="184"/>
+    <w:bookmarkStart w:id="186" w:name="ref-simonsohn2020"/>
     <w:p>
       <w:pPr>
         <w:pStyle w:val="Bibliography"/>
@@ -8724,7 +9574,7 @@
       <w:r>
         <w:t xml:space="preserve"> </w:t>
       </w:r>
-      <w:hyperlink r:id="rId141">
+      <w:hyperlink r:id="rId185">
         <w:r>
           <w:rPr>
             <w:rStyle w:val="Hyperlink"/>
@@ -8733,8 +9583,8 @@
         </w:r>
       </w:hyperlink>
     </w:p>
-    <w:bookmarkEnd w:id="142"/>
-    <w:bookmarkStart w:id="144" w:name="ref-solon2015"/>
+    <w:bookmarkEnd w:id="186"/>
+    <w:bookmarkStart w:id="188" w:name="ref-solon2015"/>
     <w:p>
       <w:pPr>
         <w:pStyle w:val="Bibliography"/>
@@ -8745,7 +9595,7 @@
       <w:r>
         <w:t xml:space="preserve"> </w:t>
       </w:r>
-      <w:hyperlink r:id="rId143">
+      <w:hyperlink r:id="rId187">
         <w:r>
           <w:rPr>
             <w:rStyle w:val="Hyperlink"/>
@@ -8754,8 +9604,8 @@
         </w:r>
       </w:hyperlink>
     </w:p>
-    <w:bookmarkEnd w:id="144"/>
-    <w:bookmarkStart w:id="146" w:name="ref-steegen2016"/>
+    <w:bookmarkEnd w:id="188"/>
+    <w:bookmarkStart w:id="190" w:name="ref-steegen2016"/>
     <w:p>
       <w:pPr>
         <w:pStyle w:val="Bibliography"/>
@@ -8766,7 +9616,7 @@
       <w:r>
         <w:t xml:space="preserve"> </w:t>
       </w:r>
-      <w:hyperlink r:id="rId145">
+      <w:hyperlink r:id="rId189">
         <w:r>
           <w:rPr>
             <w:rStyle w:val="Hyperlink"/>
@@ -8775,8 +9625,8 @@
         </w:r>
       </w:hyperlink>
     </w:p>
-    <w:bookmarkEnd w:id="146"/>
-    <w:bookmarkStart w:id="148" w:name="ref-stodden2018"/>
+    <w:bookmarkEnd w:id="190"/>
+    <w:bookmarkStart w:id="192" w:name="ref-stodden2018"/>
     <w:p>
       <w:pPr>
         <w:pStyle w:val="Bibliography"/>
@@ -8787,7 +9637,7 @@
       <w:r>
         <w:t xml:space="preserve"> </w:t>
       </w:r>
-      <w:hyperlink r:id="rId147">
+      <w:hyperlink r:id="rId191">
         <w:r>
           <w:rPr>
             <w:rStyle w:val="Hyperlink"/>
@@ -8796,8 +9646,8 @@
         </w:r>
       </w:hyperlink>
     </w:p>
-    <w:bookmarkEnd w:id="148"/>
-    <w:bookmarkStart w:id="150" w:name="ref-su2021"/>
+    <w:bookmarkEnd w:id="192"/>
+    <w:bookmarkStart w:id="194" w:name="ref-su2021"/>
     <w:p>
       <w:pPr>
         <w:pStyle w:val="Bibliography"/>
@@ -8808,7 +9658,7 @@
       <w:r>
         <w:t xml:space="preserve"> </w:t>
       </w:r>
-      <w:hyperlink r:id="rId149">
+      <w:hyperlink r:id="rId193">
         <w:r>
           <w:rPr>
             <w:rStyle w:val="Hyperlink"/>
@@ -8817,19 +9667,103 @@
         </w:r>
       </w:hyperlink>
     </w:p>
-    <w:bookmarkEnd w:id="150"/>
-    <w:bookmarkStart w:id="152" w:name="ref-vabalas2019"/>
+    <w:bookmarkEnd w:id="194"/>
+    <w:bookmarkStart w:id="196" w:name="ref-svaboe2024"/>
     <w:p>
       <w:pPr>
         <w:pStyle w:val="Bibliography"/>
       </w:pPr>
       <w:r>
+        <w:t xml:space="preserve">Svaboe, G.B.A., Tørset, T., Lohne, J., 2024. A comparative study of national travel surveys in six european countries. Transportation Planning and Technology 47, 400–418.</w:t>
+      </w:r>
+      <w:r>
+        <w:t xml:space="preserve"> </w:t>
+      </w:r>
+      <w:hyperlink r:id="rId195">
+        <w:r>
+          <w:rPr>
+            <w:rStyle w:val="Hyperlink"/>
+          </w:rPr>
+          <w:t xml:space="preserve">https://doi.org/10.1080/03081060.2024.2311081</w:t>
+        </w:r>
+      </w:hyperlink>
+    </w:p>
+    <w:bookmarkEnd w:id="196"/>
+    <w:bookmarkStart w:id="198" w:name="ref-tribby2019"/>
+    <w:p>
+      <w:pPr>
+        <w:pStyle w:val="Bibliography"/>
+      </w:pPr>
+      <w:r>
+        <w:t xml:space="preserve">Tribby, C.P., Tharp, D.S., 2019. Examining urban and rural bicycling in the united states: Early findings from the 2017 national household travel survey. Journal of Transport &amp; Health 13, 143–149.</w:t>
+      </w:r>
+      <w:r>
+        <w:t xml:space="preserve"> </w:t>
+      </w:r>
+      <w:hyperlink r:id="rId197">
+        <w:r>
+          <w:rPr>
+            <w:rStyle w:val="Hyperlink"/>
+          </w:rPr>
+          <w:t xml:space="preserve">https://doi.org/10.1016/j.jth.2019.03.015</w:t>
+        </w:r>
+      </w:hyperlink>
+    </w:p>
+    <w:bookmarkEnd w:id="198"/>
+    <w:bookmarkStart w:id="200" w:name="ref-trowbridge2009"/>
+    <w:p>
+      <w:pPr>
+        <w:pStyle w:val="Bibliography"/>
+      </w:pPr>
+      <w:r>
+        <w:t xml:space="preserve">Trowbridge, M.J., Kent, R., 2009. Rear-seat motor vehicle travel in the u.s. American Journal of Preventive Medicine 37, 321–323.</w:t>
+      </w:r>
+      <w:r>
+        <w:t xml:space="preserve"> </w:t>
+      </w:r>
+      <w:hyperlink r:id="rId199">
+        <w:r>
+          <w:rPr>
+            <w:rStyle w:val="Hyperlink"/>
+          </w:rPr>
+          <w:t xml:space="preserve">https://doi.org/10.1016/j.amepre.2009.05.021</w:t>
+        </w:r>
+      </w:hyperlink>
+    </w:p>
+    <w:bookmarkEnd w:id="200"/>
+    <w:bookmarkStart w:id="202" w:name="ref-tumula2026"/>
+    <w:p>
+      <w:pPr>
+        <w:pStyle w:val="Bibliography"/>
+      </w:pPr>
+      <w:r>
+        <w:t xml:space="preserve">Tumula, R.R., Burra, L.T., Gkritza, K., 2026. Who continues to shop online? Sociodemographic determinants of post-COVID e-commerce. Transportation Research Interdisciplinary Perspectives 38, 102084.</w:t>
+      </w:r>
+      <w:r>
+        <w:t xml:space="preserve"> </w:t>
+      </w:r>
+      <w:hyperlink r:id="rId201">
+        <w:r>
+          <w:rPr>
+            <w:rStyle w:val="Hyperlink"/>
+          </w:rPr>
+          <w:t xml:space="preserve">https://doi.org/10.1016/j.trip.2026.102084</w:t>
+        </w:r>
+      </w:hyperlink>
+    </w:p>
+    <w:bookmarkEnd w:id="202"/>
+    <w:bookmarkStart w:id="204" w:name="ref-vabalas2019"/>
+    <w:p>
+      <w:pPr>
+        <w:pStyle w:val="Bibliography"/>
+      </w:pPr>
+      <w:r>
         <w:t xml:space="preserve">Vabalas, A., Gowen, E., Poliakoff, E., Casson, A.J., 2019. Machine learning algorithm validation with a limited sample size. PLOS ONE 14, e0224365.</w:t>
       </w:r>
       <w:r>
         <w:t xml:space="preserve"> </w:t>
       </w:r>
-      <w:hyperlink r:id="rId151">
+      <w:hyperlink r:id="rId203">
         <w:r>
           <w:rPr>
             <w:rStyle w:val="Hyperlink"/>
@@ -8838,19 +9772,61 @@
         </w:r>
       </w:hyperlink>
     </w:p>
-    <w:bookmarkEnd w:id="152"/>
-    <w:bookmarkStart w:id="154" w:name="ref-wang2024benchmark"/>
+    <w:bookmarkEnd w:id="204"/>
+    <w:bookmarkStart w:id="206" w:name="ref-vaish2010"/>
     <w:p>
       <w:pPr>
         <w:pStyle w:val="Bibliography"/>
       </w:pPr>
       <w:r>
+        <w:t xml:space="preserve">Vaish, A.K., Chen, S., Sathe, N.S., Folsom, R.E., Chandhok, P., Guo, K., 2010. Small area estimates of daily person-miles of travel: 2001 national household transportation survey. Transportation 37, 825–848.</w:t>
+      </w:r>
+      <w:r>
+        <w:t xml:space="preserve"> </w:t>
+      </w:r>
+      <w:hyperlink r:id="rId205">
+        <w:r>
+          <w:rPr>
+            <w:rStyle w:val="Hyperlink"/>
+          </w:rPr>
+          <w:t xml:space="preserve">https://doi.org/10.1007/s11116-010-9279-8</w:t>
+        </w:r>
+      </w:hyperlink>
+    </w:p>
+    <w:bookmarkEnd w:id="206"/>
+    <w:bookmarkStart w:id="208" w:name="ref-verreault2018"/>
+    <w:p>
+      <w:pPr>
+        <w:pStyle w:val="Bibliography"/>
+      </w:pPr>
+      <w:r>
+        <w:t xml:space="preserve">Verreault, H., Morency, C., 2016. Integration of a phone-based household travel survey and a web-based student travel survey. Transportation 45, 89–103.</w:t>
+      </w:r>
+      <w:r>
+        <w:t xml:space="preserve"> </w:t>
+      </w:r>
+      <w:hyperlink r:id="rId207">
+        <w:r>
+          <w:rPr>
+            <w:rStyle w:val="Hyperlink"/>
+          </w:rPr>
+          <w:t xml:space="preserve">https://doi.org/10.1007/s11116-016-9726-2</w:t>
+        </w:r>
+      </w:hyperlink>
+    </w:p>
+    <w:bookmarkEnd w:id="208"/>
+    <w:bookmarkStart w:id="210" w:name="ref-wang2024benchmark"/>
+    <w:p>
+      <w:pPr>
+        <w:pStyle w:val="Bibliography"/>
+      </w:pPr>
+      <w:r>
         <w:t xml:space="preserve">Wang, S., Mo, B., Zheng, Y., Hess, S., Zhao, J., 2024. Comparing hundreds of machine learning and discrete choice models for travel demand modeling: An empirical benchmark. Transportation Research Part B: Methodological 190, 103061.</w:t>
       </w:r>
       <w:r>
         <w:t xml:space="preserve"> </w:t>
       </w:r>
-      <w:hyperlink r:id="rId153">
+      <w:hyperlink r:id="rId209">
         <w:r>
           <w:rPr>
             <w:rStyle w:val="Hyperlink"/>
@@ -8859,19 +9835,40 @@
         </w:r>
       </w:hyperlink>
     </w:p>
-    <w:bookmarkEnd w:id="154"/>
-    <w:bookmarkStart w:id="156" w:name="ref-wang2022nhts"/>
+    <w:bookmarkEnd w:id="210"/>
+    <w:bookmarkStart w:id="212" w:name="ref-wang2023"/>
     <w:p>
       <w:pPr>
         <w:pStyle w:val="Bibliography"/>
       </w:pPr>
       <w:r>
+        <w:t xml:space="preserve">Wang, X., Renne, J.L., 2023. Socioeconomics of urban travel in the u.s.: Evidence from the 2017 NHTS. Transportation Research Part D: Transport and Environment 116, 103622.</w:t>
+      </w:r>
+      <w:r>
+        <w:t xml:space="preserve"> </w:t>
+      </w:r>
+      <w:hyperlink r:id="rId211">
+        <w:r>
+          <w:rPr>
+            <w:rStyle w:val="Hyperlink"/>
+          </w:rPr>
+          <w:t xml:space="preserve">https://doi.org/10.1016/j.trd.2023.103622</w:t>
+        </w:r>
+      </w:hyperlink>
+    </w:p>
+    <w:bookmarkEnd w:id="212"/>
+    <w:bookmarkStart w:id="214" w:name="ref-wang2022nhts"/>
+    <w:p>
+      <w:pPr>
+        <w:pStyle w:val="Bibliography"/>
+      </w:pPr>
+      <w:r>
         <w:t xml:space="preserve">Wang, X., Shaw, F.A., Mokhtarian, P.L., Watkins, K.E., 2022. ﻿Response willingness in consecutive travel surveys: An investigation based on the national household travel survey using a sample selection model. Transportation 50, 2339–2373.</w:t>
       </w:r>
       <w:r>
         <w:t xml:space="preserve"> </w:t>
       </w:r>
-      <w:hyperlink r:id="rId155">
+      <w:hyperlink r:id="rId213">
         <w:r>
           <w:rPr>
             <w:rStyle w:val="Hyperlink"/>
@@ -8880,8 +9877,8 @@
         </w:r>
       </w:hyperlink>
     </w:p>
-    <w:bookmarkEnd w:id="156"/>
-    <w:bookmarkStart w:id="158" w:name="ref-winship1994"/>
+    <w:bookmarkEnd w:id="214"/>
+    <w:bookmarkStart w:id="216" w:name="ref-winship1994"/>
     <w:p>
       <w:pPr>
         <w:pStyle w:val="Bibliography"/>
@@ -8892,7 +9889,7 @@
       <w:r>
         <w:t xml:space="preserve"> </w:t>
       </w:r>
-      <w:hyperlink r:id="rId157">
+      <w:hyperlink r:id="rId215">
         <w:r>
           <w:rPr>
             <w:rStyle w:val="Hyperlink"/>
@@ -8901,19 +9898,19 @@
         </w:r>
       </w:hyperlink>
     </w:p>
-    <w:bookmarkEnd w:id="158"/>
-    <w:bookmarkStart w:id="160" w:name="ref-wolter2007"/>
+    <w:bookmarkEnd w:id="216"/>
+    <w:bookmarkStart w:id="218" w:name="ref-wolter2007"/>
     <w:p>
       <w:pPr>
         <w:pStyle w:val="Bibliography"/>
       </w:pPr>
       <w:r>
-        <w:t xml:space="preserve">Wolter, K.M., 2007. Introduction to variance estimation. Statistics for Social; Behavioral Sciences.</w:t>
-      </w:r>
-      <w:r>
-        <w:t xml:space="preserve"> </w:t>
-      </w:r>
-      <w:hyperlink r:id="rId159">
+        <w:t xml:space="preserve">Wolter, K.M., 2007. Introduction to variance estimation. Springer.</w:t>
+      </w:r>
+      <w:r>
+        <w:t xml:space="preserve"> </w:t>
+      </w:r>
+      <w:hyperlink r:id="rId217">
         <w:r>
           <w:rPr>
             <w:rStyle w:val="Hyperlink"/>
@@ -8922,19 +9919,40 @@
         </w:r>
       </w:hyperlink>
     </w:p>
-    <w:bookmarkEnd w:id="160"/>
-    <w:bookmarkStart w:id="162" w:name="ref-wu2021"/>
+    <w:bookmarkEnd w:id="218"/>
+    <w:bookmarkStart w:id="220" w:name="ref-woodruff1971"/>
     <w:p>
       <w:pPr>
         <w:pStyle w:val="Bibliography"/>
       </w:pPr>
       <w:r>
+        <w:t xml:space="preserve">Woodruff, R.S., 1971. A simple method for approximating the variance of a complicated estimate. Journal of the American Statistical Association 66, 411–414.</w:t>
+      </w:r>
+      <w:r>
+        <w:t xml:space="preserve"> </w:t>
+      </w:r>
+      <w:hyperlink r:id="rId219">
+        <w:r>
+          <w:rPr>
+            <w:rStyle w:val="Hyperlink"/>
+          </w:rPr>
+          <w:t xml:space="preserve">https://doi.org/10.1080/01621459.1971.10482279</w:t>
+        </w:r>
+      </w:hyperlink>
+    </w:p>
+    <w:bookmarkEnd w:id="220"/>
+    <w:bookmarkStart w:id="222" w:name="ref-wu2021"/>
+    <w:p>
+      <w:pPr>
+        <w:pStyle w:val="Bibliography"/>
+      </w:pPr>
+      <w:r>
         <w:t xml:space="preserve">Wu, X., MacKenzie, D., 2021. Assessing the VMT effect of ridesourcing services in the US. Transportation Research Part D: Transport and Environment 94, 102816.</w:t>
       </w:r>
       <w:r>
         <w:t xml:space="preserve"> </w:t>
       </w:r>
-      <w:hyperlink r:id="rId161">
+      <w:hyperlink r:id="rId221">
         <w:r>
           <w:rPr>
             <w:rStyle w:val="Hyperlink"/>
@@ -8943,8 +9961,8 @@
         </w:r>
       </w:hyperlink>
     </w:p>
-    <w:bookmarkEnd w:id="162"/>
-    <w:bookmarkStart w:id="164" w:name="ref-xue2021"/>
+    <w:bookmarkEnd w:id="222"/>
+    <w:bookmarkStart w:id="224" w:name="ref-xue2021"/>
     <w:p>
       <w:pPr>
         <w:pStyle w:val="Bibliography"/>
@@ -8955,7 +9973,7 @@
       <w:r>
         <w:t xml:space="preserve"> </w:t>
       </w:r>
-      <w:hyperlink r:id="rId163">
+      <w:hyperlink r:id="rId223">
         <w:r>
           <w:rPr>
             <w:rStyle w:val="Hyperlink"/>
@@ -8964,19 +9982,40 @@
         </w:r>
       </w:hyperlink>
     </w:p>
-    <w:bookmarkEnd w:id="164"/>
-    <w:bookmarkStart w:id="166" w:name="ref-yang2011"/>
+    <w:bookmarkEnd w:id="224"/>
+    <w:bookmarkStart w:id="226" w:name="ref-yang2025"/>
     <w:p>
       <w:pPr>
         <w:pStyle w:val="Bibliography"/>
       </w:pPr>
       <w:r>
+        <w:t xml:space="preserve">Yang, Y., 2025. Public transit use among american older adults: Insights from a nationally representative survey. Journal of Transport &amp; Health 41, 101982.</w:t>
+      </w:r>
+      <w:r>
+        <w:t xml:space="preserve"> </w:t>
+      </w:r>
+      <w:hyperlink r:id="rId225">
+        <w:r>
+          <w:rPr>
+            <w:rStyle w:val="Hyperlink"/>
+          </w:rPr>
+          <w:t xml:space="preserve">https://doi.org/10.1016/j.jth.2025.101982</w:t>
+        </w:r>
+      </w:hyperlink>
+    </w:p>
+    <w:bookmarkEnd w:id="226"/>
+    <w:bookmarkStart w:id="228" w:name="ref-yang2011"/>
+    <w:p>
+      <w:pPr>
+        <w:pStyle w:val="Bibliography"/>
+      </w:pPr>
+      <w:r>
         <w:t xml:space="preserve">Yang, Y., Diez Roux, A.V., Bingham, C.R., 2011. Variability and seasonality of active transportation in USA: Evidence from the 2001 NHTS. International Journal of Behavioral Nutrition and Physical Activity 8, 96.</w:t>
       </w:r>
       <w:r>
         <w:t xml:space="preserve"> </w:t>
       </w:r>
-      <w:hyperlink r:id="rId165">
+      <w:hyperlink r:id="rId227">
         <w:r>
           <w:rPr>
             <w:rStyle w:val="Hyperlink"/>
@@ -8985,8 +10024,8 @@
         </w:r>
       </w:hyperlink>
     </w:p>
-    <w:bookmarkEnd w:id="166"/>
-    <w:bookmarkStart w:id="168" w:name="ref-zeileis2008"/>
+    <w:bookmarkEnd w:id="228"/>
+    <w:bookmarkStart w:id="230" w:name="ref-zeileis2008"/>
     <w:p>
       <w:pPr>
         <w:pStyle w:val="Bibliography"/>
@@ -8997,7 +10036,7 @@
       <w:r>
         <w:t xml:space="preserve"> </w:t>
       </w:r>
-      <w:hyperlink r:id="rId167">
+      <w:hyperlink r:id="rId229">
         <w:r>
           <w:rPr>
             <w:rStyle w:val="Hyperlink"/>
@@ -9006,8 +10045,8 @@
         </w:r>
       </w:hyperlink>
     </w:p>
-    <w:bookmarkEnd w:id="168"/>
-    <w:bookmarkStart w:id="170" w:name="ref-zhang2018bike"/>
+    <w:bookmarkEnd w:id="230"/>
+    <w:bookmarkStart w:id="232" w:name="ref-zhang2018bike"/>
     <w:p>
       <w:pPr>
         <w:pStyle w:val="Bibliography"/>
@@ -9018,7 +10057,7 @@
       <w:r>
         <w:t xml:space="preserve"> </w:t>
       </w:r>
-      <w:hyperlink r:id="rId169">
+      <w:hyperlink r:id="rId231">
         <w:r>
           <w:rPr>
             <w:rStyle w:val="Hyperlink"/>
@@ -9027,8 +10066,8 @@
         </w:r>
       </w:hyperlink>
     </w:p>
-    <w:bookmarkEnd w:id="170"/>
-    <w:bookmarkStart w:id="172" w:name="ref-zhang2018veh"/>
+    <w:bookmarkEnd w:id="232"/>
+    <w:bookmarkStart w:id="234" w:name="ref-zhang2018veh"/>
     <w:p>
       <w:pPr>
         <w:pStyle w:val="Bibliography"/>
@@ -9039,7 +10078,7 @@
       <w:r>
         <w:t xml:space="preserve"> </w:t>
       </w:r>
-      <w:hyperlink r:id="rId171">
+      <w:hyperlink r:id="rId233">
         <w:r>
           <w:rPr>
             <w:rStyle w:val="Hyperlink"/>
@@ -9048,8 +10087,8 @@
         </w:r>
       </w:hyperlink>
     </w:p>
-    <w:bookmarkEnd w:id="172"/>
-    <w:bookmarkStart w:id="174" w:name="ref-zhang2018ride"/>
+    <w:bookmarkEnd w:id="234"/>
+    <w:bookmarkStart w:id="236" w:name="ref-zhang2018ride"/>
     <w:p>
       <w:pPr>
         <w:pStyle w:val="Bibliography"/>
@@ -9060,7 +10099,7 @@
       <w:r>
         <w:t xml:space="preserve"> </w:t>
       </w:r>
-      <w:hyperlink r:id="rId173">
+      <w:hyperlink r:id="rId235">
         <w:r>
           <w:rPr>
             <w:rStyle w:val="Hyperlink"/>
@@ -9069,19 +10108,40 @@
         </w:r>
       </w:hyperlink>
     </w:p>
-    <w:bookmarkEnd w:id="174"/>
-    <w:bookmarkStart w:id="176" w:name="ref-zhou2014"/>
+    <w:bookmarkEnd w:id="236"/>
+    <w:bookmarkStart w:id="238" w:name="ref-zhang2026"/>
     <w:p>
       <w:pPr>
         <w:pStyle w:val="Bibliography"/>
       </w:pPr>
       <w:r>
+        <w:t xml:space="preserve">Zhang, Z., Maruyama, T., 2026. Immobility or soft refusal? An empirical analysis of the association between respondents’ diligence and reported immobility in household travel surveys. Transportation Research Part A: Policy and Practice 204, 104815.</w:t>
+      </w:r>
+      <w:r>
+        <w:t xml:space="preserve"> </w:t>
+      </w:r>
+      <w:hyperlink r:id="rId237">
+        <w:r>
+          <w:rPr>
+            <w:rStyle w:val="Hyperlink"/>
+          </w:rPr>
+          <w:t xml:space="preserve">https://doi.org/10.1016/j.tra.2025.104815</w:t>
+        </w:r>
+      </w:hyperlink>
+    </w:p>
+    <w:bookmarkEnd w:id="238"/>
+    <w:bookmarkStart w:id="240" w:name="ref-zhou2014"/>
+    <w:p>
+      <w:pPr>
+        <w:pStyle w:val="Bibliography"/>
+      </w:pPr>
+      <w:r>
         <w:t xml:space="preserve">Zhou, Y., Wang, X.(Cara)., 2014. Explore the relationship between online shopping and shopping trips: An analysis with the 2009 NHTS data. Transportation Research Part A: Policy and Practice 70, 1–9.</w:t>
       </w:r>
       <w:r>
         <w:t xml:space="preserve"> </w:t>
       </w:r>
-      <w:hyperlink r:id="rId175">
+      <w:hyperlink r:id="rId239">
         <w:r>
           <w:rPr>
             <w:rStyle w:val="Hyperlink"/>
@@ -9090,9 +10150,30 @@
         </w:r>
       </w:hyperlink>
     </w:p>
-    <w:bookmarkEnd w:id="176"/>
-    <w:bookmarkEnd w:id="177"/>
-    <w:bookmarkEnd w:id="178"/>
+    <w:bookmarkEnd w:id="240"/>
+    <w:bookmarkStart w:id="242" w:name="ref-zou2021"/>
+    <w:p>
+      <w:pPr>
+        <w:pStyle w:val="Bibliography"/>
+      </w:pPr>
+      <w:r>
+        <w:t xml:space="preserve">Zou, Z., Cirillo, C., 2021. Does ridesourcing impact driving decisions: A survey weighted regression analysis. Transportation Research Part A: Policy and Practice 146, 1–12.</w:t>
+      </w:r>
+      <w:r>
+        <w:t xml:space="preserve"> </w:t>
+      </w:r>
+      <w:hyperlink r:id="rId241">
+        <w:r>
+          <w:rPr>
+            <w:rStyle w:val="Hyperlink"/>
+          </w:rPr>
+          <w:t xml:space="preserve">https://doi.org/10.1016/j.tra.2021.02.006</w:t>
+        </w:r>
+      </w:hyperlink>
+    </w:p>
+    <w:bookmarkEnd w:id="242"/>
+    <w:bookmarkEnd w:id="243"/>
+    <w:bookmarkEnd w:id="244"/>
     <w:sectPr>
       <w:footnotePr>
         <w:numRestart w:val="eachSect"/>

</xml_diff>